<commit_message>
complete step 3,gold standard annotation(310 sentences),error analysis(71 cases),and cleaned CSV(use this file~)
</commit_message>
<xml_diff>
--- a/CBS5502_Group_Report.docx
+++ b/CBS5502_Group_Report.docx
@@ -179,19 +179,15 @@
         <w:jc w:val="center"/>
       </w:pPr>
       <w:r>
-        <w:rPr/>
         <w:t>张千伊</w:t>
       </w:r>
       <w:r>
-        <w:rPr/>
         <w:t xml:space="preserve"> (Student ID: </w:t>
       </w:r>
       <w:r>
-        <w:rPr/>
         <w:t>25084698g</w:t>
       </w:r>
       <w:r>
-        <w:rPr/>
         <w:t>)</w:t>
       </w:r>
     </w:p>
@@ -452,13 +448,7 @@
         <w:jc w:val="both"/>
       </w:pPr>
       <w:r>
-        <w:t>Code-switching, the alternation between two or more languages within a single utterance, is a pervasive feature of everyday communication in Hong Kong. Cantonese speakers routinely embed English words into otherwise Cantonese discourse — a phenomenon commonly referred to as Cantonese-English (</w:t>
-      </w:r>
-      <w:r>
-        <w:t>粵英</w:t>
-      </w:r>
-      <w:r>
-        <w:t>) mixed speech. While this bilingual practice is natural and unremarkable in spoken and written interaction, it presents significant challenges for Natural Language Processing (NLP) systems that must accurately identify the grammatical role of each word in a sentence.</w:t>
+        <w:t>Code-switching, the alternation between two or more languages within a single utterance, is a pervasive feature of everyday communication in Hong Kong. Cantonese speakers routinely embed English words into otherwise Cantonese discourse — a phenomenon commonly referred to as Cantonese-English (粵英) mixed speech. While this bilingual practice is natural and unremarkable in spoken and written interaction, it presents significant challenges for Natural Language Processing (NLP) systems that must accurately identify the grammatical role of each word in a sentence.</w:t>
       </w:r>
     </w:p>
     <w:p>
@@ -492,12 +482,12 @@
       <w:tblPr>
         <w:tblW w:w="9026" w:type="dxa"/>
         <w:tblBorders>
-          <w:top w:val="single" w:color="auto" w:sz="4" w:space="0"/>
-          <w:left w:val="single" w:color="auto" w:sz="4" w:space="0"/>
-          <w:bottom w:val="single" w:color="auto" w:sz="4" w:space="0"/>
-          <w:right w:val="single" w:color="auto" w:sz="4" w:space="0"/>
-          <w:insideH w:val="single" w:color="auto" w:sz="4" w:space="0"/>
-          <w:insideV w:val="single" w:color="auto" w:sz="4" w:space="0"/>
+          <w:top w:val="single" w:sz="4" w:space="0" w:color="auto"/>
+          <w:left w:val="single" w:sz="4" w:space="0" w:color="auto"/>
+          <w:bottom w:val="single" w:sz="4" w:space="0" w:color="auto"/>
+          <w:right w:val="single" w:sz="4" w:space="0" w:color="auto"/>
+          <w:insideH w:val="single" w:sz="4" w:space="0" w:color="auto"/>
+          <w:insideV w:val="single" w:sz="4" w:space="0" w:color="auto"/>
         </w:tblBorders>
         <w:tblCellMar>
           <w:left w:w="10" w:type="dxa"/>
@@ -511,12 +501,6 @@
         <w:gridCol w:w="3826"/>
       </w:tblGrid>
       <w:tr>
-        <w:tblPrEx>
-          <w:tblCellMar>
-            <w:top w:w="0" w:type="dxa"/>
-            <w:bottom w:w="0" w:type="dxa"/>
-          </w:tblCellMar>
-        </w:tblPrEx>
         <w:trPr>
           <w:tblHeader/>
         </w:trPr>
@@ -524,10 +508,10 @@
           <w:tcPr>
             <w:tcW w:w="3200" w:type="dxa"/>
             <w:tcBorders>
-              <w:top w:val="single" w:color="AAAAAA" w:sz="1" w:space="0"/>
-              <w:left w:val="single" w:color="AAAAAA" w:sz="1" w:space="0"/>
-              <w:bottom w:val="single" w:color="AAAAAA" w:sz="1" w:space="0"/>
-              <w:right w:val="single" w:color="AAAAAA" w:sz="1" w:space="0"/>
+              <w:top w:val="single" w:sz="1" w:space="0" w:color="AAAAAA"/>
+              <w:left w:val="single" w:sz="1" w:space="0" w:color="AAAAAA"/>
+              <w:bottom w:val="single" w:sz="1" w:space="0" w:color="AAAAAA"/>
+              <w:right w:val="single" w:sz="1" w:space="0" w:color="AAAAAA"/>
             </w:tcBorders>
             <w:shd w:val="clear" w:color="auto" w:fill="2E75B6"/>
             <w:tcMar>
@@ -558,10 +542,10 @@
           <w:tcPr>
             <w:tcW w:w="2000" w:type="dxa"/>
             <w:tcBorders>
-              <w:top w:val="single" w:color="AAAAAA" w:sz="1" w:space="0"/>
-              <w:left w:val="single" w:color="AAAAAA" w:sz="1" w:space="0"/>
-              <w:bottom w:val="single" w:color="AAAAAA" w:sz="1" w:space="0"/>
-              <w:right w:val="single" w:color="AAAAAA" w:sz="1" w:space="0"/>
+              <w:top w:val="single" w:sz="1" w:space="0" w:color="AAAAAA"/>
+              <w:left w:val="single" w:sz="1" w:space="0" w:color="AAAAAA"/>
+              <w:bottom w:val="single" w:sz="1" w:space="0" w:color="AAAAAA"/>
+              <w:right w:val="single" w:sz="1" w:space="0" w:color="AAAAAA"/>
             </w:tcBorders>
             <w:shd w:val="clear" w:color="auto" w:fill="2E75B6"/>
             <w:tcMar>
@@ -592,10 +576,10 @@
           <w:tcPr>
             <w:tcW w:w="3826" w:type="dxa"/>
             <w:tcBorders>
-              <w:top w:val="single" w:color="AAAAAA" w:sz="1" w:space="0"/>
-              <w:left w:val="single" w:color="AAAAAA" w:sz="1" w:space="0"/>
-              <w:bottom w:val="single" w:color="AAAAAA" w:sz="1" w:space="0"/>
-              <w:right w:val="single" w:color="AAAAAA" w:sz="1" w:space="0"/>
+              <w:top w:val="single" w:sz="1" w:space="0" w:color="AAAAAA"/>
+              <w:left w:val="single" w:sz="1" w:space="0" w:color="AAAAAA"/>
+              <w:bottom w:val="single" w:sz="1" w:space="0" w:color="AAAAAA"/>
+              <w:right w:val="single" w:sz="1" w:space="0" w:color="AAAAAA"/>
             </w:tcBorders>
             <w:shd w:val="clear" w:color="auto" w:fill="2E75B6"/>
             <w:tcMar>
@@ -624,20 +608,14 @@
         </w:tc>
       </w:tr>
       <w:tr>
-        <w:tblPrEx>
-          <w:tblCellMar>
-            <w:top w:w="0" w:type="dxa"/>
-            <w:bottom w:w="0" w:type="dxa"/>
-          </w:tblCellMar>
-        </w:tblPrEx>
         <w:tc>
           <w:tcPr>
             <w:tcW w:w="3200" w:type="dxa"/>
             <w:tcBorders>
-              <w:top w:val="single" w:color="AAAAAA" w:sz="1" w:space="0"/>
-              <w:left w:val="single" w:color="AAAAAA" w:sz="1" w:space="0"/>
-              <w:bottom w:val="single" w:color="AAAAAA" w:sz="1" w:space="0"/>
-              <w:right w:val="single" w:color="AAAAAA" w:sz="1" w:space="0"/>
+              <w:top w:val="single" w:sz="1" w:space="0" w:color="AAAAAA"/>
+              <w:left w:val="single" w:sz="1" w:space="0" w:color="AAAAAA"/>
+              <w:bottom w:val="single" w:sz="1" w:space="0" w:color="AAAAAA"/>
+              <w:right w:val="single" w:sz="1" w:space="0" w:color="AAAAAA"/>
             </w:tcBorders>
             <w:shd w:val="clear" w:color="auto" w:fill="FFFFFF"/>
             <w:tcMar>
@@ -653,21 +631,7 @@
                 <w:sz w:val="22"/>
                 <w:szCs w:val="22"/>
               </w:rPr>
-              <w:t>我想</w:t>
-            </w:r>
-            <w:r>
-              <w:rPr>
-                <w:sz w:val="22"/>
-                <w:szCs w:val="22"/>
-              </w:rPr>
-              <w:t xml:space="preserve"> book </w:t>
-            </w:r>
-            <w:r>
-              <w:rPr>
-                <w:sz w:val="22"/>
-                <w:szCs w:val="22"/>
-              </w:rPr>
-              <w:t>個位</w:t>
+              <w:t>我想 book 個位</w:t>
             </w:r>
           </w:p>
         </w:tc>
@@ -675,10 +639,10 @@
           <w:tcPr>
             <w:tcW w:w="2000" w:type="dxa"/>
             <w:tcBorders>
-              <w:top w:val="single" w:color="AAAAAA" w:sz="1" w:space="0"/>
-              <w:left w:val="single" w:color="AAAAAA" w:sz="1" w:space="0"/>
-              <w:bottom w:val="single" w:color="AAAAAA" w:sz="1" w:space="0"/>
-              <w:right w:val="single" w:color="AAAAAA" w:sz="1" w:space="0"/>
+              <w:top w:val="single" w:sz="1" w:space="0" w:color="AAAAAA"/>
+              <w:left w:val="single" w:sz="1" w:space="0" w:color="AAAAAA"/>
+              <w:bottom w:val="single" w:sz="1" w:space="0" w:color="AAAAAA"/>
+              <w:right w:val="single" w:sz="1" w:space="0" w:color="AAAAAA"/>
             </w:tcBorders>
             <w:shd w:val="clear" w:color="auto" w:fill="FFFFFF"/>
             <w:tcMar>
@@ -702,10 +666,10 @@
           <w:tcPr>
             <w:tcW w:w="3826" w:type="dxa"/>
             <w:tcBorders>
-              <w:top w:val="single" w:color="AAAAAA" w:sz="1" w:space="0"/>
-              <w:left w:val="single" w:color="AAAAAA" w:sz="1" w:space="0"/>
-              <w:bottom w:val="single" w:color="AAAAAA" w:sz="1" w:space="0"/>
-              <w:right w:val="single" w:color="AAAAAA" w:sz="1" w:space="0"/>
+              <w:top w:val="single" w:sz="1" w:space="0" w:color="AAAAAA"/>
+              <w:left w:val="single" w:sz="1" w:space="0" w:color="AAAAAA"/>
+              <w:bottom w:val="single" w:sz="1" w:space="0" w:color="AAAAAA"/>
+              <w:right w:val="single" w:sz="1" w:space="0" w:color="AAAAAA"/>
             </w:tcBorders>
             <w:shd w:val="clear" w:color="auto" w:fill="FFFFFF"/>
             <w:tcMar>
@@ -727,20 +691,14 @@
         </w:tc>
       </w:tr>
       <w:tr>
-        <w:tblPrEx>
-          <w:tblCellMar>
-            <w:top w:w="0" w:type="dxa"/>
-            <w:bottom w:w="0" w:type="dxa"/>
-          </w:tblCellMar>
-        </w:tblPrEx>
         <w:tc>
           <w:tcPr>
             <w:tcW w:w="3200" w:type="dxa"/>
             <w:tcBorders>
-              <w:top w:val="single" w:color="AAAAAA" w:sz="1" w:space="0"/>
-              <w:left w:val="single" w:color="AAAAAA" w:sz="1" w:space="0"/>
-              <w:bottom w:val="single" w:color="AAAAAA" w:sz="1" w:space="0"/>
-              <w:right w:val="single" w:color="AAAAAA" w:sz="1" w:space="0"/>
+              <w:top w:val="single" w:sz="1" w:space="0" w:color="AAAAAA"/>
+              <w:left w:val="single" w:sz="1" w:space="0" w:color="AAAAAA"/>
+              <w:bottom w:val="single" w:sz="1" w:space="0" w:color="AAAAAA"/>
+              <w:right w:val="single" w:sz="1" w:space="0" w:color="AAAAAA"/>
             </w:tcBorders>
             <w:shd w:val="clear" w:color="auto" w:fill="EEF4FB"/>
             <w:tcMar>
@@ -756,14 +714,7 @@
                 <w:sz w:val="22"/>
                 <w:szCs w:val="22"/>
               </w:rPr>
-              <w:t>佢睇緊本</w:t>
-            </w:r>
-            <w:r>
-              <w:rPr>
-                <w:sz w:val="22"/>
-                <w:szCs w:val="22"/>
-              </w:rPr>
-              <w:t xml:space="preserve"> book</w:t>
+              <w:t>佢睇緊本 book</w:t>
             </w:r>
           </w:p>
         </w:tc>
@@ -771,10 +722,10 @@
           <w:tcPr>
             <w:tcW w:w="2000" w:type="dxa"/>
             <w:tcBorders>
-              <w:top w:val="single" w:color="AAAAAA" w:sz="1" w:space="0"/>
-              <w:left w:val="single" w:color="AAAAAA" w:sz="1" w:space="0"/>
-              <w:bottom w:val="single" w:color="AAAAAA" w:sz="1" w:space="0"/>
-              <w:right w:val="single" w:color="AAAAAA" w:sz="1" w:space="0"/>
+              <w:top w:val="single" w:sz="1" w:space="0" w:color="AAAAAA"/>
+              <w:left w:val="single" w:sz="1" w:space="0" w:color="AAAAAA"/>
+              <w:bottom w:val="single" w:sz="1" w:space="0" w:color="AAAAAA"/>
+              <w:right w:val="single" w:sz="1" w:space="0" w:color="AAAAAA"/>
             </w:tcBorders>
             <w:shd w:val="clear" w:color="auto" w:fill="EEF4FB"/>
             <w:tcMar>
@@ -798,10 +749,10 @@
           <w:tcPr>
             <w:tcW w:w="3826" w:type="dxa"/>
             <w:tcBorders>
-              <w:top w:val="single" w:color="AAAAAA" w:sz="1" w:space="0"/>
-              <w:left w:val="single" w:color="AAAAAA" w:sz="1" w:space="0"/>
-              <w:bottom w:val="single" w:color="AAAAAA" w:sz="1" w:space="0"/>
-              <w:right w:val="single" w:color="AAAAAA" w:sz="1" w:space="0"/>
+              <w:top w:val="single" w:sz="1" w:space="0" w:color="AAAAAA"/>
+              <w:left w:val="single" w:sz="1" w:space="0" w:color="AAAAAA"/>
+              <w:bottom w:val="single" w:sz="1" w:space="0" w:color="AAAAAA"/>
+              <w:right w:val="single" w:sz="1" w:space="0" w:color="AAAAAA"/>
             </w:tcBorders>
             <w:shd w:val="clear" w:color="auto" w:fill="EEF4FB"/>
             <w:tcMar>
@@ -823,20 +774,14 @@
         </w:tc>
       </w:tr>
       <w:tr>
-        <w:tblPrEx>
-          <w:tblCellMar>
-            <w:top w:w="0" w:type="dxa"/>
-            <w:bottom w:w="0" w:type="dxa"/>
-          </w:tblCellMar>
-        </w:tblPrEx>
         <w:tc>
           <w:tcPr>
             <w:tcW w:w="3200" w:type="dxa"/>
             <w:tcBorders>
-              <w:top w:val="single" w:color="AAAAAA" w:sz="1" w:space="0"/>
-              <w:left w:val="single" w:color="AAAAAA" w:sz="1" w:space="0"/>
-              <w:bottom w:val="single" w:color="AAAAAA" w:sz="1" w:space="0"/>
-              <w:right w:val="single" w:color="AAAAAA" w:sz="1" w:space="0"/>
+              <w:top w:val="single" w:sz="1" w:space="0" w:color="AAAAAA"/>
+              <w:left w:val="single" w:sz="1" w:space="0" w:color="AAAAAA"/>
+              <w:bottom w:val="single" w:sz="1" w:space="0" w:color="AAAAAA"/>
+              <w:right w:val="single" w:sz="1" w:space="0" w:color="AAAAAA"/>
             </w:tcBorders>
             <w:shd w:val="clear" w:color="auto" w:fill="FFFFFF"/>
             <w:tcMar>
@@ -852,21 +797,7 @@
                 <w:sz w:val="22"/>
                 <w:szCs w:val="22"/>
               </w:rPr>
-              <w:t>我去</w:t>
-            </w:r>
-            <w:r>
-              <w:rPr>
-                <w:sz w:val="22"/>
-                <w:szCs w:val="22"/>
-              </w:rPr>
-              <w:t xml:space="preserve"> gym </w:t>
-            </w:r>
-            <w:r>
-              <w:rPr>
-                <w:sz w:val="22"/>
-                <w:szCs w:val="22"/>
-              </w:rPr>
-              <w:t>完先食飯</w:t>
+              <w:t>我去 gym 完先食飯</w:t>
             </w:r>
           </w:p>
         </w:tc>
@@ -874,10 +805,10 @@
           <w:tcPr>
             <w:tcW w:w="2000" w:type="dxa"/>
             <w:tcBorders>
-              <w:top w:val="single" w:color="AAAAAA" w:sz="1" w:space="0"/>
-              <w:left w:val="single" w:color="AAAAAA" w:sz="1" w:space="0"/>
-              <w:bottom w:val="single" w:color="AAAAAA" w:sz="1" w:space="0"/>
-              <w:right w:val="single" w:color="AAAAAA" w:sz="1" w:space="0"/>
+              <w:top w:val="single" w:sz="1" w:space="0" w:color="AAAAAA"/>
+              <w:left w:val="single" w:sz="1" w:space="0" w:color="AAAAAA"/>
+              <w:bottom w:val="single" w:sz="1" w:space="0" w:color="AAAAAA"/>
+              <w:right w:val="single" w:sz="1" w:space="0" w:color="AAAAAA"/>
             </w:tcBorders>
             <w:shd w:val="clear" w:color="auto" w:fill="FFFFFF"/>
             <w:tcMar>
@@ -901,10 +832,10 @@
           <w:tcPr>
             <w:tcW w:w="3826" w:type="dxa"/>
             <w:tcBorders>
-              <w:top w:val="single" w:color="AAAAAA" w:sz="1" w:space="0"/>
-              <w:left w:val="single" w:color="AAAAAA" w:sz="1" w:space="0"/>
-              <w:bottom w:val="single" w:color="AAAAAA" w:sz="1" w:space="0"/>
-              <w:right w:val="single" w:color="AAAAAA" w:sz="1" w:space="0"/>
+              <w:top w:val="single" w:sz="1" w:space="0" w:color="AAAAAA"/>
+              <w:left w:val="single" w:sz="1" w:space="0" w:color="AAAAAA"/>
+              <w:bottom w:val="single" w:sz="1" w:space="0" w:color="AAAAAA"/>
+              <w:right w:val="single" w:sz="1" w:space="0" w:color="AAAAAA"/>
             </w:tcBorders>
             <w:shd w:val="clear" w:color="auto" w:fill="FFFFFF"/>
             <w:tcMar>
@@ -926,20 +857,14 @@
         </w:tc>
       </w:tr>
       <w:tr>
-        <w:tblPrEx>
-          <w:tblCellMar>
-            <w:top w:w="0" w:type="dxa"/>
-            <w:bottom w:w="0" w:type="dxa"/>
-          </w:tblCellMar>
-        </w:tblPrEx>
         <w:tc>
           <w:tcPr>
             <w:tcW w:w="3200" w:type="dxa"/>
             <w:tcBorders>
-              <w:top w:val="single" w:color="AAAAAA" w:sz="1" w:space="0"/>
-              <w:left w:val="single" w:color="AAAAAA" w:sz="1" w:space="0"/>
-              <w:bottom w:val="single" w:color="AAAAAA" w:sz="1" w:space="0"/>
-              <w:right w:val="single" w:color="AAAAAA" w:sz="1" w:space="0"/>
+              <w:top w:val="single" w:sz="1" w:space="0" w:color="AAAAAA"/>
+              <w:left w:val="single" w:sz="1" w:space="0" w:color="AAAAAA"/>
+              <w:bottom w:val="single" w:sz="1" w:space="0" w:color="AAAAAA"/>
+              <w:right w:val="single" w:sz="1" w:space="0" w:color="AAAAAA"/>
             </w:tcBorders>
             <w:shd w:val="clear" w:color="auto" w:fill="EEF4FB"/>
             <w:tcMar>
@@ -955,21 +880,7 @@
                 <w:sz w:val="22"/>
                 <w:szCs w:val="22"/>
               </w:rPr>
-              <w:t>佢好</w:t>
-            </w:r>
-            <w:r>
-              <w:rPr>
-                <w:sz w:val="22"/>
-                <w:szCs w:val="22"/>
-              </w:rPr>
-              <w:t xml:space="preserve"> pro </w:t>
-            </w:r>
-            <w:r>
-              <w:rPr>
-                <w:sz w:val="22"/>
-                <w:szCs w:val="22"/>
-              </w:rPr>
-              <w:t>㗎</w:t>
+              <w:t>佢好 pro 㗎</w:t>
             </w:r>
           </w:p>
         </w:tc>
@@ -977,10 +888,10 @@
           <w:tcPr>
             <w:tcW w:w="2000" w:type="dxa"/>
             <w:tcBorders>
-              <w:top w:val="single" w:color="AAAAAA" w:sz="1" w:space="0"/>
-              <w:left w:val="single" w:color="AAAAAA" w:sz="1" w:space="0"/>
-              <w:bottom w:val="single" w:color="AAAAAA" w:sz="1" w:space="0"/>
-              <w:right w:val="single" w:color="AAAAAA" w:sz="1" w:space="0"/>
+              <w:top w:val="single" w:sz="1" w:space="0" w:color="AAAAAA"/>
+              <w:left w:val="single" w:sz="1" w:space="0" w:color="AAAAAA"/>
+              <w:bottom w:val="single" w:sz="1" w:space="0" w:color="AAAAAA"/>
+              <w:right w:val="single" w:sz="1" w:space="0" w:color="AAAAAA"/>
             </w:tcBorders>
             <w:shd w:val="clear" w:color="auto" w:fill="EEF4FB"/>
             <w:tcMar>
@@ -1004,10 +915,10 @@
           <w:tcPr>
             <w:tcW w:w="3826" w:type="dxa"/>
             <w:tcBorders>
-              <w:top w:val="single" w:color="AAAAAA" w:sz="1" w:space="0"/>
-              <w:left w:val="single" w:color="AAAAAA" w:sz="1" w:space="0"/>
-              <w:bottom w:val="single" w:color="AAAAAA" w:sz="1" w:space="0"/>
-              <w:right w:val="single" w:color="AAAAAA" w:sz="1" w:space="0"/>
+              <w:top w:val="single" w:sz="1" w:space="0" w:color="AAAAAA"/>
+              <w:left w:val="single" w:sz="1" w:space="0" w:color="AAAAAA"/>
+              <w:bottom w:val="single" w:sz="1" w:space="0" w:color="AAAAAA"/>
+              <w:right w:val="single" w:sz="1" w:space="0" w:color="AAAAAA"/>
             </w:tcBorders>
             <w:shd w:val="clear" w:color="auto" w:fill="EEF4FB"/>
             <w:tcMar>
@@ -1029,20 +940,14 @@
         </w:tc>
       </w:tr>
       <w:tr>
-        <w:tblPrEx>
-          <w:tblCellMar>
-            <w:top w:w="0" w:type="dxa"/>
-            <w:bottom w:w="0" w:type="dxa"/>
-          </w:tblCellMar>
-        </w:tblPrEx>
         <w:tc>
           <w:tcPr>
             <w:tcW w:w="3200" w:type="dxa"/>
             <w:tcBorders>
-              <w:top w:val="single" w:color="AAAAAA" w:sz="1" w:space="0"/>
-              <w:left w:val="single" w:color="AAAAAA" w:sz="1" w:space="0"/>
-              <w:bottom w:val="single" w:color="AAAAAA" w:sz="1" w:space="0"/>
-              <w:right w:val="single" w:color="AAAAAA" w:sz="1" w:space="0"/>
+              <w:top w:val="single" w:sz="1" w:space="0" w:color="AAAAAA"/>
+              <w:left w:val="single" w:sz="1" w:space="0" w:color="AAAAAA"/>
+              <w:bottom w:val="single" w:sz="1" w:space="0" w:color="AAAAAA"/>
+              <w:right w:val="single" w:sz="1" w:space="0" w:color="AAAAAA"/>
             </w:tcBorders>
             <w:shd w:val="clear" w:color="auto" w:fill="FFFFFF"/>
             <w:tcMar>
@@ -1058,21 +963,7 @@
                 <w:sz w:val="22"/>
                 <w:szCs w:val="22"/>
               </w:rPr>
-              <w:t>我</w:t>
-            </w:r>
-            <w:r>
-              <w:rPr>
-                <w:sz w:val="22"/>
-                <w:szCs w:val="22"/>
-              </w:rPr>
-              <w:t xml:space="preserve"> food </w:t>
-            </w:r>
-            <w:r>
-              <w:rPr>
-                <w:sz w:val="22"/>
-                <w:szCs w:val="22"/>
-              </w:rPr>
-              <w:t>你啦</w:t>
+              <w:t>我 food 你啦</w:t>
             </w:r>
           </w:p>
         </w:tc>
@@ -1080,10 +971,10 @@
           <w:tcPr>
             <w:tcW w:w="2000" w:type="dxa"/>
             <w:tcBorders>
-              <w:top w:val="single" w:color="AAAAAA" w:sz="1" w:space="0"/>
-              <w:left w:val="single" w:color="AAAAAA" w:sz="1" w:space="0"/>
-              <w:bottom w:val="single" w:color="AAAAAA" w:sz="1" w:space="0"/>
-              <w:right w:val="single" w:color="AAAAAA" w:sz="1" w:space="0"/>
+              <w:top w:val="single" w:sz="1" w:space="0" w:color="AAAAAA"/>
+              <w:left w:val="single" w:sz="1" w:space="0" w:color="AAAAAA"/>
+              <w:bottom w:val="single" w:sz="1" w:space="0" w:color="AAAAAA"/>
+              <w:right w:val="single" w:sz="1" w:space="0" w:color="AAAAAA"/>
             </w:tcBorders>
             <w:shd w:val="clear" w:color="auto" w:fill="FFFFFF"/>
             <w:tcMar>
@@ -1107,10 +998,10 @@
           <w:tcPr>
             <w:tcW w:w="3826" w:type="dxa"/>
             <w:tcBorders>
-              <w:top w:val="single" w:color="AAAAAA" w:sz="1" w:space="0"/>
-              <w:left w:val="single" w:color="AAAAAA" w:sz="1" w:space="0"/>
-              <w:bottom w:val="single" w:color="AAAAAA" w:sz="1" w:space="0"/>
-              <w:right w:val="single" w:color="AAAAAA" w:sz="1" w:space="0"/>
+              <w:top w:val="single" w:sz="1" w:space="0" w:color="AAAAAA"/>
+              <w:left w:val="single" w:sz="1" w:space="0" w:color="AAAAAA"/>
+              <w:bottom w:val="single" w:sz="1" w:space="0" w:color="AAAAAA"/>
+              <w:right w:val="single" w:sz="1" w:space="0" w:color="AAAAAA"/>
             </w:tcBorders>
             <w:shd w:val="clear" w:color="auto" w:fill="FFFFFF"/>
             <w:tcMar>
@@ -1260,10 +1151,7 @@
       </w:r>
       <w:proofErr w:type="gramEnd"/>
       <w:r>
-        <w:t xml:space="preserve"> code-switching is particularly prevalent in written discourse, including social media, online forums, and informal messaging. Myers-Scotton's (1993) Matrix Language Frame (MLF) model provides a foundational theoretical framework: one language (in this case, Cantonese) functions as the matrix language that supplies the grammatical structure and morphosyntactic frame of the uttera</w:t>
-      </w:r>
-      <w:r>
-        <w:t>nce, while the other language (English) supplies embedded content words that are inserted into that frame.</w:t>
+        <w:t xml:space="preserve"> code-switching is particularly prevalent in written discourse, including social media, online forums, and informal messaging. Myers-Scotton's (1993) Matrix Language Frame (MLF) model provides a foundational theoretical framework: one language (in this case, Cantonese) functions as the matrix language that supplies the grammatical structure and morphosyntactic frame of the utterance, while the other language (English) supplies embedded content words that are inserted into that frame.</w:t>
       </w:r>
     </w:p>
     <w:p>
@@ -1277,19 +1165,7 @@
         <w:jc w:val="both"/>
       </w:pPr>
       <w:r>
-        <w:t xml:space="preserve">This distinction is linguistically significant because it implies that the grammatical role of an embedded English word is determined not by English syntax alone, but by the syntactic position it occupies within the Cantonese matrix frame. The English word gym in </w:t>
-      </w:r>
-      <w:r>
-        <w:t>我去</w:t>
-      </w:r>
-      <w:r>
-        <w:t xml:space="preserve"> gym </w:t>
-      </w:r>
-      <w:r>
-        <w:t>完先食飯</w:t>
-      </w:r>
-      <w:r>
-        <w:t xml:space="preserve"> occupies an object noun position defined by Cantonese syntax, making its POS assignment a function of Cantonese grammar rather than English convention.</w:t>
+        <w:t>This distinction is linguistically significant because it implies that the grammatical role of an embedded English word is determined not by English syntax alone, but by the syntactic position it occupies within the Cantonese matrix frame. The English word gym in 我去 gym 完先食飯 occupies an object noun position defined by Cantonese syntax, making its POS assignment a function of Cantonese grammar rather than English convention.</w:t>
       </w:r>
     </w:p>
     <w:p>
@@ -1311,34 +1187,7 @@
         <w:jc w:val="both"/>
       </w:pPr>
       <w:r>
-        <w:t>Part-of-speech ambiguity arises when a single word form can belong to more than one lexical category depending on its syntactic context. This is a well-documented phenomenon in English, where conversion (also known as zero-derivation) allows words to shift grammatical category without morphological change. The word book, for instance, belongs to the categories noun and verb with no surface-level distinction. In Cantonese-English mixed text, such ambiguity is exacerbated because the disambiguation cues provi</w:t>
-      </w:r>
-      <w:r>
-        <w:t xml:space="preserve">ded by the surrounding Cantonese words — aspect markers such as </w:t>
-      </w:r>
-      <w:r>
-        <w:t>咗</w:t>
-      </w:r>
-      <w:r>
-        <w:t xml:space="preserve"> (perfective) or </w:t>
-      </w:r>
-      <w:r>
-        <w:t>緊</w:t>
-      </w:r>
-      <w:r>
-        <w:t xml:space="preserve"> (progressive), modal verbs such as </w:t>
-      </w:r>
-      <w:r>
-        <w:t>想</w:t>
-      </w:r>
-      <w:r>
-        <w:t xml:space="preserve"> (want to) or </w:t>
-      </w:r>
-      <w:r>
-        <w:t>要</w:t>
-      </w:r>
-      <w:r>
-        <w:t xml:space="preserve"> (need to), and classifier constructions — are written in Chinese characters and are largely invisible to English-only NLP taggers.</w:t>
+        <w:t>Part-of-speech ambiguity arises when a single word form can belong to more than one lexical category depending on its syntactic context. This is a well-documented phenomenon in English, where conversion (also known as zero-derivation) allows words to shift grammatical category without morphological change. The word book, for instance, belongs to the categories noun and verb with no surface-level distinction. In Cantonese-English mixed text, such ambiguity is exacerbated because the disambiguation cues provided by the surrounding Cantonese words — aspect markers such as 咗 (perfective) or 緊 (progressive), modal verbs such as 想 (want to) or 要 (need to), and classifier constructions — are written in Chinese characters and are largely invisible to English-only NLP taggers.</w:t>
       </w:r>
     </w:p>
     <w:p>
@@ -1368,56 +1217,11 @@
         <w:jc w:val="both"/>
       </w:pPr>
       <w:r>
-        <w:t xml:space="preserve">Cantonese presents several language-specific characteristics that complicate POS tagging in a mixed-language environment. First, Cantonese is an aspect-prominent language: verb form does not change morphologically, and aspect is marked by post-verbal particles (e.g., </w:t>
-      </w:r>
-      <w:r>
-        <w:t>咗</w:t>
-      </w:r>
-      <w:r>
-        <w:t xml:space="preserve">, </w:t>
-      </w:r>
-      <w:r>
-        <w:t>過</w:t>
-      </w:r>
-      <w:r>
-        <w:t xml:space="preserve">, </w:t>
-      </w:r>
-      <w:r>
-        <w:t>緊</w:t>
-      </w:r>
-      <w:r>
-        <w:t>). An English verb embedded before such a particle can be disambiguated as a verb by its position, but this requires cross-linguistic syntactic awareness. Second, Cantonese exhibits productive noun-to-verb conversion of English loanwords — food (</w:t>
-      </w:r>
-      <w:r>
-        <w:t>食物</w:t>
-      </w:r>
-      <w:r>
-        <w:t>) becomes food (</w:t>
-      </w:r>
-      <w:r>
-        <w:t>請食飯</w:t>
-      </w:r>
-      <w:r>
-        <w:t xml:space="preserve">) through semantic extension — which has no parallel in standard English usage and is therefore not captured by English lexicons. Third, Cantonese-specific intensifiers and evaluative </w:t>
+        <w:t xml:space="preserve">Cantonese presents several language-specific characteristics that complicate POS tagging in a mixed-language environment. First, Cantonese is an aspect-prominent language: verb form does not change morphologically, and aspect is marked by post-verbal particles (e.g., 咗, 過, 緊). An English verb embedded before such a particle can be disambiguated as a verb by its position, but this requires cross-linguistic syntactic awareness. Second, Cantonese exhibits productive noun-to-verb conversion of English loanwords — food (食物) becomes food (請食飯) through semantic extension — which has no parallel in standard English usage and is therefore not captured by English lexicons. Third, Cantonese-specific intensifiers and evaluative </w:t>
       </w:r>
       <w:r>
         <w:lastRenderedPageBreak/>
-        <w:t xml:space="preserve">particles (e.g., </w:t>
-      </w:r>
-      <w:r>
-        <w:t>好</w:t>
-      </w:r>
-      <w:r>
-        <w:t xml:space="preserve"> preceding an adjective, </w:t>
-      </w:r>
-      <w:r>
-        <w:t>㗎</w:t>
-      </w:r>
-      <w:r>
-        <w:t xml:space="preserve"> sentence-</w:t>
-      </w:r>
-      <w:r>
-        <w:t>final) provide strong disambiguation cues that require understanding of Cantonese grammar to exploit.</w:t>
+        <w:t>particles (e.g., 好 preceding an adjective, 㗎 sentence-final) provide strong disambiguation cues that require understanding of Cantonese grammar to exploit.</w:t>
       </w:r>
     </w:p>
     <w:p>
@@ -1511,13 +1315,7 @@
         <w:jc w:val="both"/>
       </w:pPr>
       <w:r>
-        <w:t>A dataset of 300 Cantonese-English mixed sentences was compiled from publicly available online sources, including LIHKG (</w:t>
-      </w:r>
-      <w:r>
-        <w:t>連登討論區</w:t>
-      </w:r>
-      <w:r>
-        <w:t xml:space="preserve">), YouTube comment sections of Cantonese-language content creators, and Hong Kong-specific posts on </w:t>
+        <w:t xml:space="preserve">A dataset of 300 Cantonese-English mixed sentences was compiled from publicly available online sources, including LIHKG (連登討論區), YouTube comment sections of Cantonese-language content creators, and Hong Kong-specific posts on </w:t>
       </w:r>
       <w:proofErr w:type="spellStart"/>
       <w:r>
@@ -1525,13 +1323,7 @@
       </w:r>
       <w:proofErr w:type="spellEnd"/>
       <w:r>
-        <w:t xml:space="preserve"> (</w:t>
-      </w:r>
-      <w:r>
-        <w:t>小紅書</w:t>
-      </w:r>
-      <w:r>
-        <w:t xml:space="preserve">). Sentences were selected according to the following criteria: (1) the sentence must contain at least one English word embedded within an otherwise Cantonese utterance; (2) purely English or purely Cantonese sentences were excluded; (3) sentences must be grammatically interpretable and not consist solely of hashtags or emoji. Data collection was led by </w:t>
+        <w:t xml:space="preserve"> (小紅書). Sentences were selected according to the following criteria: (1) the sentence must contain at least one English word embedded within an otherwise Cantonese utterance; (2) purely English or purely Cantonese sentences were excluded; (3) sentences must be grammatically interpretable and not consist solely of hashtags or emoji. Data collection was led by </w:t>
       </w:r>
       <w:proofErr w:type="spellStart"/>
       <w:r>
@@ -1614,10 +1406,7 @@
       </w:r>
       <w:proofErr w:type="spellEnd"/>
       <w:r>
-        <w:t>. The corrected labels constitute the Gold Standard used for trai</w:t>
-      </w:r>
-      <w:r>
-        <w:t>ning and evaluation throughout this project.</w:t>
+        <w:t>. The corrected labels constitute the Gold Standard used for training and evaluation throughout this project.</w:t>
       </w:r>
     </w:p>
     <w:p>
@@ -1667,12 +1456,12 @@
       <w:tblPr>
         <w:tblW w:w="9026" w:type="dxa"/>
         <w:tblBorders>
-          <w:top w:val="single" w:color="auto" w:sz="4" w:space="0"/>
-          <w:left w:val="single" w:color="auto" w:sz="4" w:space="0"/>
-          <w:bottom w:val="single" w:color="auto" w:sz="4" w:space="0"/>
-          <w:right w:val="single" w:color="auto" w:sz="4" w:space="0"/>
-          <w:insideH w:val="single" w:color="auto" w:sz="4" w:space="0"/>
-          <w:insideV w:val="single" w:color="auto" w:sz="4" w:space="0"/>
+          <w:top w:val="single" w:sz="4" w:space="0" w:color="auto"/>
+          <w:left w:val="single" w:sz="4" w:space="0" w:color="auto"/>
+          <w:bottom w:val="single" w:sz="4" w:space="0" w:color="auto"/>
+          <w:right w:val="single" w:sz="4" w:space="0" w:color="auto"/>
+          <w:insideH w:val="single" w:sz="4" w:space="0" w:color="auto"/>
+          <w:insideV w:val="single" w:sz="4" w:space="0" w:color="auto"/>
         </w:tblBorders>
         <w:tblCellMar>
           <w:left w:w="10" w:type="dxa"/>
@@ -1685,12 +1474,6 @@
         <w:gridCol w:w="4513"/>
       </w:tblGrid>
       <w:tr>
-        <w:tblPrEx>
-          <w:tblCellMar>
-            <w:top w:w="0" w:type="dxa"/>
-            <w:bottom w:w="0" w:type="dxa"/>
-          </w:tblCellMar>
-        </w:tblPrEx>
         <w:trPr>
           <w:tblHeader/>
         </w:trPr>
@@ -1698,10 +1481,10 @@
           <w:tcPr>
             <w:tcW w:w="4513" w:type="dxa"/>
             <w:tcBorders>
-              <w:top w:val="single" w:color="AAAAAA" w:sz="1" w:space="0"/>
-              <w:left w:val="single" w:color="AAAAAA" w:sz="1" w:space="0"/>
-              <w:bottom w:val="single" w:color="AAAAAA" w:sz="1" w:space="0"/>
-              <w:right w:val="single" w:color="AAAAAA" w:sz="1" w:space="0"/>
+              <w:top w:val="single" w:sz="1" w:space="0" w:color="AAAAAA"/>
+              <w:left w:val="single" w:sz="1" w:space="0" w:color="AAAAAA"/>
+              <w:bottom w:val="single" w:sz="1" w:space="0" w:color="AAAAAA"/>
+              <w:right w:val="single" w:sz="1" w:space="0" w:color="AAAAAA"/>
             </w:tcBorders>
             <w:shd w:val="clear" w:color="auto" w:fill="2E75B6"/>
             <w:tcMar>
@@ -1732,10 +1515,10 @@
           <w:tcPr>
             <w:tcW w:w="4513" w:type="dxa"/>
             <w:tcBorders>
-              <w:top w:val="single" w:color="AAAAAA" w:sz="1" w:space="0"/>
-              <w:left w:val="single" w:color="AAAAAA" w:sz="1" w:space="0"/>
-              <w:bottom w:val="single" w:color="AAAAAA" w:sz="1" w:space="0"/>
-              <w:right w:val="single" w:color="AAAAAA" w:sz="1" w:space="0"/>
+              <w:top w:val="single" w:sz="1" w:space="0" w:color="AAAAAA"/>
+              <w:left w:val="single" w:sz="1" w:space="0" w:color="AAAAAA"/>
+              <w:bottom w:val="single" w:sz="1" w:space="0" w:color="AAAAAA"/>
+              <w:right w:val="single" w:sz="1" w:space="0" w:color="AAAAAA"/>
             </w:tcBorders>
             <w:shd w:val="clear" w:color="auto" w:fill="2E75B6"/>
             <w:tcMar>
@@ -1764,20 +1547,14 @@
         </w:tc>
       </w:tr>
       <w:tr>
-        <w:tblPrEx>
-          <w:tblCellMar>
-            <w:top w:w="0" w:type="dxa"/>
-            <w:bottom w:w="0" w:type="dxa"/>
-          </w:tblCellMar>
-        </w:tblPrEx>
         <w:tc>
           <w:tcPr>
             <w:tcW w:w="4513" w:type="dxa"/>
             <w:tcBorders>
-              <w:top w:val="single" w:color="AAAAAA" w:sz="1" w:space="0"/>
-              <w:left w:val="single" w:color="AAAAAA" w:sz="1" w:space="0"/>
-              <w:bottom w:val="single" w:color="AAAAAA" w:sz="1" w:space="0"/>
-              <w:right w:val="single" w:color="AAAAAA" w:sz="1" w:space="0"/>
+              <w:top w:val="single" w:sz="1" w:space="0" w:color="AAAAAA"/>
+              <w:left w:val="single" w:sz="1" w:space="0" w:color="AAAAAA"/>
+              <w:bottom w:val="single" w:sz="1" w:space="0" w:color="AAAAAA"/>
+              <w:right w:val="single" w:sz="1" w:space="0" w:color="AAAAAA"/>
             </w:tcBorders>
             <w:shd w:val="clear" w:color="auto" w:fill="FFFFFF"/>
             <w:tcMar>
@@ -1801,10 +1578,10 @@
           <w:tcPr>
             <w:tcW w:w="4513" w:type="dxa"/>
             <w:tcBorders>
-              <w:top w:val="single" w:color="AAAAAA" w:sz="1" w:space="0"/>
-              <w:left w:val="single" w:color="AAAAAA" w:sz="1" w:space="0"/>
-              <w:bottom w:val="single" w:color="AAAAAA" w:sz="1" w:space="0"/>
-              <w:right w:val="single" w:color="AAAAAA" w:sz="1" w:space="0"/>
+              <w:top w:val="single" w:sz="1" w:space="0" w:color="AAAAAA"/>
+              <w:left w:val="single" w:sz="1" w:space="0" w:color="AAAAAA"/>
+              <w:bottom w:val="single" w:sz="1" w:space="0" w:color="AAAAAA"/>
+              <w:right w:val="single" w:sz="1" w:space="0" w:color="AAAAAA"/>
             </w:tcBorders>
             <w:shd w:val="clear" w:color="auto" w:fill="FFFFFF"/>
             <w:tcMar>
@@ -1826,20 +1603,14 @@
         </w:tc>
       </w:tr>
       <w:tr>
-        <w:tblPrEx>
-          <w:tblCellMar>
-            <w:top w:w="0" w:type="dxa"/>
-            <w:bottom w:w="0" w:type="dxa"/>
-          </w:tblCellMar>
-        </w:tblPrEx>
         <w:tc>
           <w:tcPr>
             <w:tcW w:w="4513" w:type="dxa"/>
             <w:tcBorders>
-              <w:top w:val="single" w:color="AAAAAA" w:sz="1" w:space="0"/>
-              <w:left w:val="single" w:color="AAAAAA" w:sz="1" w:space="0"/>
-              <w:bottom w:val="single" w:color="AAAAAA" w:sz="1" w:space="0"/>
-              <w:right w:val="single" w:color="AAAAAA" w:sz="1" w:space="0"/>
+              <w:top w:val="single" w:sz="1" w:space="0" w:color="AAAAAA"/>
+              <w:left w:val="single" w:sz="1" w:space="0" w:color="AAAAAA"/>
+              <w:bottom w:val="single" w:sz="1" w:space="0" w:color="AAAAAA"/>
+              <w:right w:val="single" w:sz="1" w:space="0" w:color="AAAAAA"/>
             </w:tcBorders>
             <w:shd w:val="clear" w:color="auto" w:fill="EEF4FB"/>
             <w:tcMar>
@@ -1863,10 +1634,10 @@
           <w:tcPr>
             <w:tcW w:w="4513" w:type="dxa"/>
             <w:tcBorders>
-              <w:top w:val="single" w:color="AAAAAA" w:sz="1" w:space="0"/>
-              <w:left w:val="single" w:color="AAAAAA" w:sz="1" w:space="0"/>
-              <w:bottom w:val="single" w:color="AAAAAA" w:sz="1" w:space="0"/>
-              <w:right w:val="single" w:color="AAAAAA" w:sz="1" w:space="0"/>
+              <w:top w:val="single" w:sz="1" w:space="0" w:color="AAAAAA"/>
+              <w:left w:val="single" w:sz="1" w:space="0" w:color="AAAAAA"/>
+              <w:bottom w:val="single" w:sz="1" w:space="0" w:color="AAAAAA"/>
+              <w:right w:val="single" w:sz="1" w:space="0" w:color="AAAAAA"/>
             </w:tcBorders>
             <w:shd w:val="clear" w:color="auto" w:fill="EEF4FB"/>
             <w:tcMar>
@@ -1888,20 +1659,14 @@
         </w:tc>
       </w:tr>
       <w:tr>
-        <w:tblPrEx>
-          <w:tblCellMar>
-            <w:top w:w="0" w:type="dxa"/>
-            <w:bottom w:w="0" w:type="dxa"/>
-          </w:tblCellMar>
-        </w:tblPrEx>
         <w:tc>
           <w:tcPr>
             <w:tcW w:w="4513" w:type="dxa"/>
             <w:tcBorders>
-              <w:top w:val="single" w:color="AAAAAA" w:sz="1" w:space="0"/>
-              <w:left w:val="single" w:color="AAAAAA" w:sz="1" w:space="0"/>
-              <w:bottom w:val="single" w:color="AAAAAA" w:sz="1" w:space="0"/>
-              <w:right w:val="single" w:color="AAAAAA" w:sz="1" w:space="0"/>
+              <w:top w:val="single" w:sz="1" w:space="0" w:color="AAAAAA"/>
+              <w:left w:val="single" w:sz="1" w:space="0" w:color="AAAAAA"/>
+              <w:bottom w:val="single" w:sz="1" w:space="0" w:color="AAAAAA"/>
+              <w:right w:val="single" w:sz="1" w:space="0" w:color="AAAAAA"/>
             </w:tcBorders>
             <w:shd w:val="clear" w:color="auto" w:fill="FFFFFF"/>
             <w:tcMar>
@@ -1925,10 +1690,10 @@
           <w:tcPr>
             <w:tcW w:w="4513" w:type="dxa"/>
             <w:tcBorders>
-              <w:top w:val="single" w:color="AAAAAA" w:sz="1" w:space="0"/>
-              <w:left w:val="single" w:color="AAAAAA" w:sz="1" w:space="0"/>
-              <w:bottom w:val="single" w:color="AAAAAA" w:sz="1" w:space="0"/>
-              <w:right w:val="single" w:color="AAAAAA" w:sz="1" w:space="0"/>
+              <w:top w:val="single" w:sz="1" w:space="0" w:color="AAAAAA"/>
+              <w:left w:val="single" w:sz="1" w:space="0" w:color="AAAAAA"/>
+              <w:bottom w:val="single" w:sz="1" w:space="0" w:color="AAAAAA"/>
+              <w:right w:val="single" w:sz="1" w:space="0" w:color="AAAAAA"/>
             </w:tcBorders>
             <w:shd w:val="clear" w:color="auto" w:fill="FFFFFF"/>
             <w:tcMar>
@@ -1950,20 +1715,14 @@
         </w:tc>
       </w:tr>
       <w:tr>
-        <w:tblPrEx>
-          <w:tblCellMar>
-            <w:top w:w="0" w:type="dxa"/>
-            <w:bottom w:w="0" w:type="dxa"/>
-          </w:tblCellMar>
-        </w:tblPrEx>
         <w:tc>
           <w:tcPr>
             <w:tcW w:w="4513" w:type="dxa"/>
             <w:tcBorders>
-              <w:top w:val="single" w:color="AAAAAA" w:sz="1" w:space="0"/>
-              <w:left w:val="single" w:color="AAAAAA" w:sz="1" w:space="0"/>
-              <w:bottom w:val="single" w:color="AAAAAA" w:sz="1" w:space="0"/>
-              <w:right w:val="single" w:color="AAAAAA" w:sz="1" w:space="0"/>
+              <w:top w:val="single" w:sz="1" w:space="0" w:color="AAAAAA"/>
+              <w:left w:val="single" w:sz="1" w:space="0" w:color="AAAAAA"/>
+              <w:bottom w:val="single" w:sz="1" w:space="0" w:color="AAAAAA"/>
+              <w:right w:val="single" w:sz="1" w:space="0" w:color="AAAAAA"/>
             </w:tcBorders>
             <w:shd w:val="clear" w:color="auto" w:fill="EEF4FB"/>
             <w:tcMar>
@@ -1987,10 +1746,10 @@
           <w:tcPr>
             <w:tcW w:w="4513" w:type="dxa"/>
             <w:tcBorders>
-              <w:top w:val="single" w:color="AAAAAA" w:sz="1" w:space="0"/>
-              <w:left w:val="single" w:color="AAAAAA" w:sz="1" w:space="0"/>
-              <w:bottom w:val="single" w:color="AAAAAA" w:sz="1" w:space="0"/>
-              <w:right w:val="single" w:color="AAAAAA" w:sz="1" w:space="0"/>
+              <w:top w:val="single" w:sz="1" w:space="0" w:color="AAAAAA"/>
+              <w:left w:val="single" w:sz="1" w:space="0" w:color="AAAAAA"/>
+              <w:bottom w:val="single" w:sz="1" w:space="0" w:color="AAAAAA"/>
+              <w:right w:val="single" w:sz="1" w:space="0" w:color="AAAAAA"/>
             </w:tcBorders>
             <w:shd w:val="clear" w:color="auto" w:fill="EEF4FB"/>
             <w:tcMar>
@@ -2012,20 +1771,14 @@
         </w:tc>
       </w:tr>
       <w:tr>
-        <w:tblPrEx>
-          <w:tblCellMar>
-            <w:top w:w="0" w:type="dxa"/>
-            <w:bottom w:w="0" w:type="dxa"/>
-          </w:tblCellMar>
-        </w:tblPrEx>
         <w:tc>
           <w:tcPr>
             <w:tcW w:w="4513" w:type="dxa"/>
             <w:tcBorders>
-              <w:top w:val="single" w:color="AAAAAA" w:sz="1" w:space="0"/>
-              <w:left w:val="single" w:color="AAAAAA" w:sz="1" w:space="0"/>
-              <w:bottom w:val="single" w:color="AAAAAA" w:sz="1" w:space="0"/>
-              <w:right w:val="single" w:color="AAAAAA" w:sz="1" w:space="0"/>
+              <w:top w:val="single" w:sz="1" w:space="0" w:color="AAAAAA"/>
+              <w:left w:val="single" w:sz="1" w:space="0" w:color="AAAAAA"/>
+              <w:bottom w:val="single" w:sz="1" w:space="0" w:color="AAAAAA"/>
+              <w:right w:val="single" w:sz="1" w:space="0" w:color="AAAAAA"/>
             </w:tcBorders>
             <w:shd w:val="clear" w:color="auto" w:fill="FFFFFF"/>
             <w:tcMar>
@@ -2049,10 +1802,10 @@
           <w:tcPr>
             <w:tcW w:w="4513" w:type="dxa"/>
             <w:tcBorders>
-              <w:top w:val="single" w:color="AAAAAA" w:sz="1" w:space="0"/>
-              <w:left w:val="single" w:color="AAAAAA" w:sz="1" w:space="0"/>
-              <w:bottom w:val="single" w:color="AAAAAA" w:sz="1" w:space="0"/>
-              <w:right w:val="single" w:color="AAAAAA" w:sz="1" w:space="0"/>
+              <w:top w:val="single" w:sz="1" w:space="0" w:color="AAAAAA"/>
+              <w:left w:val="single" w:sz="1" w:space="0" w:color="AAAAAA"/>
+              <w:bottom w:val="single" w:sz="1" w:space="0" w:color="AAAAAA"/>
+              <w:right w:val="single" w:sz="1" w:space="0" w:color="AAAAAA"/>
             </w:tcBorders>
             <w:shd w:val="clear" w:color="auto" w:fill="FFFFFF"/>
             <w:tcMar>
@@ -2074,20 +1827,14 @@
         </w:tc>
       </w:tr>
       <w:tr>
-        <w:tblPrEx>
-          <w:tblCellMar>
-            <w:top w:w="0" w:type="dxa"/>
-            <w:bottom w:w="0" w:type="dxa"/>
-          </w:tblCellMar>
-        </w:tblPrEx>
         <w:tc>
           <w:tcPr>
             <w:tcW w:w="4513" w:type="dxa"/>
             <w:tcBorders>
-              <w:top w:val="single" w:color="AAAAAA" w:sz="1" w:space="0"/>
-              <w:left w:val="single" w:color="AAAAAA" w:sz="1" w:space="0"/>
-              <w:bottom w:val="single" w:color="AAAAAA" w:sz="1" w:space="0"/>
-              <w:right w:val="single" w:color="AAAAAA" w:sz="1" w:space="0"/>
+              <w:top w:val="single" w:sz="1" w:space="0" w:color="AAAAAA"/>
+              <w:left w:val="single" w:sz="1" w:space="0" w:color="AAAAAA"/>
+              <w:bottom w:val="single" w:sz="1" w:space="0" w:color="AAAAAA"/>
+              <w:right w:val="single" w:sz="1" w:space="0" w:color="AAAAAA"/>
             </w:tcBorders>
             <w:shd w:val="clear" w:color="auto" w:fill="EEF4FB"/>
             <w:tcMar>
@@ -2111,10 +1858,10 @@
           <w:tcPr>
             <w:tcW w:w="4513" w:type="dxa"/>
             <w:tcBorders>
-              <w:top w:val="single" w:color="AAAAAA" w:sz="1" w:space="0"/>
-              <w:left w:val="single" w:color="AAAAAA" w:sz="1" w:space="0"/>
-              <w:bottom w:val="single" w:color="AAAAAA" w:sz="1" w:space="0"/>
-              <w:right w:val="single" w:color="AAAAAA" w:sz="1" w:space="0"/>
+              <w:top w:val="single" w:sz="1" w:space="0" w:color="AAAAAA"/>
+              <w:left w:val="single" w:sz="1" w:space="0" w:color="AAAAAA"/>
+              <w:bottom w:val="single" w:sz="1" w:space="0" w:color="AAAAAA"/>
+              <w:right w:val="single" w:sz="1" w:space="0" w:color="AAAAAA"/>
             </w:tcBorders>
             <w:shd w:val="clear" w:color="auto" w:fill="EEF4FB"/>
             <w:tcMar>
@@ -2367,12 +2114,12 @@
       <w:tblPr>
         <w:tblW w:w="9026" w:type="dxa"/>
         <w:tblBorders>
-          <w:top w:val="single" w:color="auto" w:sz="4" w:space="0"/>
-          <w:left w:val="single" w:color="auto" w:sz="4" w:space="0"/>
-          <w:bottom w:val="single" w:color="auto" w:sz="4" w:space="0"/>
-          <w:right w:val="single" w:color="auto" w:sz="4" w:space="0"/>
-          <w:insideH w:val="single" w:color="auto" w:sz="4" w:space="0"/>
-          <w:insideV w:val="single" w:color="auto" w:sz="4" w:space="0"/>
+          <w:top w:val="single" w:sz="4" w:space="0" w:color="auto"/>
+          <w:left w:val="single" w:sz="4" w:space="0" w:color="auto"/>
+          <w:bottom w:val="single" w:sz="4" w:space="0" w:color="auto"/>
+          <w:right w:val="single" w:sz="4" w:space="0" w:color="auto"/>
+          <w:insideH w:val="single" w:sz="4" w:space="0" w:color="auto"/>
+          <w:insideV w:val="single" w:sz="4" w:space="0" w:color="auto"/>
         </w:tblBorders>
         <w:tblCellMar>
           <w:left w:w="10" w:type="dxa"/>
@@ -2386,12 +2133,6 @@
         <w:gridCol w:w="3626"/>
       </w:tblGrid>
       <w:tr>
-        <w:tblPrEx>
-          <w:tblCellMar>
-            <w:top w:w="0" w:type="dxa"/>
-            <w:bottom w:w="0" w:type="dxa"/>
-          </w:tblCellMar>
-        </w:tblPrEx>
         <w:trPr>
           <w:tblHeader/>
         </w:trPr>
@@ -2399,10 +2140,10 @@
           <w:tcPr>
             <w:tcW w:w="2200" w:type="dxa"/>
             <w:tcBorders>
-              <w:top w:val="single" w:color="AAAAAA" w:sz="1" w:space="0"/>
-              <w:left w:val="single" w:color="AAAAAA" w:sz="1" w:space="0"/>
-              <w:bottom w:val="single" w:color="AAAAAA" w:sz="1" w:space="0"/>
-              <w:right w:val="single" w:color="AAAAAA" w:sz="1" w:space="0"/>
+              <w:top w:val="single" w:sz="1" w:space="0" w:color="AAAAAA"/>
+              <w:left w:val="single" w:sz="1" w:space="0" w:color="AAAAAA"/>
+              <w:bottom w:val="single" w:sz="1" w:space="0" w:color="AAAAAA"/>
+              <w:right w:val="single" w:sz="1" w:space="0" w:color="AAAAAA"/>
             </w:tcBorders>
             <w:shd w:val="clear" w:color="auto" w:fill="2E75B6"/>
             <w:tcMar>
@@ -2433,10 +2174,10 @@
           <w:tcPr>
             <w:tcW w:w="3200" w:type="dxa"/>
             <w:tcBorders>
-              <w:top w:val="single" w:color="AAAAAA" w:sz="1" w:space="0"/>
-              <w:left w:val="single" w:color="AAAAAA" w:sz="1" w:space="0"/>
-              <w:bottom w:val="single" w:color="AAAAAA" w:sz="1" w:space="0"/>
-              <w:right w:val="single" w:color="AAAAAA" w:sz="1" w:space="0"/>
+              <w:top w:val="single" w:sz="1" w:space="0" w:color="AAAAAA"/>
+              <w:left w:val="single" w:sz="1" w:space="0" w:color="AAAAAA"/>
+              <w:bottom w:val="single" w:sz="1" w:space="0" w:color="AAAAAA"/>
+              <w:right w:val="single" w:sz="1" w:space="0" w:color="AAAAAA"/>
             </w:tcBorders>
             <w:shd w:val="clear" w:color="auto" w:fill="2E75B6"/>
             <w:tcMar>
@@ -2467,10 +2208,10 @@
           <w:tcPr>
             <w:tcW w:w="3626" w:type="dxa"/>
             <w:tcBorders>
-              <w:top w:val="single" w:color="AAAAAA" w:sz="1" w:space="0"/>
-              <w:left w:val="single" w:color="AAAAAA" w:sz="1" w:space="0"/>
-              <w:bottom w:val="single" w:color="AAAAAA" w:sz="1" w:space="0"/>
-              <w:right w:val="single" w:color="AAAAAA" w:sz="1" w:space="0"/>
+              <w:top w:val="single" w:sz="1" w:space="0" w:color="AAAAAA"/>
+              <w:left w:val="single" w:sz="1" w:space="0" w:color="AAAAAA"/>
+              <w:bottom w:val="single" w:sz="1" w:space="0" w:color="AAAAAA"/>
+              <w:right w:val="single" w:sz="1" w:space="0" w:color="AAAAAA"/>
             </w:tcBorders>
             <w:shd w:val="clear" w:color="auto" w:fill="2E75B6"/>
             <w:tcMar>
@@ -2499,20 +2240,14 @@
         </w:tc>
       </w:tr>
       <w:tr>
-        <w:tblPrEx>
-          <w:tblCellMar>
-            <w:top w:w="0" w:type="dxa"/>
-            <w:bottom w:w="0" w:type="dxa"/>
-          </w:tblCellMar>
-        </w:tblPrEx>
         <w:tc>
           <w:tcPr>
             <w:tcW w:w="2200" w:type="dxa"/>
             <w:tcBorders>
-              <w:top w:val="single" w:color="AAAAAA" w:sz="1" w:space="0"/>
-              <w:left w:val="single" w:color="AAAAAA" w:sz="1" w:space="0"/>
-              <w:bottom w:val="single" w:color="AAAAAA" w:sz="1" w:space="0"/>
-              <w:right w:val="single" w:color="AAAAAA" w:sz="1" w:space="0"/>
+              <w:top w:val="single" w:sz="1" w:space="0" w:color="AAAAAA"/>
+              <w:left w:val="single" w:sz="1" w:space="0" w:color="AAAAAA"/>
+              <w:bottom w:val="single" w:sz="1" w:space="0" w:color="AAAAAA"/>
+              <w:right w:val="single" w:sz="1" w:space="0" w:color="AAAAAA"/>
             </w:tcBorders>
             <w:shd w:val="clear" w:color="auto" w:fill="FFFFFF"/>
             <w:tcMar>
@@ -2536,10 +2271,10 @@
           <w:tcPr>
             <w:tcW w:w="3200" w:type="dxa"/>
             <w:tcBorders>
-              <w:top w:val="single" w:color="AAAAAA" w:sz="1" w:space="0"/>
-              <w:left w:val="single" w:color="AAAAAA" w:sz="1" w:space="0"/>
-              <w:bottom w:val="single" w:color="AAAAAA" w:sz="1" w:space="0"/>
-              <w:right w:val="single" w:color="AAAAAA" w:sz="1" w:space="0"/>
+              <w:top w:val="single" w:sz="1" w:space="0" w:color="AAAAAA"/>
+              <w:left w:val="single" w:sz="1" w:space="0" w:color="AAAAAA"/>
+              <w:bottom w:val="single" w:sz="1" w:space="0" w:color="AAAAAA"/>
+              <w:right w:val="single" w:sz="1" w:space="0" w:color="AAAAAA"/>
             </w:tcBorders>
             <w:shd w:val="clear" w:color="auto" w:fill="FFFFFF"/>
             <w:tcMar>
@@ -2555,77 +2290,7 @@
                 <w:sz w:val="22"/>
                 <w:szCs w:val="22"/>
               </w:rPr>
-              <w:t>Preceding token is a Cantonese modal verb (</w:t>
-            </w:r>
-            <w:r>
-              <w:rPr>
-                <w:sz w:val="22"/>
-                <w:szCs w:val="22"/>
-              </w:rPr>
-              <w:t>想</w:t>
-            </w:r>
-            <w:r>
-              <w:rPr>
-                <w:sz w:val="22"/>
-                <w:szCs w:val="22"/>
-              </w:rPr>
-              <w:t xml:space="preserve">, </w:t>
-            </w:r>
-            <w:r>
-              <w:rPr>
-                <w:sz w:val="22"/>
-                <w:szCs w:val="22"/>
-              </w:rPr>
-              <w:t>要</w:t>
-            </w:r>
-            <w:r>
-              <w:rPr>
-                <w:sz w:val="22"/>
-                <w:szCs w:val="22"/>
-              </w:rPr>
-              <w:t xml:space="preserve">, </w:t>
-            </w:r>
-            <w:r>
-              <w:rPr>
-                <w:sz w:val="22"/>
-                <w:szCs w:val="22"/>
-              </w:rPr>
-              <w:t>去</w:t>
-            </w:r>
-            <w:r>
-              <w:rPr>
-                <w:sz w:val="22"/>
-                <w:szCs w:val="22"/>
-              </w:rPr>
-              <w:t xml:space="preserve">, </w:t>
-            </w:r>
-            <w:r>
-              <w:rPr>
-                <w:sz w:val="22"/>
-                <w:szCs w:val="22"/>
-              </w:rPr>
-              <w:t>試</w:t>
-            </w:r>
-            <w:r>
-              <w:rPr>
-                <w:sz w:val="22"/>
-                <w:szCs w:val="22"/>
-              </w:rPr>
-              <w:t xml:space="preserve">, </w:t>
-            </w:r>
-            <w:r>
-              <w:rPr>
-                <w:sz w:val="22"/>
-                <w:szCs w:val="22"/>
-              </w:rPr>
-              <w:t>幫</w:t>
-            </w:r>
-            <w:r>
-              <w:rPr>
-                <w:sz w:val="22"/>
-                <w:szCs w:val="22"/>
-              </w:rPr>
-              <w:t>)</w:t>
+              <w:t>Preceding token is a Cantonese modal verb (想, 要, 去, 試, 幫)</w:t>
             </w:r>
           </w:p>
         </w:tc>
@@ -2633,10 +2298,10 @@
           <w:tcPr>
             <w:tcW w:w="3626" w:type="dxa"/>
             <w:tcBorders>
-              <w:top w:val="single" w:color="AAAAAA" w:sz="1" w:space="0"/>
-              <w:left w:val="single" w:color="AAAAAA" w:sz="1" w:space="0"/>
-              <w:bottom w:val="single" w:color="AAAAAA" w:sz="1" w:space="0"/>
-              <w:right w:val="single" w:color="AAAAAA" w:sz="1" w:space="0"/>
+              <w:top w:val="single" w:sz="1" w:space="0" w:color="AAAAAA"/>
+              <w:left w:val="single" w:sz="1" w:space="0" w:color="AAAAAA"/>
+              <w:bottom w:val="single" w:sz="1" w:space="0" w:color="AAAAAA"/>
+              <w:right w:val="single" w:sz="1" w:space="0" w:color="AAAAAA"/>
             </w:tcBorders>
             <w:shd w:val="clear" w:color="auto" w:fill="FFFFFF"/>
             <w:tcMar>
@@ -2664,20 +2329,14 @@
         </w:tc>
       </w:tr>
       <w:tr>
-        <w:tblPrEx>
-          <w:tblCellMar>
-            <w:top w:w="0" w:type="dxa"/>
-            <w:bottom w:w="0" w:type="dxa"/>
-          </w:tblCellMar>
-        </w:tblPrEx>
         <w:tc>
           <w:tcPr>
             <w:tcW w:w="2200" w:type="dxa"/>
             <w:tcBorders>
-              <w:top w:val="single" w:color="AAAAAA" w:sz="1" w:space="0"/>
-              <w:left w:val="single" w:color="AAAAAA" w:sz="1" w:space="0"/>
-              <w:bottom w:val="single" w:color="AAAAAA" w:sz="1" w:space="0"/>
-              <w:right w:val="single" w:color="AAAAAA" w:sz="1" w:space="0"/>
+              <w:top w:val="single" w:sz="1" w:space="0" w:color="AAAAAA"/>
+              <w:left w:val="single" w:sz="1" w:space="0" w:color="AAAAAA"/>
+              <w:bottom w:val="single" w:sz="1" w:space="0" w:color="AAAAAA"/>
+              <w:right w:val="single" w:sz="1" w:space="0" w:color="AAAAAA"/>
             </w:tcBorders>
             <w:shd w:val="clear" w:color="auto" w:fill="EEF4FB"/>
             <w:tcMar>
@@ -2701,10 +2360,10 @@
           <w:tcPr>
             <w:tcW w:w="3200" w:type="dxa"/>
             <w:tcBorders>
-              <w:top w:val="single" w:color="AAAAAA" w:sz="1" w:space="0"/>
-              <w:left w:val="single" w:color="AAAAAA" w:sz="1" w:space="0"/>
-              <w:bottom w:val="single" w:color="AAAAAA" w:sz="1" w:space="0"/>
-              <w:right w:val="single" w:color="AAAAAA" w:sz="1" w:space="0"/>
+              <w:top w:val="single" w:sz="1" w:space="0" w:color="AAAAAA"/>
+              <w:left w:val="single" w:sz="1" w:space="0" w:color="AAAAAA"/>
+              <w:bottom w:val="single" w:sz="1" w:space="0" w:color="AAAAAA"/>
+              <w:right w:val="single" w:sz="1" w:space="0" w:color="AAAAAA"/>
             </w:tcBorders>
             <w:shd w:val="clear" w:color="auto" w:fill="EEF4FB"/>
             <w:tcMar>
@@ -2720,63 +2379,7 @@
                 <w:sz w:val="22"/>
                 <w:szCs w:val="22"/>
               </w:rPr>
-              <w:t>Following token is a Cantonese aspect marker (</w:t>
-            </w:r>
-            <w:r>
-              <w:rPr>
-                <w:sz w:val="22"/>
-                <w:szCs w:val="22"/>
-              </w:rPr>
-              <w:t>咗</w:t>
-            </w:r>
-            <w:r>
-              <w:rPr>
-                <w:sz w:val="22"/>
-                <w:szCs w:val="22"/>
-              </w:rPr>
-              <w:t xml:space="preserve">, </w:t>
-            </w:r>
-            <w:r>
-              <w:rPr>
-                <w:sz w:val="22"/>
-                <w:szCs w:val="22"/>
-              </w:rPr>
-              <w:t>緊</w:t>
-            </w:r>
-            <w:r>
-              <w:rPr>
-                <w:sz w:val="22"/>
-                <w:szCs w:val="22"/>
-              </w:rPr>
-              <w:t xml:space="preserve">, </w:t>
-            </w:r>
-            <w:r>
-              <w:rPr>
-                <w:sz w:val="22"/>
-                <w:szCs w:val="22"/>
-              </w:rPr>
-              <w:t>過</w:t>
-            </w:r>
-            <w:r>
-              <w:rPr>
-                <w:sz w:val="22"/>
-                <w:szCs w:val="22"/>
-              </w:rPr>
-              <w:t xml:space="preserve">, </w:t>
-            </w:r>
-            <w:r>
-              <w:rPr>
-                <w:sz w:val="22"/>
-                <w:szCs w:val="22"/>
-              </w:rPr>
-              <w:t>完</w:t>
-            </w:r>
-            <w:r>
-              <w:rPr>
-                <w:sz w:val="22"/>
-                <w:szCs w:val="22"/>
-              </w:rPr>
-              <w:t>)</w:t>
+              <w:t>Following token is a Cantonese aspect marker (咗, 緊, 過, 完)</w:t>
             </w:r>
           </w:p>
         </w:tc>
@@ -2784,10 +2387,10 @@
           <w:tcPr>
             <w:tcW w:w="3626" w:type="dxa"/>
             <w:tcBorders>
-              <w:top w:val="single" w:color="AAAAAA" w:sz="1" w:space="0"/>
-              <w:left w:val="single" w:color="AAAAAA" w:sz="1" w:space="0"/>
-              <w:bottom w:val="single" w:color="AAAAAA" w:sz="1" w:space="0"/>
-              <w:right w:val="single" w:color="AAAAAA" w:sz="1" w:space="0"/>
+              <w:top w:val="single" w:sz="1" w:space="0" w:color="AAAAAA"/>
+              <w:left w:val="single" w:sz="1" w:space="0" w:color="AAAAAA"/>
+              <w:bottom w:val="single" w:sz="1" w:space="0" w:color="AAAAAA"/>
+              <w:right w:val="single" w:sz="1" w:space="0" w:color="AAAAAA"/>
             </w:tcBorders>
             <w:shd w:val="clear" w:color="auto" w:fill="EEF4FB"/>
             <w:tcMar>
@@ -2815,20 +2418,14 @@
         </w:tc>
       </w:tr>
       <w:tr>
-        <w:tblPrEx>
-          <w:tblCellMar>
-            <w:top w:w="0" w:type="dxa"/>
-            <w:bottom w:w="0" w:type="dxa"/>
-          </w:tblCellMar>
-        </w:tblPrEx>
         <w:tc>
           <w:tcPr>
             <w:tcW w:w="2200" w:type="dxa"/>
             <w:tcBorders>
-              <w:top w:val="single" w:color="AAAAAA" w:sz="1" w:space="0"/>
-              <w:left w:val="single" w:color="AAAAAA" w:sz="1" w:space="0"/>
-              <w:bottom w:val="single" w:color="AAAAAA" w:sz="1" w:space="0"/>
-              <w:right w:val="single" w:color="AAAAAA" w:sz="1" w:space="0"/>
+              <w:top w:val="single" w:sz="1" w:space="0" w:color="AAAAAA"/>
+              <w:left w:val="single" w:sz="1" w:space="0" w:color="AAAAAA"/>
+              <w:bottom w:val="single" w:sz="1" w:space="0" w:color="AAAAAA"/>
+              <w:right w:val="single" w:sz="1" w:space="0" w:color="AAAAAA"/>
             </w:tcBorders>
             <w:shd w:val="clear" w:color="auto" w:fill="FFFFFF"/>
             <w:tcMar>
@@ -2852,10 +2449,10 @@
           <w:tcPr>
             <w:tcW w:w="3200" w:type="dxa"/>
             <w:tcBorders>
-              <w:top w:val="single" w:color="AAAAAA" w:sz="1" w:space="0"/>
-              <w:left w:val="single" w:color="AAAAAA" w:sz="1" w:space="0"/>
-              <w:bottom w:val="single" w:color="AAAAAA" w:sz="1" w:space="0"/>
-              <w:right w:val="single" w:color="AAAAAA" w:sz="1" w:space="0"/>
+              <w:top w:val="single" w:sz="1" w:space="0" w:color="AAAAAA"/>
+              <w:left w:val="single" w:sz="1" w:space="0" w:color="AAAAAA"/>
+              <w:bottom w:val="single" w:sz="1" w:space="0" w:color="AAAAAA"/>
+              <w:right w:val="single" w:sz="1" w:space="0" w:color="AAAAAA"/>
             </w:tcBorders>
             <w:shd w:val="clear" w:color="auto" w:fill="FFFFFF"/>
             <w:tcMar>
@@ -2871,14 +2468,7 @@
                 <w:sz w:val="22"/>
                 <w:szCs w:val="22"/>
               </w:rPr>
-              <w:t xml:space="preserve">Preceding token is Cantonese intensifier </w:t>
-            </w:r>
-            <w:r>
-              <w:rPr>
-                <w:sz w:val="22"/>
-                <w:szCs w:val="22"/>
-              </w:rPr>
-              <w:t>好</w:t>
+              <w:t>Preceding token is Cantonese intensifier 好</w:t>
             </w:r>
           </w:p>
         </w:tc>
@@ -2886,10 +2476,10 @@
           <w:tcPr>
             <w:tcW w:w="3626" w:type="dxa"/>
             <w:tcBorders>
-              <w:top w:val="single" w:color="AAAAAA" w:sz="1" w:space="0"/>
-              <w:left w:val="single" w:color="AAAAAA" w:sz="1" w:space="0"/>
-              <w:bottom w:val="single" w:color="AAAAAA" w:sz="1" w:space="0"/>
-              <w:right w:val="single" w:color="AAAAAA" w:sz="1" w:space="0"/>
+              <w:top w:val="single" w:sz="1" w:space="0" w:color="AAAAAA"/>
+              <w:left w:val="single" w:sz="1" w:space="0" w:color="AAAAAA"/>
+              <w:bottom w:val="single" w:sz="1" w:space="0" w:color="AAAAAA"/>
+              <w:right w:val="single" w:sz="1" w:space="0" w:color="AAAAAA"/>
             </w:tcBorders>
             <w:shd w:val="clear" w:color="auto" w:fill="FFFFFF"/>
             <w:tcMar>
@@ -2911,20 +2501,14 @@
         </w:tc>
       </w:tr>
       <w:tr>
-        <w:tblPrEx>
-          <w:tblCellMar>
-            <w:top w:w="0" w:type="dxa"/>
-            <w:bottom w:w="0" w:type="dxa"/>
-          </w:tblCellMar>
-        </w:tblPrEx>
         <w:tc>
           <w:tcPr>
             <w:tcW w:w="2200" w:type="dxa"/>
             <w:tcBorders>
-              <w:top w:val="single" w:color="AAAAAA" w:sz="1" w:space="0"/>
-              <w:left w:val="single" w:color="AAAAAA" w:sz="1" w:space="0"/>
-              <w:bottom w:val="single" w:color="AAAAAA" w:sz="1" w:space="0"/>
-              <w:right w:val="single" w:color="AAAAAA" w:sz="1" w:space="0"/>
+              <w:top w:val="single" w:sz="1" w:space="0" w:color="AAAAAA"/>
+              <w:left w:val="single" w:sz="1" w:space="0" w:color="AAAAAA"/>
+              <w:bottom w:val="single" w:sz="1" w:space="0" w:color="AAAAAA"/>
+              <w:right w:val="single" w:sz="1" w:space="0" w:color="AAAAAA"/>
             </w:tcBorders>
             <w:shd w:val="clear" w:color="auto" w:fill="EEF4FB"/>
             <w:tcMar>
@@ -2948,10 +2532,10 @@
           <w:tcPr>
             <w:tcW w:w="3200" w:type="dxa"/>
             <w:tcBorders>
-              <w:top w:val="single" w:color="AAAAAA" w:sz="1" w:space="0"/>
-              <w:left w:val="single" w:color="AAAAAA" w:sz="1" w:space="0"/>
-              <w:bottom w:val="single" w:color="AAAAAA" w:sz="1" w:space="0"/>
-              <w:right w:val="single" w:color="AAAAAA" w:sz="1" w:space="0"/>
+              <w:top w:val="single" w:sz="1" w:space="0" w:color="AAAAAA"/>
+              <w:left w:val="single" w:sz="1" w:space="0" w:color="AAAAAA"/>
+              <w:bottom w:val="single" w:sz="1" w:space="0" w:color="AAAAAA"/>
+              <w:right w:val="single" w:sz="1" w:space="0" w:color="AAAAAA"/>
             </w:tcBorders>
             <w:shd w:val="clear" w:color="auto" w:fill="EEF4FB"/>
             <w:tcMar>
@@ -2967,63 +2551,7 @@
                 <w:sz w:val="22"/>
                 <w:szCs w:val="22"/>
               </w:rPr>
-              <w:t>Following token is a Cantonese classifier (</w:t>
-            </w:r>
-            <w:r>
-              <w:rPr>
-                <w:sz w:val="22"/>
-                <w:szCs w:val="22"/>
-              </w:rPr>
-              <w:t>個</w:t>
-            </w:r>
-            <w:r>
-              <w:rPr>
-                <w:sz w:val="22"/>
-                <w:szCs w:val="22"/>
-              </w:rPr>
-              <w:t xml:space="preserve">, </w:t>
-            </w:r>
-            <w:r>
-              <w:rPr>
-                <w:sz w:val="22"/>
-                <w:szCs w:val="22"/>
-              </w:rPr>
-              <w:t>件</w:t>
-            </w:r>
-            <w:r>
-              <w:rPr>
-                <w:sz w:val="22"/>
-                <w:szCs w:val="22"/>
-              </w:rPr>
-              <w:t xml:space="preserve">, </w:t>
-            </w:r>
-            <w:r>
-              <w:rPr>
-                <w:sz w:val="22"/>
-                <w:szCs w:val="22"/>
-              </w:rPr>
-              <w:t>本</w:t>
-            </w:r>
-            <w:r>
-              <w:rPr>
-                <w:sz w:val="22"/>
-                <w:szCs w:val="22"/>
-              </w:rPr>
-              <w:t xml:space="preserve">, </w:t>
-            </w:r>
-            <w:r>
-              <w:rPr>
-                <w:sz w:val="22"/>
-                <w:szCs w:val="22"/>
-              </w:rPr>
-              <w:t>條</w:t>
-            </w:r>
-            <w:r>
-              <w:rPr>
-                <w:sz w:val="22"/>
-                <w:szCs w:val="22"/>
-              </w:rPr>
-              <w:t>)</w:t>
+              <w:t>Following token is a Cantonese classifier (個, 件, 本, 條)</w:t>
             </w:r>
           </w:p>
         </w:tc>
@@ -3031,10 +2559,10 @@
           <w:tcPr>
             <w:tcW w:w="3626" w:type="dxa"/>
             <w:tcBorders>
-              <w:top w:val="single" w:color="AAAAAA" w:sz="1" w:space="0"/>
-              <w:left w:val="single" w:color="AAAAAA" w:sz="1" w:space="0"/>
-              <w:bottom w:val="single" w:color="AAAAAA" w:sz="1" w:space="0"/>
-              <w:right w:val="single" w:color="AAAAAA" w:sz="1" w:space="0"/>
+              <w:top w:val="single" w:sz="1" w:space="0" w:color="AAAAAA"/>
+              <w:left w:val="single" w:sz="1" w:space="0" w:color="AAAAAA"/>
+              <w:bottom w:val="single" w:sz="1" w:space="0" w:color="AAAAAA"/>
+              <w:right w:val="single" w:sz="1" w:space="0" w:color="AAAAAA"/>
             </w:tcBorders>
             <w:shd w:val="clear" w:color="auto" w:fill="EEF4FB"/>
             <w:tcMar>
@@ -3163,10 +2691,7 @@
       </w:r>
       <w:proofErr w:type="gramEnd"/>
       <w:r>
-        <w:t xml:space="preserve"> dependencies between adjacent output labels and enforces globa</w:t>
-      </w:r>
-      <w:r>
-        <w:t>lly consistent tag sequences.</w:t>
+        <w:t xml:space="preserve"> dependencies between adjacent output labels and enforces globally consistent tag sequences.</w:t>
       </w:r>
     </w:p>
     <w:p>
@@ -3397,10 +2922,7 @@
       </w:r>
       <w:proofErr w:type="spellEnd"/>
       <w:r>
-        <w:t xml:space="preserve"> of each word was re</w:t>
-      </w:r>
-      <w:r>
-        <w:t xml:space="preserve">tained; subsequent </w:t>
+        <w:t xml:space="preserve"> of each word was retained; subsequent </w:t>
       </w:r>
       <w:proofErr w:type="spellStart"/>
       <w:r>
@@ -3584,12 +3106,12 @@
       <w:tblPr>
         <w:tblW w:w="9026" w:type="dxa"/>
         <w:tblBorders>
-          <w:top w:val="single" w:color="auto" w:sz="4" w:space="0"/>
-          <w:left w:val="single" w:color="auto" w:sz="4" w:space="0"/>
-          <w:bottom w:val="single" w:color="auto" w:sz="4" w:space="0"/>
-          <w:right w:val="single" w:color="auto" w:sz="4" w:space="0"/>
-          <w:insideH w:val="single" w:color="auto" w:sz="4" w:space="0"/>
-          <w:insideV w:val="single" w:color="auto" w:sz="4" w:space="0"/>
+          <w:top w:val="single" w:sz="4" w:space="0" w:color="auto"/>
+          <w:left w:val="single" w:sz="4" w:space="0" w:color="auto"/>
+          <w:bottom w:val="single" w:sz="4" w:space="0" w:color="auto"/>
+          <w:right w:val="single" w:sz="4" w:space="0" w:color="auto"/>
+          <w:insideH w:val="single" w:sz="4" w:space="0" w:color="auto"/>
+          <w:insideV w:val="single" w:sz="4" w:space="0" w:color="auto"/>
         </w:tblBorders>
         <w:tblCellMar>
           <w:left w:w="10" w:type="dxa"/>
@@ -3605,12 +3127,6 @@
         <w:gridCol w:w="1607"/>
       </w:tblGrid>
       <w:tr>
-        <w:tblPrEx>
-          <w:tblCellMar>
-            <w:top w:w="0" w:type="dxa"/>
-            <w:bottom w:w="0" w:type="dxa"/>
-          </w:tblCellMar>
-        </w:tblPrEx>
         <w:trPr>
           <w:tblHeader/>
         </w:trPr>
@@ -3618,10 +3134,10 @@
           <w:tcPr>
             <w:tcW w:w="2600" w:type="dxa"/>
             <w:tcBorders>
-              <w:top w:val="single" w:color="AAAAAA" w:sz="1" w:space="0"/>
-              <w:left w:val="single" w:color="AAAAAA" w:sz="1" w:space="0"/>
-              <w:bottom w:val="single" w:color="AAAAAA" w:sz="1" w:space="0"/>
-              <w:right w:val="single" w:color="AAAAAA" w:sz="1" w:space="0"/>
+              <w:top w:val="single" w:sz="1" w:space="0" w:color="AAAAAA"/>
+              <w:left w:val="single" w:sz="1" w:space="0" w:color="AAAAAA"/>
+              <w:bottom w:val="single" w:sz="1" w:space="0" w:color="AAAAAA"/>
+              <w:right w:val="single" w:sz="1" w:space="0" w:color="AAAAAA"/>
             </w:tcBorders>
             <w:shd w:val="clear" w:color="auto" w:fill="2E75B6"/>
             <w:tcMar>
@@ -3652,10 +3168,10 @@
           <w:tcPr>
             <w:tcW w:w="1606" w:type="dxa"/>
             <w:tcBorders>
-              <w:top w:val="single" w:color="AAAAAA" w:sz="1" w:space="0"/>
-              <w:left w:val="single" w:color="AAAAAA" w:sz="1" w:space="0"/>
-              <w:bottom w:val="single" w:color="AAAAAA" w:sz="1" w:space="0"/>
-              <w:right w:val="single" w:color="AAAAAA" w:sz="1" w:space="0"/>
+              <w:top w:val="single" w:sz="1" w:space="0" w:color="AAAAAA"/>
+              <w:left w:val="single" w:sz="1" w:space="0" w:color="AAAAAA"/>
+              <w:bottom w:val="single" w:sz="1" w:space="0" w:color="AAAAAA"/>
+              <w:right w:val="single" w:sz="1" w:space="0" w:color="AAAAAA"/>
             </w:tcBorders>
             <w:shd w:val="clear" w:color="auto" w:fill="2E75B6"/>
             <w:tcMar>
@@ -3686,10 +3202,10 @@
           <w:tcPr>
             <w:tcW w:w="1606" w:type="dxa"/>
             <w:tcBorders>
-              <w:top w:val="single" w:color="AAAAAA" w:sz="1" w:space="0"/>
-              <w:left w:val="single" w:color="AAAAAA" w:sz="1" w:space="0"/>
-              <w:bottom w:val="single" w:color="AAAAAA" w:sz="1" w:space="0"/>
-              <w:right w:val="single" w:color="AAAAAA" w:sz="1" w:space="0"/>
+              <w:top w:val="single" w:sz="1" w:space="0" w:color="AAAAAA"/>
+              <w:left w:val="single" w:sz="1" w:space="0" w:color="AAAAAA"/>
+              <w:bottom w:val="single" w:sz="1" w:space="0" w:color="AAAAAA"/>
+              <w:right w:val="single" w:sz="1" w:space="0" w:color="AAAAAA"/>
             </w:tcBorders>
             <w:shd w:val="clear" w:color="auto" w:fill="2E75B6"/>
             <w:tcMar>
@@ -3720,10 +3236,10 @@
           <w:tcPr>
             <w:tcW w:w="1607" w:type="dxa"/>
             <w:tcBorders>
-              <w:top w:val="single" w:color="AAAAAA" w:sz="1" w:space="0"/>
-              <w:left w:val="single" w:color="AAAAAA" w:sz="1" w:space="0"/>
-              <w:bottom w:val="single" w:color="AAAAAA" w:sz="1" w:space="0"/>
-              <w:right w:val="single" w:color="AAAAAA" w:sz="1" w:space="0"/>
+              <w:top w:val="single" w:sz="1" w:space="0" w:color="AAAAAA"/>
+              <w:left w:val="single" w:sz="1" w:space="0" w:color="AAAAAA"/>
+              <w:bottom w:val="single" w:sz="1" w:space="0" w:color="AAAAAA"/>
+              <w:right w:val="single" w:sz="1" w:space="0" w:color="AAAAAA"/>
             </w:tcBorders>
             <w:shd w:val="clear" w:color="auto" w:fill="2E75B6"/>
             <w:tcMar>
@@ -3754,10 +3270,10 @@
           <w:tcPr>
             <w:tcW w:w="1607" w:type="dxa"/>
             <w:tcBorders>
-              <w:top w:val="single" w:color="AAAAAA" w:sz="1" w:space="0"/>
-              <w:left w:val="single" w:color="AAAAAA" w:sz="1" w:space="0"/>
-              <w:bottom w:val="single" w:color="AAAAAA" w:sz="1" w:space="0"/>
-              <w:right w:val="single" w:color="AAAAAA" w:sz="1" w:space="0"/>
+              <w:top w:val="single" w:sz="1" w:space="0" w:color="AAAAAA"/>
+              <w:left w:val="single" w:sz="1" w:space="0" w:color="AAAAAA"/>
+              <w:bottom w:val="single" w:sz="1" w:space="0" w:color="AAAAAA"/>
+              <w:right w:val="single" w:sz="1" w:space="0" w:color="AAAAAA"/>
             </w:tcBorders>
             <w:shd w:val="clear" w:color="auto" w:fill="2E75B6"/>
             <w:tcMar>
@@ -3786,20 +3302,14 @@
         </w:tc>
       </w:tr>
       <w:tr>
-        <w:tblPrEx>
-          <w:tblCellMar>
-            <w:top w:w="0" w:type="dxa"/>
-            <w:bottom w:w="0" w:type="dxa"/>
-          </w:tblCellMar>
-        </w:tblPrEx>
         <w:tc>
           <w:tcPr>
             <w:tcW w:w="2600" w:type="dxa"/>
             <w:tcBorders>
-              <w:top w:val="single" w:color="AAAAAA" w:sz="1" w:space="0"/>
-              <w:left w:val="single" w:color="AAAAAA" w:sz="1" w:space="0"/>
-              <w:bottom w:val="single" w:color="AAAAAA" w:sz="1" w:space="0"/>
-              <w:right w:val="single" w:color="AAAAAA" w:sz="1" w:space="0"/>
+              <w:top w:val="single" w:sz="1" w:space="0" w:color="AAAAAA"/>
+              <w:left w:val="single" w:sz="1" w:space="0" w:color="AAAAAA"/>
+              <w:bottom w:val="single" w:sz="1" w:space="0" w:color="AAAAAA"/>
+              <w:right w:val="single" w:sz="1" w:space="0" w:color="AAAAAA"/>
             </w:tcBorders>
             <w:shd w:val="clear" w:color="auto" w:fill="FFFFFF"/>
             <w:tcMar>
@@ -3832,10 +3342,10 @@
           <w:tcPr>
             <w:tcW w:w="1606" w:type="dxa"/>
             <w:tcBorders>
-              <w:top w:val="single" w:color="AAAAAA" w:sz="1" w:space="0"/>
-              <w:left w:val="single" w:color="AAAAAA" w:sz="1" w:space="0"/>
-              <w:bottom w:val="single" w:color="AAAAAA" w:sz="1" w:space="0"/>
-              <w:right w:val="single" w:color="AAAAAA" w:sz="1" w:space="0"/>
+              <w:top w:val="single" w:sz="1" w:space="0" w:color="AAAAAA"/>
+              <w:left w:val="single" w:sz="1" w:space="0" w:color="AAAAAA"/>
+              <w:bottom w:val="single" w:sz="1" w:space="0" w:color="AAAAAA"/>
+              <w:right w:val="single" w:sz="1" w:space="0" w:color="AAAAAA"/>
             </w:tcBorders>
             <w:shd w:val="clear" w:color="auto" w:fill="FFFFFF"/>
             <w:tcMar>
@@ -3859,10 +3369,10 @@
           <w:tcPr>
             <w:tcW w:w="1606" w:type="dxa"/>
             <w:tcBorders>
-              <w:top w:val="single" w:color="AAAAAA" w:sz="1" w:space="0"/>
-              <w:left w:val="single" w:color="AAAAAA" w:sz="1" w:space="0"/>
-              <w:bottom w:val="single" w:color="AAAAAA" w:sz="1" w:space="0"/>
-              <w:right w:val="single" w:color="AAAAAA" w:sz="1" w:space="0"/>
+              <w:top w:val="single" w:sz="1" w:space="0" w:color="AAAAAA"/>
+              <w:left w:val="single" w:sz="1" w:space="0" w:color="AAAAAA"/>
+              <w:bottom w:val="single" w:sz="1" w:space="0" w:color="AAAAAA"/>
+              <w:right w:val="single" w:sz="1" w:space="0" w:color="AAAAAA"/>
             </w:tcBorders>
             <w:shd w:val="clear" w:color="auto" w:fill="FFFFFF"/>
             <w:tcMar>
@@ -3886,10 +3396,10 @@
           <w:tcPr>
             <w:tcW w:w="1607" w:type="dxa"/>
             <w:tcBorders>
-              <w:top w:val="single" w:color="AAAAAA" w:sz="1" w:space="0"/>
-              <w:left w:val="single" w:color="AAAAAA" w:sz="1" w:space="0"/>
-              <w:bottom w:val="single" w:color="AAAAAA" w:sz="1" w:space="0"/>
-              <w:right w:val="single" w:color="AAAAAA" w:sz="1" w:space="0"/>
+              <w:top w:val="single" w:sz="1" w:space="0" w:color="AAAAAA"/>
+              <w:left w:val="single" w:sz="1" w:space="0" w:color="AAAAAA"/>
+              <w:bottom w:val="single" w:sz="1" w:space="0" w:color="AAAAAA"/>
+              <w:right w:val="single" w:sz="1" w:space="0" w:color="AAAAAA"/>
             </w:tcBorders>
             <w:shd w:val="clear" w:color="auto" w:fill="FFFFFF"/>
             <w:tcMar>
@@ -3913,10 +3423,10 @@
           <w:tcPr>
             <w:tcW w:w="1607" w:type="dxa"/>
             <w:tcBorders>
-              <w:top w:val="single" w:color="AAAAAA" w:sz="1" w:space="0"/>
-              <w:left w:val="single" w:color="AAAAAA" w:sz="1" w:space="0"/>
-              <w:bottom w:val="single" w:color="AAAAAA" w:sz="1" w:space="0"/>
-              <w:right w:val="single" w:color="AAAAAA" w:sz="1" w:space="0"/>
+              <w:top w:val="single" w:sz="1" w:space="0" w:color="AAAAAA"/>
+              <w:left w:val="single" w:sz="1" w:space="0" w:color="AAAAAA"/>
+              <w:bottom w:val="single" w:sz="1" w:space="0" w:color="AAAAAA"/>
+              <w:right w:val="single" w:sz="1" w:space="0" w:color="AAAAAA"/>
             </w:tcBorders>
             <w:shd w:val="clear" w:color="auto" w:fill="FFFFFF"/>
             <w:tcMar>
@@ -3938,20 +3448,14 @@
         </w:tc>
       </w:tr>
       <w:tr>
-        <w:tblPrEx>
-          <w:tblCellMar>
-            <w:top w:w="0" w:type="dxa"/>
-            <w:bottom w:w="0" w:type="dxa"/>
-          </w:tblCellMar>
-        </w:tblPrEx>
         <w:tc>
           <w:tcPr>
             <w:tcW w:w="2600" w:type="dxa"/>
             <w:tcBorders>
-              <w:top w:val="single" w:color="AAAAAA" w:sz="1" w:space="0"/>
-              <w:left w:val="single" w:color="AAAAAA" w:sz="1" w:space="0"/>
-              <w:bottom w:val="single" w:color="AAAAAA" w:sz="1" w:space="0"/>
-              <w:right w:val="single" w:color="AAAAAA" w:sz="1" w:space="0"/>
+              <w:top w:val="single" w:sz="1" w:space="0" w:color="AAAAAA"/>
+              <w:left w:val="single" w:sz="1" w:space="0" w:color="AAAAAA"/>
+              <w:bottom w:val="single" w:sz="1" w:space="0" w:color="AAAAAA"/>
+              <w:right w:val="single" w:sz="1" w:space="0" w:color="AAAAAA"/>
             </w:tcBorders>
             <w:shd w:val="clear" w:color="auto" w:fill="EEF4FB"/>
             <w:tcMar>
@@ -3975,10 +3479,10 @@
           <w:tcPr>
             <w:tcW w:w="1606" w:type="dxa"/>
             <w:tcBorders>
-              <w:top w:val="single" w:color="AAAAAA" w:sz="1" w:space="0"/>
-              <w:left w:val="single" w:color="AAAAAA" w:sz="1" w:space="0"/>
-              <w:bottom w:val="single" w:color="AAAAAA" w:sz="1" w:space="0"/>
-              <w:right w:val="single" w:color="AAAAAA" w:sz="1" w:space="0"/>
+              <w:top w:val="single" w:sz="1" w:space="0" w:color="AAAAAA"/>
+              <w:left w:val="single" w:sz="1" w:space="0" w:color="AAAAAA"/>
+              <w:bottom w:val="single" w:sz="1" w:space="0" w:color="AAAAAA"/>
+              <w:right w:val="single" w:sz="1" w:space="0" w:color="AAAAAA"/>
             </w:tcBorders>
             <w:shd w:val="clear" w:color="auto" w:fill="EEF4FB"/>
             <w:tcMar>
@@ -4002,10 +3506,10 @@
           <w:tcPr>
             <w:tcW w:w="1606" w:type="dxa"/>
             <w:tcBorders>
-              <w:top w:val="single" w:color="AAAAAA" w:sz="1" w:space="0"/>
-              <w:left w:val="single" w:color="AAAAAA" w:sz="1" w:space="0"/>
-              <w:bottom w:val="single" w:color="AAAAAA" w:sz="1" w:space="0"/>
-              <w:right w:val="single" w:color="AAAAAA" w:sz="1" w:space="0"/>
+              <w:top w:val="single" w:sz="1" w:space="0" w:color="AAAAAA"/>
+              <w:left w:val="single" w:sz="1" w:space="0" w:color="AAAAAA"/>
+              <w:bottom w:val="single" w:sz="1" w:space="0" w:color="AAAAAA"/>
+              <w:right w:val="single" w:sz="1" w:space="0" w:color="AAAAAA"/>
             </w:tcBorders>
             <w:shd w:val="clear" w:color="auto" w:fill="EEF4FB"/>
             <w:tcMar>
@@ -4029,10 +3533,10 @@
           <w:tcPr>
             <w:tcW w:w="1607" w:type="dxa"/>
             <w:tcBorders>
-              <w:top w:val="single" w:color="AAAAAA" w:sz="1" w:space="0"/>
-              <w:left w:val="single" w:color="AAAAAA" w:sz="1" w:space="0"/>
-              <w:bottom w:val="single" w:color="AAAAAA" w:sz="1" w:space="0"/>
-              <w:right w:val="single" w:color="AAAAAA" w:sz="1" w:space="0"/>
+              <w:top w:val="single" w:sz="1" w:space="0" w:color="AAAAAA"/>
+              <w:left w:val="single" w:sz="1" w:space="0" w:color="AAAAAA"/>
+              <w:bottom w:val="single" w:sz="1" w:space="0" w:color="AAAAAA"/>
+              <w:right w:val="single" w:sz="1" w:space="0" w:color="AAAAAA"/>
             </w:tcBorders>
             <w:shd w:val="clear" w:color="auto" w:fill="EEF4FB"/>
             <w:tcMar>
@@ -4056,10 +3560,10 @@
           <w:tcPr>
             <w:tcW w:w="1607" w:type="dxa"/>
             <w:tcBorders>
-              <w:top w:val="single" w:color="AAAAAA" w:sz="1" w:space="0"/>
-              <w:left w:val="single" w:color="AAAAAA" w:sz="1" w:space="0"/>
-              <w:bottom w:val="single" w:color="AAAAAA" w:sz="1" w:space="0"/>
-              <w:right w:val="single" w:color="AAAAAA" w:sz="1" w:space="0"/>
+              <w:top w:val="single" w:sz="1" w:space="0" w:color="AAAAAA"/>
+              <w:left w:val="single" w:sz="1" w:space="0" w:color="AAAAAA"/>
+              <w:bottom w:val="single" w:sz="1" w:space="0" w:color="AAAAAA"/>
+              <w:right w:val="single" w:sz="1" w:space="0" w:color="AAAAAA"/>
             </w:tcBorders>
             <w:shd w:val="clear" w:color="auto" w:fill="EEF4FB"/>
             <w:tcMar>
@@ -4081,20 +3585,14 @@
         </w:tc>
       </w:tr>
       <w:tr>
-        <w:tblPrEx>
-          <w:tblCellMar>
-            <w:top w:w="0" w:type="dxa"/>
-            <w:bottom w:w="0" w:type="dxa"/>
-          </w:tblCellMar>
-        </w:tblPrEx>
         <w:tc>
           <w:tcPr>
             <w:tcW w:w="2600" w:type="dxa"/>
             <w:tcBorders>
-              <w:top w:val="single" w:color="AAAAAA" w:sz="1" w:space="0"/>
-              <w:left w:val="single" w:color="AAAAAA" w:sz="1" w:space="0"/>
-              <w:bottom w:val="single" w:color="AAAAAA" w:sz="1" w:space="0"/>
-              <w:right w:val="single" w:color="AAAAAA" w:sz="1" w:space="0"/>
+              <w:top w:val="single" w:sz="1" w:space="0" w:color="AAAAAA"/>
+              <w:left w:val="single" w:sz="1" w:space="0" w:color="AAAAAA"/>
+              <w:bottom w:val="single" w:sz="1" w:space="0" w:color="AAAAAA"/>
+              <w:right w:val="single" w:sz="1" w:space="0" w:color="AAAAAA"/>
             </w:tcBorders>
             <w:shd w:val="clear" w:color="auto" w:fill="FFFFFF"/>
             <w:tcMar>
@@ -4127,10 +3625,10 @@
           <w:tcPr>
             <w:tcW w:w="1606" w:type="dxa"/>
             <w:tcBorders>
-              <w:top w:val="single" w:color="AAAAAA" w:sz="1" w:space="0"/>
-              <w:left w:val="single" w:color="AAAAAA" w:sz="1" w:space="0"/>
-              <w:bottom w:val="single" w:color="AAAAAA" w:sz="1" w:space="0"/>
-              <w:right w:val="single" w:color="AAAAAA" w:sz="1" w:space="0"/>
+              <w:top w:val="single" w:sz="1" w:space="0" w:color="AAAAAA"/>
+              <w:left w:val="single" w:sz="1" w:space="0" w:color="AAAAAA"/>
+              <w:bottom w:val="single" w:sz="1" w:space="0" w:color="AAAAAA"/>
+              <w:right w:val="single" w:sz="1" w:space="0" w:color="AAAAAA"/>
             </w:tcBorders>
             <w:shd w:val="clear" w:color="auto" w:fill="FFFFFF"/>
             <w:tcMar>
@@ -4154,10 +3652,10 @@
           <w:tcPr>
             <w:tcW w:w="1606" w:type="dxa"/>
             <w:tcBorders>
-              <w:top w:val="single" w:color="AAAAAA" w:sz="1" w:space="0"/>
-              <w:left w:val="single" w:color="AAAAAA" w:sz="1" w:space="0"/>
-              <w:bottom w:val="single" w:color="AAAAAA" w:sz="1" w:space="0"/>
-              <w:right w:val="single" w:color="AAAAAA" w:sz="1" w:space="0"/>
+              <w:top w:val="single" w:sz="1" w:space="0" w:color="AAAAAA"/>
+              <w:left w:val="single" w:sz="1" w:space="0" w:color="AAAAAA"/>
+              <w:bottom w:val="single" w:sz="1" w:space="0" w:color="AAAAAA"/>
+              <w:right w:val="single" w:sz="1" w:space="0" w:color="AAAAAA"/>
             </w:tcBorders>
             <w:shd w:val="clear" w:color="auto" w:fill="FFFFFF"/>
             <w:tcMar>
@@ -4181,10 +3679,10 @@
           <w:tcPr>
             <w:tcW w:w="1607" w:type="dxa"/>
             <w:tcBorders>
-              <w:top w:val="single" w:color="AAAAAA" w:sz="1" w:space="0"/>
-              <w:left w:val="single" w:color="AAAAAA" w:sz="1" w:space="0"/>
-              <w:bottom w:val="single" w:color="AAAAAA" w:sz="1" w:space="0"/>
-              <w:right w:val="single" w:color="AAAAAA" w:sz="1" w:space="0"/>
+              <w:top w:val="single" w:sz="1" w:space="0" w:color="AAAAAA"/>
+              <w:left w:val="single" w:sz="1" w:space="0" w:color="AAAAAA"/>
+              <w:bottom w:val="single" w:sz="1" w:space="0" w:color="AAAAAA"/>
+              <w:right w:val="single" w:sz="1" w:space="0" w:color="AAAAAA"/>
             </w:tcBorders>
             <w:shd w:val="clear" w:color="auto" w:fill="FFFFFF"/>
             <w:tcMar>
@@ -4208,10 +3706,10 @@
           <w:tcPr>
             <w:tcW w:w="1607" w:type="dxa"/>
             <w:tcBorders>
-              <w:top w:val="single" w:color="AAAAAA" w:sz="1" w:space="0"/>
-              <w:left w:val="single" w:color="AAAAAA" w:sz="1" w:space="0"/>
-              <w:bottom w:val="single" w:color="AAAAAA" w:sz="1" w:space="0"/>
-              <w:right w:val="single" w:color="AAAAAA" w:sz="1" w:space="0"/>
+              <w:top w:val="single" w:sz="1" w:space="0" w:color="AAAAAA"/>
+              <w:left w:val="single" w:sz="1" w:space="0" w:color="AAAAAA"/>
+              <w:bottom w:val="single" w:sz="1" w:space="0" w:color="AAAAAA"/>
+              <w:right w:val="single" w:sz="1" w:space="0" w:color="AAAAAA"/>
             </w:tcBorders>
             <w:shd w:val="clear" w:color="auto" w:fill="FFFFFF"/>
             <w:tcMar>
@@ -4233,20 +3731,14 @@
         </w:tc>
       </w:tr>
       <w:tr>
-        <w:tblPrEx>
-          <w:tblCellMar>
-            <w:top w:w="0" w:type="dxa"/>
-            <w:bottom w:w="0" w:type="dxa"/>
-          </w:tblCellMar>
-        </w:tblPrEx>
         <w:tc>
           <w:tcPr>
             <w:tcW w:w="2600" w:type="dxa"/>
             <w:tcBorders>
-              <w:top w:val="single" w:color="AAAAAA" w:sz="1" w:space="0"/>
-              <w:left w:val="single" w:color="AAAAAA" w:sz="1" w:space="0"/>
-              <w:bottom w:val="single" w:color="AAAAAA" w:sz="1" w:space="0"/>
-              <w:right w:val="single" w:color="AAAAAA" w:sz="1" w:space="0"/>
+              <w:top w:val="single" w:sz="1" w:space="0" w:color="AAAAAA"/>
+              <w:left w:val="single" w:sz="1" w:space="0" w:color="AAAAAA"/>
+              <w:bottom w:val="single" w:sz="1" w:space="0" w:color="AAAAAA"/>
+              <w:right w:val="single" w:sz="1" w:space="0" w:color="AAAAAA"/>
             </w:tcBorders>
             <w:shd w:val="clear" w:color="auto" w:fill="EEF4FB"/>
             <w:tcMar>
@@ -4279,10 +3771,10 @@
           <w:tcPr>
             <w:tcW w:w="1606" w:type="dxa"/>
             <w:tcBorders>
-              <w:top w:val="single" w:color="AAAAAA" w:sz="1" w:space="0"/>
-              <w:left w:val="single" w:color="AAAAAA" w:sz="1" w:space="0"/>
-              <w:bottom w:val="single" w:color="AAAAAA" w:sz="1" w:space="0"/>
-              <w:right w:val="single" w:color="AAAAAA" w:sz="1" w:space="0"/>
+              <w:top w:val="single" w:sz="1" w:space="0" w:color="AAAAAA"/>
+              <w:left w:val="single" w:sz="1" w:space="0" w:color="AAAAAA"/>
+              <w:bottom w:val="single" w:sz="1" w:space="0" w:color="AAAAAA"/>
+              <w:right w:val="single" w:sz="1" w:space="0" w:color="AAAAAA"/>
             </w:tcBorders>
             <w:shd w:val="clear" w:color="auto" w:fill="EEF4FB"/>
             <w:tcMar>
@@ -4306,10 +3798,10 @@
           <w:tcPr>
             <w:tcW w:w="1606" w:type="dxa"/>
             <w:tcBorders>
-              <w:top w:val="single" w:color="AAAAAA" w:sz="1" w:space="0"/>
-              <w:left w:val="single" w:color="AAAAAA" w:sz="1" w:space="0"/>
-              <w:bottom w:val="single" w:color="AAAAAA" w:sz="1" w:space="0"/>
-              <w:right w:val="single" w:color="AAAAAA" w:sz="1" w:space="0"/>
+              <w:top w:val="single" w:sz="1" w:space="0" w:color="AAAAAA"/>
+              <w:left w:val="single" w:sz="1" w:space="0" w:color="AAAAAA"/>
+              <w:bottom w:val="single" w:sz="1" w:space="0" w:color="AAAAAA"/>
+              <w:right w:val="single" w:sz="1" w:space="0" w:color="AAAAAA"/>
             </w:tcBorders>
             <w:shd w:val="clear" w:color="auto" w:fill="EEF4FB"/>
             <w:tcMar>
@@ -4333,10 +3825,10 @@
           <w:tcPr>
             <w:tcW w:w="1607" w:type="dxa"/>
             <w:tcBorders>
-              <w:top w:val="single" w:color="AAAAAA" w:sz="1" w:space="0"/>
-              <w:left w:val="single" w:color="AAAAAA" w:sz="1" w:space="0"/>
-              <w:bottom w:val="single" w:color="AAAAAA" w:sz="1" w:space="0"/>
-              <w:right w:val="single" w:color="AAAAAA" w:sz="1" w:space="0"/>
+              <w:top w:val="single" w:sz="1" w:space="0" w:color="AAAAAA"/>
+              <w:left w:val="single" w:sz="1" w:space="0" w:color="AAAAAA"/>
+              <w:bottom w:val="single" w:sz="1" w:space="0" w:color="AAAAAA"/>
+              <w:right w:val="single" w:sz="1" w:space="0" w:color="AAAAAA"/>
             </w:tcBorders>
             <w:shd w:val="clear" w:color="auto" w:fill="EEF4FB"/>
             <w:tcMar>
@@ -4360,10 +3852,10 @@
           <w:tcPr>
             <w:tcW w:w="1607" w:type="dxa"/>
             <w:tcBorders>
-              <w:top w:val="single" w:color="AAAAAA" w:sz="1" w:space="0"/>
-              <w:left w:val="single" w:color="AAAAAA" w:sz="1" w:space="0"/>
-              <w:bottom w:val="single" w:color="AAAAAA" w:sz="1" w:space="0"/>
-              <w:right w:val="single" w:color="AAAAAA" w:sz="1" w:space="0"/>
+              <w:top w:val="single" w:sz="1" w:space="0" w:color="AAAAAA"/>
+              <w:left w:val="single" w:sz="1" w:space="0" w:color="AAAAAA"/>
+              <w:bottom w:val="single" w:sz="1" w:space="0" w:color="AAAAAA"/>
+              <w:right w:val="single" w:sz="1" w:space="0" w:color="AAAAAA"/>
             </w:tcBorders>
             <w:shd w:val="clear" w:color="auto" w:fill="EEF4FB"/>
             <w:tcMar>
@@ -4453,12 +3945,12 @@
       <w:tblPr>
         <w:tblW w:w="9026" w:type="dxa"/>
         <w:tblBorders>
-          <w:top w:val="single" w:color="auto" w:sz="4" w:space="0"/>
-          <w:left w:val="single" w:color="auto" w:sz="4" w:space="0"/>
-          <w:bottom w:val="single" w:color="auto" w:sz="4" w:space="0"/>
-          <w:right w:val="single" w:color="auto" w:sz="4" w:space="0"/>
-          <w:insideH w:val="single" w:color="auto" w:sz="4" w:space="0"/>
-          <w:insideV w:val="single" w:color="auto" w:sz="4" w:space="0"/>
+          <w:top w:val="single" w:sz="4" w:space="0" w:color="auto"/>
+          <w:left w:val="single" w:sz="4" w:space="0" w:color="auto"/>
+          <w:bottom w:val="single" w:sz="4" w:space="0" w:color="auto"/>
+          <w:right w:val="single" w:sz="4" w:space="0" w:color="auto"/>
+          <w:insideH w:val="single" w:sz="4" w:space="0" w:color="auto"/>
+          <w:insideV w:val="single" w:sz="4" w:space="0" w:color="auto"/>
         </w:tblBorders>
         <w:tblCellMar>
           <w:left w:w="10" w:type="dxa"/>
@@ -4475,12 +3967,6 @@
         <w:gridCol w:w="2250"/>
       </w:tblGrid>
       <w:tr>
-        <w:tblPrEx>
-          <w:tblCellMar>
-            <w:top w:w="0" w:type="dxa"/>
-            <w:bottom w:w="0" w:type="dxa"/>
-          </w:tblCellMar>
-        </w:tblPrEx>
         <w:trPr>
           <w:tblHeader/>
         </w:trPr>
@@ -4488,10 +3974,10 @@
           <w:tcPr>
             <w:tcW w:w="2200" w:type="dxa"/>
             <w:tcBorders>
-              <w:top w:val="single" w:color="AAAAAA" w:sz="1" w:space="0"/>
-              <w:left w:val="single" w:color="AAAAAA" w:sz="1" w:space="0"/>
-              <w:bottom w:val="single" w:color="AAAAAA" w:sz="1" w:space="0"/>
-              <w:right w:val="single" w:color="AAAAAA" w:sz="1" w:space="0"/>
+              <w:top w:val="single" w:sz="1" w:space="0" w:color="AAAAAA"/>
+              <w:left w:val="single" w:sz="1" w:space="0" w:color="AAAAAA"/>
+              <w:bottom w:val="single" w:sz="1" w:space="0" w:color="AAAAAA"/>
+              <w:right w:val="single" w:sz="1" w:space="0" w:color="AAAAAA"/>
             </w:tcBorders>
             <w:shd w:val="clear" w:color="auto" w:fill="2E75B6"/>
             <w:tcMar>
@@ -4522,10 +4008,10 @@
           <w:tcPr>
             <w:tcW w:w="900" w:type="dxa"/>
             <w:tcBorders>
-              <w:top w:val="single" w:color="AAAAAA" w:sz="1" w:space="0"/>
-              <w:left w:val="single" w:color="AAAAAA" w:sz="1" w:space="0"/>
-              <w:bottom w:val="single" w:color="AAAAAA" w:sz="1" w:space="0"/>
-              <w:right w:val="single" w:color="AAAAAA" w:sz="1" w:space="0"/>
+              <w:top w:val="single" w:sz="1" w:space="0" w:color="AAAAAA"/>
+              <w:left w:val="single" w:sz="1" w:space="0" w:color="AAAAAA"/>
+              <w:bottom w:val="single" w:sz="1" w:space="0" w:color="AAAAAA"/>
+              <w:right w:val="single" w:sz="1" w:space="0" w:color="AAAAAA"/>
             </w:tcBorders>
             <w:shd w:val="clear" w:color="auto" w:fill="2E75B6"/>
             <w:tcMar>
@@ -4556,10 +4042,10 @@
           <w:tcPr>
             <w:tcW w:w="1100" w:type="dxa"/>
             <w:tcBorders>
-              <w:top w:val="single" w:color="AAAAAA" w:sz="1" w:space="0"/>
-              <w:left w:val="single" w:color="AAAAAA" w:sz="1" w:space="0"/>
-              <w:bottom w:val="single" w:color="AAAAAA" w:sz="1" w:space="0"/>
-              <w:right w:val="single" w:color="AAAAAA" w:sz="1" w:space="0"/>
+              <w:top w:val="single" w:sz="1" w:space="0" w:color="AAAAAA"/>
+              <w:left w:val="single" w:sz="1" w:space="0" w:color="AAAAAA"/>
+              <w:bottom w:val="single" w:sz="1" w:space="0" w:color="AAAAAA"/>
+              <w:right w:val="single" w:sz="1" w:space="0" w:color="AAAAAA"/>
             </w:tcBorders>
             <w:shd w:val="clear" w:color="auto" w:fill="2E75B6"/>
             <w:tcMar>
@@ -4590,10 +4076,10 @@
           <w:tcPr>
             <w:tcW w:w="1300" w:type="dxa"/>
             <w:tcBorders>
-              <w:top w:val="single" w:color="AAAAAA" w:sz="1" w:space="0"/>
-              <w:left w:val="single" w:color="AAAAAA" w:sz="1" w:space="0"/>
-              <w:bottom w:val="single" w:color="AAAAAA" w:sz="1" w:space="0"/>
-              <w:right w:val="single" w:color="AAAAAA" w:sz="1" w:space="0"/>
+              <w:top w:val="single" w:sz="1" w:space="0" w:color="AAAAAA"/>
+              <w:left w:val="single" w:sz="1" w:space="0" w:color="AAAAAA"/>
+              <w:bottom w:val="single" w:sz="1" w:space="0" w:color="AAAAAA"/>
+              <w:right w:val="single" w:sz="1" w:space="0" w:color="AAAAAA"/>
             </w:tcBorders>
             <w:shd w:val="clear" w:color="auto" w:fill="2E75B6"/>
             <w:tcMar>
@@ -4624,10 +4110,10 @@
           <w:tcPr>
             <w:tcW w:w="1276" w:type="dxa"/>
             <w:tcBorders>
-              <w:top w:val="single" w:color="AAAAAA" w:sz="1" w:space="0"/>
-              <w:left w:val="single" w:color="AAAAAA" w:sz="1" w:space="0"/>
-              <w:bottom w:val="single" w:color="AAAAAA" w:sz="1" w:space="0"/>
-              <w:right w:val="single" w:color="AAAAAA" w:sz="1" w:space="0"/>
+              <w:top w:val="single" w:sz="1" w:space="0" w:color="AAAAAA"/>
+              <w:left w:val="single" w:sz="1" w:space="0" w:color="AAAAAA"/>
+              <w:bottom w:val="single" w:sz="1" w:space="0" w:color="AAAAAA"/>
+              <w:right w:val="single" w:sz="1" w:space="0" w:color="AAAAAA"/>
             </w:tcBorders>
             <w:shd w:val="clear" w:color="auto" w:fill="2E75B6"/>
             <w:tcMar>
@@ -4660,10 +4146,10 @@
           <w:tcPr>
             <w:tcW w:w="2250" w:type="dxa"/>
             <w:tcBorders>
-              <w:top w:val="single" w:color="AAAAAA" w:sz="1" w:space="0"/>
-              <w:left w:val="single" w:color="AAAAAA" w:sz="1" w:space="0"/>
-              <w:bottom w:val="single" w:color="AAAAAA" w:sz="1" w:space="0"/>
-              <w:right w:val="single" w:color="AAAAAA" w:sz="1" w:space="0"/>
+              <w:top w:val="single" w:sz="1" w:space="0" w:color="AAAAAA"/>
+              <w:left w:val="single" w:sz="1" w:space="0" w:color="AAAAAA"/>
+              <w:bottom w:val="single" w:sz="1" w:space="0" w:color="AAAAAA"/>
+              <w:right w:val="single" w:sz="1" w:space="0" w:color="AAAAAA"/>
             </w:tcBorders>
             <w:shd w:val="clear" w:color="auto" w:fill="2E75B6"/>
             <w:tcMar>
@@ -4694,20 +4180,14 @@
         </w:tc>
       </w:tr>
       <w:tr>
-        <w:tblPrEx>
-          <w:tblCellMar>
-            <w:top w:w="0" w:type="dxa"/>
-            <w:bottom w:w="0" w:type="dxa"/>
-          </w:tblCellMar>
-        </w:tblPrEx>
         <w:tc>
           <w:tcPr>
             <w:tcW w:w="2200" w:type="dxa"/>
             <w:tcBorders>
-              <w:top w:val="single" w:color="AAAAAA" w:sz="1" w:space="0"/>
-              <w:left w:val="single" w:color="AAAAAA" w:sz="1" w:space="0"/>
-              <w:bottom w:val="single" w:color="AAAAAA" w:sz="1" w:space="0"/>
-              <w:right w:val="single" w:color="AAAAAA" w:sz="1" w:space="0"/>
+              <w:top w:val="single" w:sz="1" w:space="0" w:color="AAAAAA"/>
+              <w:left w:val="single" w:sz="1" w:space="0" w:color="AAAAAA"/>
+              <w:bottom w:val="single" w:sz="1" w:space="0" w:color="AAAAAA"/>
+              <w:right w:val="single" w:sz="1" w:space="0" w:color="AAAAAA"/>
             </w:tcBorders>
             <w:shd w:val="clear" w:color="auto" w:fill="FFFFFF"/>
             <w:tcMar>
@@ -4723,21 +4203,7 @@
                 <w:sz w:val="22"/>
                 <w:szCs w:val="22"/>
               </w:rPr>
-              <w:t>我想</w:t>
-            </w:r>
-            <w:r>
-              <w:rPr>
-                <w:sz w:val="22"/>
-                <w:szCs w:val="22"/>
-              </w:rPr>
-              <w:t xml:space="preserve"> book </w:t>
-            </w:r>
-            <w:r>
-              <w:rPr>
-                <w:sz w:val="22"/>
-                <w:szCs w:val="22"/>
-              </w:rPr>
-              <w:t>個位</w:t>
+              <w:t>我想 book 個位</w:t>
             </w:r>
           </w:p>
         </w:tc>
@@ -4745,10 +4211,10 @@
           <w:tcPr>
             <w:tcW w:w="900" w:type="dxa"/>
             <w:tcBorders>
-              <w:top w:val="single" w:color="AAAAAA" w:sz="1" w:space="0"/>
-              <w:left w:val="single" w:color="AAAAAA" w:sz="1" w:space="0"/>
-              <w:bottom w:val="single" w:color="AAAAAA" w:sz="1" w:space="0"/>
-              <w:right w:val="single" w:color="AAAAAA" w:sz="1" w:space="0"/>
+              <w:top w:val="single" w:sz="1" w:space="0" w:color="AAAAAA"/>
+              <w:left w:val="single" w:sz="1" w:space="0" w:color="AAAAAA"/>
+              <w:bottom w:val="single" w:sz="1" w:space="0" w:color="AAAAAA"/>
+              <w:right w:val="single" w:sz="1" w:space="0" w:color="AAAAAA"/>
             </w:tcBorders>
             <w:shd w:val="clear" w:color="auto" w:fill="FFFFFF"/>
             <w:tcMar>
@@ -4772,10 +4238,10 @@
           <w:tcPr>
             <w:tcW w:w="1100" w:type="dxa"/>
             <w:tcBorders>
-              <w:top w:val="single" w:color="AAAAAA" w:sz="1" w:space="0"/>
-              <w:left w:val="single" w:color="AAAAAA" w:sz="1" w:space="0"/>
-              <w:bottom w:val="single" w:color="AAAAAA" w:sz="1" w:space="0"/>
-              <w:right w:val="single" w:color="AAAAAA" w:sz="1" w:space="0"/>
+              <w:top w:val="single" w:sz="1" w:space="0" w:color="AAAAAA"/>
+              <w:left w:val="single" w:sz="1" w:space="0" w:color="AAAAAA"/>
+              <w:bottom w:val="single" w:sz="1" w:space="0" w:color="AAAAAA"/>
+              <w:right w:val="single" w:sz="1" w:space="0" w:color="AAAAAA"/>
             </w:tcBorders>
             <w:shd w:val="clear" w:color="auto" w:fill="FFFFFF"/>
             <w:tcMar>
@@ -4799,10 +4265,10 @@
           <w:tcPr>
             <w:tcW w:w="1300" w:type="dxa"/>
             <w:tcBorders>
-              <w:top w:val="single" w:color="AAAAAA" w:sz="1" w:space="0"/>
-              <w:left w:val="single" w:color="AAAAAA" w:sz="1" w:space="0"/>
-              <w:bottom w:val="single" w:color="AAAAAA" w:sz="1" w:space="0"/>
-              <w:right w:val="single" w:color="AAAAAA" w:sz="1" w:space="0"/>
+              <w:top w:val="single" w:sz="1" w:space="0" w:color="AAAAAA"/>
+              <w:left w:val="single" w:sz="1" w:space="0" w:color="AAAAAA"/>
+              <w:bottom w:val="single" w:sz="1" w:space="0" w:color="AAAAAA"/>
+              <w:right w:val="single" w:sz="1" w:space="0" w:color="AAAAAA"/>
             </w:tcBorders>
             <w:shd w:val="clear" w:color="auto" w:fill="FFFFFF"/>
             <w:tcMar>
@@ -4826,10 +4292,10 @@
           <w:tcPr>
             <w:tcW w:w="1276" w:type="dxa"/>
             <w:tcBorders>
-              <w:top w:val="single" w:color="AAAAAA" w:sz="1" w:space="0"/>
-              <w:left w:val="single" w:color="AAAAAA" w:sz="1" w:space="0"/>
-              <w:bottom w:val="single" w:color="AAAAAA" w:sz="1" w:space="0"/>
-              <w:right w:val="single" w:color="AAAAAA" w:sz="1" w:space="0"/>
+              <w:top w:val="single" w:sz="1" w:space="0" w:color="AAAAAA"/>
+              <w:left w:val="single" w:sz="1" w:space="0" w:color="AAAAAA"/>
+              <w:bottom w:val="single" w:sz="1" w:space="0" w:color="AAAAAA"/>
+              <w:right w:val="single" w:sz="1" w:space="0" w:color="AAAAAA"/>
             </w:tcBorders>
             <w:shd w:val="clear" w:color="auto" w:fill="FFFFFF"/>
             <w:tcMar>
@@ -4853,10 +4319,10 @@
           <w:tcPr>
             <w:tcW w:w="2250" w:type="dxa"/>
             <w:tcBorders>
-              <w:top w:val="single" w:color="AAAAAA" w:sz="1" w:space="0"/>
-              <w:left w:val="single" w:color="AAAAAA" w:sz="1" w:space="0"/>
-              <w:bottom w:val="single" w:color="AAAAAA" w:sz="1" w:space="0"/>
-              <w:right w:val="single" w:color="AAAAAA" w:sz="1" w:space="0"/>
+              <w:top w:val="single" w:sz="1" w:space="0" w:color="AAAAAA"/>
+              <w:left w:val="single" w:sz="1" w:space="0" w:color="AAAAAA"/>
+              <w:bottom w:val="single" w:sz="1" w:space="0" w:color="AAAAAA"/>
+              <w:right w:val="single" w:sz="1" w:space="0" w:color="AAAAAA"/>
             </w:tcBorders>
             <w:shd w:val="clear" w:color="auto" w:fill="FFFFFF"/>
             <w:tcMar>
@@ -4878,20 +4344,14 @@
         </w:tc>
       </w:tr>
       <w:tr>
-        <w:tblPrEx>
-          <w:tblCellMar>
-            <w:top w:w="0" w:type="dxa"/>
-            <w:bottom w:w="0" w:type="dxa"/>
-          </w:tblCellMar>
-        </w:tblPrEx>
         <w:tc>
           <w:tcPr>
             <w:tcW w:w="2200" w:type="dxa"/>
             <w:tcBorders>
-              <w:top w:val="single" w:color="AAAAAA" w:sz="1" w:space="0"/>
-              <w:left w:val="single" w:color="AAAAAA" w:sz="1" w:space="0"/>
-              <w:bottom w:val="single" w:color="AAAAAA" w:sz="1" w:space="0"/>
-              <w:right w:val="single" w:color="AAAAAA" w:sz="1" w:space="0"/>
+              <w:top w:val="single" w:sz="1" w:space="0" w:color="AAAAAA"/>
+              <w:left w:val="single" w:sz="1" w:space="0" w:color="AAAAAA"/>
+              <w:bottom w:val="single" w:sz="1" w:space="0" w:color="AAAAAA"/>
+              <w:right w:val="single" w:sz="1" w:space="0" w:color="AAAAAA"/>
             </w:tcBorders>
             <w:shd w:val="clear" w:color="auto" w:fill="EEF4FB"/>
             <w:tcMar>
@@ -4907,21 +4367,7 @@
                 <w:sz w:val="22"/>
                 <w:szCs w:val="22"/>
               </w:rPr>
-              <w:t>佢好</w:t>
-            </w:r>
-            <w:r>
-              <w:rPr>
-                <w:sz w:val="22"/>
-                <w:szCs w:val="22"/>
-              </w:rPr>
-              <w:t xml:space="preserve"> pro </w:t>
-            </w:r>
-            <w:r>
-              <w:rPr>
-                <w:sz w:val="22"/>
-                <w:szCs w:val="22"/>
-              </w:rPr>
-              <w:t>㗎</w:t>
+              <w:t>佢好 pro 㗎</w:t>
             </w:r>
           </w:p>
         </w:tc>
@@ -4929,10 +4375,10 @@
           <w:tcPr>
             <w:tcW w:w="900" w:type="dxa"/>
             <w:tcBorders>
-              <w:top w:val="single" w:color="AAAAAA" w:sz="1" w:space="0"/>
-              <w:left w:val="single" w:color="AAAAAA" w:sz="1" w:space="0"/>
-              <w:bottom w:val="single" w:color="AAAAAA" w:sz="1" w:space="0"/>
-              <w:right w:val="single" w:color="AAAAAA" w:sz="1" w:space="0"/>
+              <w:top w:val="single" w:sz="1" w:space="0" w:color="AAAAAA"/>
+              <w:left w:val="single" w:sz="1" w:space="0" w:color="AAAAAA"/>
+              <w:bottom w:val="single" w:sz="1" w:space="0" w:color="AAAAAA"/>
+              <w:right w:val="single" w:sz="1" w:space="0" w:color="AAAAAA"/>
             </w:tcBorders>
             <w:shd w:val="clear" w:color="auto" w:fill="EEF4FB"/>
             <w:tcMar>
@@ -4956,10 +4402,10 @@
           <w:tcPr>
             <w:tcW w:w="1100" w:type="dxa"/>
             <w:tcBorders>
-              <w:top w:val="single" w:color="AAAAAA" w:sz="1" w:space="0"/>
-              <w:left w:val="single" w:color="AAAAAA" w:sz="1" w:space="0"/>
-              <w:bottom w:val="single" w:color="AAAAAA" w:sz="1" w:space="0"/>
-              <w:right w:val="single" w:color="AAAAAA" w:sz="1" w:space="0"/>
+              <w:top w:val="single" w:sz="1" w:space="0" w:color="AAAAAA"/>
+              <w:left w:val="single" w:sz="1" w:space="0" w:color="AAAAAA"/>
+              <w:bottom w:val="single" w:sz="1" w:space="0" w:color="AAAAAA"/>
+              <w:right w:val="single" w:sz="1" w:space="0" w:color="AAAAAA"/>
             </w:tcBorders>
             <w:shd w:val="clear" w:color="auto" w:fill="EEF4FB"/>
             <w:tcMar>
@@ -4983,10 +4429,10 @@
           <w:tcPr>
             <w:tcW w:w="1300" w:type="dxa"/>
             <w:tcBorders>
-              <w:top w:val="single" w:color="AAAAAA" w:sz="1" w:space="0"/>
-              <w:left w:val="single" w:color="AAAAAA" w:sz="1" w:space="0"/>
-              <w:bottom w:val="single" w:color="AAAAAA" w:sz="1" w:space="0"/>
-              <w:right w:val="single" w:color="AAAAAA" w:sz="1" w:space="0"/>
+              <w:top w:val="single" w:sz="1" w:space="0" w:color="AAAAAA"/>
+              <w:left w:val="single" w:sz="1" w:space="0" w:color="AAAAAA"/>
+              <w:bottom w:val="single" w:sz="1" w:space="0" w:color="AAAAAA"/>
+              <w:right w:val="single" w:sz="1" w:space="0" w:color="AAAAAA"/>
             </w:tcBorders>
             <w:shd w:val="clear" w:color="auto" w:fill="EEF4FB"/>
             <w:tcMar>
@@ -5010,10 +4456,10 @@
           <w:tcPr>
             <w:tcW w:w="1276" w:type="dxa"/>
             <w:tcBorders>
-              <w:top w:val="single" w:color="AAAAAA" w:sz="1" w:space="0"/>
-              <w:left w:val="single" w:color="AAAAAA" w:sz="1" w:space="0"/>
-              <w:bottom w:val="single" w:color="AAAAAA" w:sz="1" w:space="0"/>
-              <w:right w:val="single" w:color="AAAAAA" w:sz="1" w:space="0"/>
+              <w:top w:val="single" w:sz="1" w:space="0" w:color="AAAAAA"/>
+              <w:left w:val="single" w:sz="1" w:space="0" w:color="AAAAAA"/>
+              <w:bottom w:val="single" w:sz="1" w:space="0" w:color="AAAAAA"/>
+              <w:right w:val="single" w:sz="1" w:space="0" w:color="AAAAAA"/>
             </w:tcBorders>
             <w:shd w:val="clear" w:color="auto" w:fill="EEF4FB"/>
             <w:tcMar>
@@ -5037,10 +4483,10 @@
           <w:tcPr>
             <w:tcW w:w="2250" w:type="dxa"/>
             <w:tcBorders>
-              <w:top w:val="single" w:color="AAAAAA" w:sz="1" w:space="0"/>
-              <w:left w:val="single" w:color="AAAAAA" w:sz="1" w:space="0"/>
-              <w:bottom w:val="single" w:color="AAAAAA" w:sz="1" w:space="0"/>
-              <w:right w:val="single" w:color="AAAAAA" w:sz="1" w:space="0"/>
+              <w:top w:val="single" w:sz="1" w:space="0" w:color="AAAAAA"/>
+              <w:left w:val="single" w:sz="1" w:space="0" w:color="AAAAAA"/>
+              <w:bottom w:val="single" w:sz="1" w:space="0" w:color="AAAAAA"/>
+              <w:right w:val="single" w:sz="1" w:space="0" w:color="AAAAAA"/>
             </w:tcBorders>
             <w:shd w:val="clear" w:color="auto" w:fill="EEF4FB"/>
             <w:tcMar>
@@ -5062,20 +4508,14 @@
         </w:tc>
       </w:tr>
       <w:tr>
-        <w:tblPrEx>
-          <w:tblCellMar>
-            <w:top w:w="0" w:type="dxa"/>
-            <w:bottom w:w="0" w:type="dxa"/>
-          </w:tblCellMar>
-        </w:tblPrEx>
         <w:tc>
           <w:tcPr>
             <w:tcW w:w="2200" w:type="dxa"/>
             <w:tcBorders>
-              <w:top w:val="single" w:color="AAAAAA" w:sz="1" w:space="0"/>
-              <w:left w:val="single" w:color="AAAAAA" w:sz="1" w:space="0"/>
-              <w:bottom w:val="single" w:color="AAAAAA" w:sz="1" w:space="0"/>
-              <w:right w:val="single" w:color="AAAAAA" w:sz="1" w:space="0"/>
+              <w:top w:val="single" w:sz="1" w:space="0" w:color="AAAAAA"/>
+              <w:left w:val="single" w:sz="1" w:space="0" w:color="AAAAAA"/>
+              <w:bottom w:val="single" w:sz="1" w:space="0" w:color="AAAAAA"/>
+              <w:right w:val="single" w:sz="1" w:space="0" w:color="AAAAAA"/>
             </w:tcBorders>
             <w:shd w:val="clear" w:color="auto" w:fill="FFFFFF"/>
             <w:tcMar>
@@ -5091,21 +4531,7 @@
                 <w:sz w:val="22"/>
                 <w:szCs w:val="22"/>
               </w:rPr>
-              <w:t>我</w:t>
-            </w:r>
-            <w:r>
-              <w:rPr>
-                <w:sz w:val="22"/>
-                <w:szCs w:val="22"/>
-              </w:rPr>
-              <w:t xml:space="preserve"> food </w:t>
-            </w:r>
-            <w:r>
-              <w:rPr>
-                <w:sz w:val="22"/>
-                <w:szCs w:val="22"/>
-              </w:rPr>
-              <w:t>你啦</w:t>
+              <w:t>我 food 你啦</w:t>
             </w:r>
           </w:p>
         </w:tc>
@@ -5113,10 +4539,10 @@
           <w:tcPr>
             <w:tcW w:w="900" w:type="dxa"/>
             <w:tcBorders>
-              <w:top w:val="single" w:color="AAAAAA" w:sz="1" w:space="0"/>
-              <w:left w:val="single" w:color="AAAAAA" w:sz="1" w:space="0"/>
-              <w:bottom w:val="single" w:color="AAAAAA" w:sz="1" w:space="0"/>
-              <w:right w:val="single" w:color="AAAAAA" w:sz="1" w:space="0"/>
+              <w:top w:val="single" w:sz="1" w:space="0" w:color="AAAAAA"/>
+              <w:left w:val="single" w:sz="1" w:space="0" w:color="AAAAAA"/>
+              <w:bottom w:val="single" w:sz="1" w:space="0" w:color="AAAAAA"/>
+              <w:right w:val="single" w:sz="1" w:space="0" w:color="AAAAAA"/>
             </w:tcBorders>
             <w:shd w:val="clear" w:color="auto" w:fill="FFFFFF"/>
             <w:tcMar>
@@ -5140,10 +4566,10 @@
           <w:tcPr>
             <w:tcW w:w="1100" w:type="dxa"/>
             <w:tcBorders>
-              <w:top w:val="single" w:color="AAAAAA" w:sz="1" w:space="0"/>
-              <w:left w:val="single" w:color="AAAAAA" w:sz="1" w:space="0"/>
-              <w:bottom w:val="single" w:color="AAAAAA" w:sz="1" w:space="0"/>
-              <w:right w:val="single" w:color="AAAAAA" w:sz="1" w:space="0"/>
+              <w:top w:val="single" w:sz="1" w:space="0" w:color="AAAAAA"/>
+              <w:left w:val="single" w:sz="1" w:space="0" w:color="AAAAAA"/>
+              <w:bottom w:val="single" w:sz="1" w:space="0" w:color="AAAAAA"/>
+              <w:right w:val="single" w:sz="1" w:space="0" w:color="AAAAAA"/>
             </w:tcBorders>
             <w:shd w:val="clear" w:color="auto" w:fill="FFFFFF"/>
             <w:tcMar>
@@ -5167,10 +4593,10 @@
           <w:tcPr>
             <w:tcW w:w="1300" w:type="dxa"/>
             <w:tcBorders>
-              <w:top w:val="single" w:color="AAAAAA" w:sz="1" w:space="0"/>
-              <w:left w:val="single" w:color="AAAAAA" w:sz="1" w:space="0"/>
-              <w:bottom w:val="single" w:color="AAAAAA" w:sz="1" w:space="0"/>
-              <w:right w:val="single" w:color="AAAAAA" w:sz="1" w:space="0"/>
+              <w:top w:val="single" w:sz="1" w:space="0" w:color="AAAAAA"/>
+              <w:left w:val="single" w:sz="1" w:space="0" w:color="AAAAAA"/>
+              <w:bottom w:val="single" w:sz="1" w:space="0" w:color="AAAAAA"/>
+              <w:right w:val="single" w:sz="1" w:space="0" w:color="AAAAAA"/>
             </w:tcBorders>
             <w:shd w:val="clear" w:color="auto" w:fill="FFFFFF"/>
             <w:tcMar>
@@ -5194,10 +4620,10 @@
           <w:tcPr>
             <w:tcW w:w="1276" w:type="dxa"/>
             <w:tcBorders>
-              <w:top w:val="single" w:color="AAAAAA" w:sz="1" w:space="0"/>
-              <w:left w:val="single" w:color="AAAAAA" w:sz="1" w:space="0"/>
-              <w:bottom w:val="single" w:color="AAAAAA" w:sz="1" w:space="0"/>
-              <w:right w:val="single" w:color="AAAAAA" w:sz="1" w:space="0"/>
+              <w:top w:val="single" w:sz="1" w:space="0" w:color="AAAAAA"/>
+              <w:left w:val="single" w:sz="1" w:space="0" w:color="AAAAAA"/>
+              <w:bottom w:val="single" w:sz="1" w:space="0" w:color="AAAAAA"/>
+              <w:right w:val="single" w:sz="1" w:space="0" w:color="AAAAAA"/>
             </w:tcBorders>
             <w:shd w:val="clear" w:color="auto" w:fill="FFFFFF"/>
             <w:tcMar>
@@ -5221,10 +4647,10 @@
           <w:tcPr>
             <w:tcW w:w="2250" w:type="dxa"/>
             <w:tcBorders>
-              <w:top w:val="single" w:color="AAAAAA" w:sz="1" w:space="0"/>
-              <w:left w:val="single" w:color="AAAAAA" w:sz="1" w:space="0"/>
-              <w:bottom w:val="single" w:color="AAAAAA" w:sz="1" w:space="0"/>
-              <w:right w:val="single" w:color="AAAAAA" w:sz="1" w:space="0"/>
+              <w:top w:val="single" w:sz="1" w:space="0" w:color="AAAAAA"/>
+              <w:left w:val="single" w:sz="1" w:space="0" w:color="AAAAAA"/>
+              <w:bottom w:val="single" w:sz="1" w:space="0" w:color="AAAAAA"/>
+              <w:right w:val="single" w:sz="1" w:space="0" w:color="AAAAAA"/>
             </w:tcBorders>
             <w:shd w:val="clear" w:color="auto" w:fill="FFFFFF"/>
             <w:tcMar>
@@ -5340,10 +4766,7 @@
       </w:r>
       <w:proofErr w:type="spellEnd"/>
       <w:r>
-        <w:t>, and a fine-tuned multiling</w:t>
-      </w:r>
-      <w:r>
-        <w:t>ual BERT model.</w:t>
+        <w:t>, and a fine-tuned multilingual BERT model.</w:t>
       </w:r>
     </w:p>
     <w:p>
@@ -5568,13 +4991,8 @@
         <w:spacing w:before="100" w:after="100"/>
         <w:ind w:left="720" w:hanging="720"/>
       </w:pPr>
-      <w:proofErr w:type="spellStart"/>
-      <w:r>
-        <w:t>Jurafsky</w:t>
-      </w:r>
-      <w:proofErr w:type="spellEnd"/>
-      <w:r>
-        <w:t xml:space="preserve">, D., &amp; Martin, J. H. (2023). </w:t>
+      <w:r>
+        <w:t xml:space="preserve">Jurafsky, D., &amp; Martin, J. H. (2023). </w:t>
       </w:r>
       <w:r>
         <w:rPr>
@@ -5727,7 +5145,7 @@
     <w:sectPr>
       <w:headerReference w:type="default" r:id="rId7"/>
       <w:footerReference w:type="default" r:id="rId8"/>
-      <w:pgSz w:w="11906" w:h="16838" w:orient="portrait"/>
+      <w:pgSz w:w="11906" w:h="16838"/>
       <w:pgMar w:top="1440" w:right="1440" w:bottom="1440" w:left="1440" w:header="708" w:footer="708" w:gutter="0"/>
       <w:cols w:space="720"/>
       <w:docGrid w:linePitch="360"/>
@@ -5838,7 +5256,7 @@
   <w:p>
     <w:pPr>
       <w:pBdr>
-        <w:bottom w:val="single" w:color="CCCCCC" w:sz="2" w:space="4"/>
+        <w:bottom w:val="single" w:sz="2" w:space="4" w:color="CCCCCC"/>
       </w:pBdr>
     </w:pPr>
     <w:r>
@@ -6027,7 +5445,7 @@
   <w:docDefaults>
     <w:rPrDefault>
       <w:rPr>
-        <w:rFonts w:ascii="Arial" w:hAnsi="Arial" w:eastAsia="Arial" w:cs="Arial"/>
+        <w:rFonts w:ascii="Arial" w:eastAsia="Arial" w:hAnsi="Arial" w:cs="Arial"/>
         <w:sz w:val="24"/>
         <w:szCs w:val="24"/>
         <w:lang w:val="en-US" w:eastAsia="zh-CN" w:bidi="ar-SA"/>
@@ -6038,14 +5456,14 @@
   <w:latentStyles w:defLockedState="0" w:defUIPriority="99" w:defSemiHidden="0" w:defUnhideWhenUsed="0" w:defQFormat="0" w:count="376">
     <w:lsdException w:name="Normal" w:uiPriority="0" w:qFormat="1"/>
     <w:lsdException w:name="heading 1" w:uiPriority="9" w:qFormat="1"/>
-    <w:lsdException w:name="heading 2" w:uiPriority="9" w:semiHidden="1" w:unhideWhenUsed="1" w:qFormat="1"/>
-    <w:lsdException w:name="heading 3" w:uiPriority="9" w:semiHidden="1" w:unhideWhenUsed="1" w:qFormat="1"/>
-    <w:lsdException w:name="heading 4" w:uiPriority="9" w:semiHidden="1" w:unhideWhenUsed="1" w:qFormat="1"/>
-    <w:lsdException w:name="heading 5" w:uiPriority="9" w:semiHidden="1" w:unhideWhenUsed="1" w:qFormat="1"/>
-    <w:lsdException w:name="heading 6" w:uiPriority="9" w:semiHidden="1" w:unhideWhenUsed="1" w:qFormat="1"/>
-    <w:lsdException w:name="heading 7" w:uiPriority="9" w:semiHidden="1" w:unhideWhenUsed="1" w:qFormat="1"/>
-    <w:lsdException w:name="heading 8" w:uiPriority="9" w:semiHidden="1" w:unhideWhenUsed="1" w:qFormat="1"/>
-    <w:lsdException w:name="heading 9" w:uiPriority="9" w:semiHidden="1" w:unhideWhenUsed="1" w:qFormat="1"/>
+    <w:lsdException w:name="heading 2" w:semiHidden="1" w:uiPriority="9" w:unhideWhenUsed="1" w:qFormat="1"/>
+    <w:lsdException w:name="heading 3" w:semiHidden="1" w:uiPriority="9" w:unhideWhenUsed="1" w:qFormat="1"/>
+    <w:lsdException w:name="heading 4" w:semiHidden="1" w:uiPriority="9" w:unhideWhenUsed="1" w:qFormat="1"/>
+    <w:lsdException w:name="heading 5" w:semiHidden="1" w:uiPriority="9" w:unhideWhenUsed="1" w:qFormat="1"/>
+    <w:lsdException w:name="heading 6" w:semiHidden="1" w:uiPriority="9" w:unhideWhenUsed="1" w:qFormat="1"/>
+    <w:lsdException w:name="heading 7" w:semiHidden="1" w:uiPriority="9" w:unhideWhenUsed="1" w:qFormat="1"/>
+    <w:lsdException w:name="heading 8" w:semiHidden="1" w:uiPriority="9" w:unhideWhenUsed="1" w:qFormat="1"/>
+    <w:lsdException w:name="heading 9" w:semiHidden="1" w:uiPriority="9" w:unhideWhenUsed="1" w:qFormat="1"/>
     <w:lsdException w:name="index 1" w:semiHidden="1" w:unhideWhenUsed="1"/>
     <w:lsdException w:name="index 2" w:semiHidden="1" w:unhideWhenUsed="1"/>
     <w:lsdException w:name="index 3" w:semiHidden="1" w:unhideWhenUsed="1"/>
@@ -6055,22 +5473,22 @@
     <w:lsdException w:name="index 7" w:semiHidden="1" w:unhideWhenUsed="1"/>
     <w:lsdException w:name="index 8" w:semiHidden="1" w:unhideWhenUsed="1"/>
     <w:lsdException w:name="index 9" w:semiHidden="1" w:unhideWhenUsed="1"/>
-    <w:lsdException w:name="toc 1" w:uiPriority="39" w:semiHidden="1" w:unhideWhenUsed="1"/>
-    <w:lsdException w:name="toc 2" w:uiPriority="39" w:semiHidden="1" w:unhideWhenUsed="1"/>
-    <w:lsdException w:name="toc 3" w:uiPriority="39" w:semiHidden="1" w:unhideWhenUsed="1"/>
-    <w:lsdException w:name="toc 4" w:uiPriority="39" w:semiHidden="1" w:unhideWhenUsed="1"/>
-    <w:lsdException w:name="toc 5" w:uiPriority="39" w:semiHidden="1" w:unhideWhenUsed="1"/>
-    <w:lsdException w:name="toc 6" w:uiPriority="39" w:semiHidden="1" w:unhideWhenUsed="1"/>
-    <w:lsdException w:name="toc 7" w:uiPriority="39" w:semiHidden="1" w:unhideWhenUsed="1"/>
-    <w:lsdException w:name="toc 8" w:uiPriority="39" w:semiHidden="1" w:unhideWhenUsed="1"/>
-    <w:lsdException w:name="toc 9" w:uiPriority="39" w:semiHidden="1" w:unhideWhenUsed="1"/>
+    <w:lsdException w:name="toc 1" w:semiHidden="1" w:uiPriority="39" w:unhideWhenUsed="1"/>
+    <w:lsdException w:name="toc 2" w:semiHidden="1" w:uiPriority="39" w:unhideWhenUsed="1"/>
+    <w:lsdException w:name="toc 3" w:semiHidden="1" w:uiPriority="39" w:unhideWhenUsed="1"/>
+    <w:lsdException w:name="toc 4" w:semiHidden="1" w:uiPriority="39" w:unhideWhenUsed="1"/>
+    <w:lsdException w:name="toc 5" w:semiHidden="1" w:uiPriority="39" w:unhideWhenUsed="1"/>
+    <w:lsdException w:name="toc 6" w:semiHidden="1" w:uiPriority="39" w:unhideWhenUsed="1"/>
+    <w:lsdException w:name="toc 7" w:semiHidden="1" w:uiPriority="39" w:unhideWhenUsed="1"/>
+    <w:lsdException w:name="toc 8" w:semiHidden="1" w:uiPriority="39" w:unhideWhenUsed="1"/>
+    <w:lsdException w:name="toc 9" w:semiHidden="1" w:uiPriority="39" w:unhideWhenUsed="1"/>
     <w:lsdException w:name="Normal Indent" w:semiHidden="1" w:unhideWhenUsed="1"/>
     <w:lsdException w:name="footnote text" w:semiHidden="1" w:unhideWhenUsed="1"/>
     <w:lsdException w:name="annotation text" w:semiHidden="1" w:unhideWhenUsed="1"/>
     <w:lsdException w:name="header" w:semiHidden="1" w:unhideWhenUsed="1"/>
     <w:lsdException w:name="footer" w:semiHidden="1" w:unhideWhenUsed="1"/>
     <w:lsdException w:name="index heading" w:semiHidden="1" w:unhideWhenUsed="1"/>
-    <w:lsdException w:name="caption" w:uiPriority="35" w:semiHidden="1" w:unhideWhenUsed="1" w:qFormat="1"/>
+    <w:lsdException w:name="caption" w:semiHidden="1" w:uiPriority="35" w:unhideWhenUsed="1" w:qFormat="1"/>
     <w:lsdException w:name="table of figures" w:semiHidden="1" w:unhideWhenUsed="1"/>
     <w:lsdException w:name="envelope address" w:semiHidden="1" w:unhideWhenUsed="1"/>
     <w:lsdException w:name="envelope return" w:semiHidden="1" w:unhideWhenUsed="1"/>
@@ -6101,7 +5519,7 @@
     <w:lsdException w:name="Title" w:uiPriority="10" w:qFormat="1"/>
     <w:lsdException w:name="Closing" w:semiHidden="1" w:unhideWhenUsed="1"/>
     <w:lsdException w:name="Signature" w:semiHidden="1" w:unhideWhenUsed="1"/>
-    <w:lsdException w:name="Default Paragraph Font" w:uiPriority="1" w:semiHidden="1" w:unhideWhenUsed="1"/>
+    <w:lsdException w:name="Default Paragraph Font" w:semiHidden="1" w:uiPriority="1" w:unhideWhenUsed="1"/>
     <w:lsdException w:name="Body Text" w:semiHidden="1" w:unhideWhenUsed="1"/>
     <w:lsdException w:name="Body Text Indent" w:semiHidden="1" w:unhideWhenUsed="1"/>
     <w:lsdException w:name="List Continue" w:semiHidden="1" w:unhideWhenUsed="1"/>
@@ -6301,8 +5719,8 @@
     <w:lsdException w:name="Subtle Reference" w:uiPriority="31" w:qFormat="1"/>
     <w:lsdException w:name="Intense Reference" w:uiPriority="32" w:qFormat="1"/>
     <w:lsdException w:name="Book Title" w:uiPriority="33" w:qFormat="1"/>
-    <w:lsdException w:name="Bibliography" w:uiPriority="37" w:semiHidden="1" w:unhideWhenUsed="1"/>
-    <w:lsdException w:name="TOC Heading" w:uiPriority="39" w:semiHidden="1" w:unhideWhenUsed="1" w:qFormat="1"/>
+    <w:lsdException w:name="Bibliography" w:semiHidden="1" w:uiPriority="37" w:unhideWhenUsed="1"/>
+    <w:lsdException w:name="TOC Heading" w:semiHidden="1" w:uiPriority="39" w:unhideWhenUsed="1" w:qFormat="1"/>
     <w:lsdException w:name="Plain Table 1" w:uiPriority="41"/>
     <w:lsdException w:name="Plain Table 2" w:uiPriority="42"/>
     <w:lsdException w:name="Plain Table 3" w:uiPriority="43"/>
@@ -6413,7 +5831,7 @@
     <w:lsdException w:name="Unresolved Mention" w:semiHidden="1" w:unhideWhenUsed="1"/>
     <w:lsdException w:name="Smart Link" w:semiHidden="1" w:unhideWhenUsed="1"/>
   </w:latentStyles>
-  <w:style w:type="paragraph" w:styleId="Normal" w:default="1">
+  <w:style w:type="paragraph" w:default="1" w:styleId="Normal">
     <w:name w:val="Normal"/>
     <w:qFormat/>
   </w:style>
@@ -6423,7 +5841,7 @@
     <w:qFormat/>
     <w:pPr>
       <w:pBdr>
-        <w:bottom w:val="single" w:color="2E75B6" w:sz="4" w:space="4"/>
+        <w:bottom w:val="single" w:sz="4" w:space="4" w:color="2E75B6"/>
       </w:pBdr>
       <w:spacing w:before="360" w:after="200"/>
       <w:outlineLvl w:val="0"/>
@@ -6510,13 +5928,13 @@
       <w:color w:val="1F4D78"/>
     </w:rPr>
   </w:style>
-  <w:style w:type="character" w:styleId="DefaultParagraphFont" w:default="1">
+  <w:style w:type="character" w:default="1" w:styleId="DefaultParagraphFont">
     <w:name w:val="Default Paragraph Font"/>
     <w:uiPriority w:val="1"/>
     <w:semiHidden/>
     <w:unhideWhenUsed/>
   </w:style>
-  <w:style w:type="table" w:styleId="TableNormal" w:default="1">
+  <w:style w:type="table" w:default="1" w:styleId="TableNormal">
     <w:name w:val="Normal Table"/>
     <w:uiPriority w:val="99"/>
     <w:semiHidden/>
@@ -6531,7 +5949,7 @@
       </w:tblCellMar>
     </w:tblPr>
   </w:style>
-  <w:style w:type="numbering" w:styleId="NoList" w:default="1">
+  <w:style w:type="numbering" w:default="1" w:styleId="NoList">
     <w:name w:val="No List"/>
     <w:uiPriority w:val="99"/>
     <w:semiHidden/>
@@ -6546,7 +5964,7 @@
       <w:szCs w:val="56"/>
     </w:rPr>
   </w:style>
-  <w:style w:type="paragraph" w:styleId="Strong1" w:customStyle="1">
+  <w:style w:type="paragraph" w:customStyle="1" w:styleId="Strong1">
     <w:name w:val="Strong1"/>
     <w:qFormat/>
     <w:rPr>
@@ -6587,7 +6005,7 @@
       <w:szCs w:val="20"/>
     </w:rPr>
   </w:style>
-  <w:style w:type="character" w:styleId="FootnoteTextChar" w:customStyle="1">
+  <w:style w:type="character" w:customStyle="1" w:styleId="FootnoteTextChar">
     <w:name w:val="Footnote Text Char"/>
     <w:link w:val="FootnoteText"/>
     <w:uiPriority w:val="99"/>
@@ -6618,7 +6036,7 @@
       <w:szCs w:val="20"/>
     </w:rPr>
   </w:style>
-  <w:style w:type="character" w:styleId="EndnoteTextChar" w:customStyle="1">
+  <w:style w:type="character" w:customStyle="1" w:styleId="EndnoteTextChar">
     <w:name w:val="Endnote Text Char"/>
     <w:link w:val="EndnoteText"/>
     <w:uiPriority w:val="99"/>
@@ -6633,7 +6051,7 @@
 </file>
 
 <file path=word/theme/theme1.xml><?xml version="1.0" encoding="utf-8"?>
-<a:theme xmlns:a="http://schemas.openxmlformats.org/drawingml/2006/main" xmlns:thm15="http://schemas.microsoft.com/office/thememl/2012/main" name="Office Theme">
+<a:theme xmlns:a="http://schemas.openxmlformats.org/drawingml/2006/main" name="Office Theme">
   <a:themeElements>
     <a:clrScheme name="Office">
       <a:dk1>

</xml_diff>

<commit_message>
Step 4c mBERT fine-tune finish
</commit_message>
<xml_diff>
--- a/CBS5502_Group_Report.docx
+++ b/CBS5502_Group_Report.docx
@@ -81,27 +81,7 @@
           <w:sz w:val="32"/>
           <w:szCs w:val="32"/>
         </w:rPr>
-        <w:t xml:space="preserve">POS Tagging Ambiguity of English Words in </w:t>
-      </w:r>
-      <w:proofErr w:type="gramStart"/>
-      <w:r>
-        <w:rPr>
-          <w:b/>
-          <w:bCs/>
-          <w:sz w:val="32"/>
-          <w:szCs w:val="32"/>
-        </w:rPr>
-        <w:t>Cantonese-English</w:t>
-      </w:r>
-      <w:proofErr w:type="gramEnd"/>
-      <w:r>
-        <w:rPr>
-          <w:b/>
-          <w:bCs/>
-          <w:sz w:val="32"/>
-          <w:szCs w:val="32"/>
-        </w:rPr>
-        <w:t xml:space="preserve"> Mixed Text</w:t>
+        <w:t>POS Tagging Ambiguity of English Words in Cantonese-English Mixed Text</w:t>
       </w:r>
     </w:p>
     <w:p>
@@ -150,9 +130,41 @@
         <w:spacing w:before="80" w:after="80"/>
         <w:jc w:val="center"/>
       </w:pPr>
-      <w:proofErr w:type="spellStart"/>
-      <w:r>
-        <w:t>szq</w:t>
+      <w:r>
+        <w:rPr>
+          <w:rFonts w:hint="eastAsia"/>
+        </w:rPr>
+        <w:t xml:space="preserve">Shen </w:t>
+      </w:r>
+      <w:proofErr w:type="spellStart"/>
+      <w:r>
+        <w:rPr>
+          <w:rFonts w:hint="eastAsia"/>
+        </w:rPr>
+        <w:t>Ziqi</w:t>
+      </w:r>
+      <w:proofErr w:type="spellEnd"/>
+      <w:r>
+        <w:t xml:space="preserve"> (Student ID: </w:t>
+      </w:r>
+      <w:r>
+        <w:rPr>
+          <w:rFonts w:hint="eastAsia"/>
+        </w:rPr>
+        <w:t>25054114g</w:t>
+      </w:r>
+      <w:r>
+        <w:t>)</w:t>
+      </w:r>
+    </w:p>
+    <w:p>
+      <w:pPr>
+        <w:spacing w:before="80" w:after="80"/>
+        <w:jc w:val="center"/>
+      </w:pPr>
+      <w:proofErr w:type="spellStart"/>
+      <w:r>
+        <w:t>lyl</w:t>
       </w:r>
       <w:proofErr w:type="spellEnd"/>
       <w:r>
@@ -164,14 +176,28 @@
         <w:spacing w:before="80" w:after="80"/>
         <w:jc w:val="center"/>
       </w:pPr>
-      <w:proofErr w:type="spellStart"/>
-      <w:r>
-        <w:t>lyl</w:t>
-      </w:r>
-      <w:proofErr w:type="spellEnd"/>
-      <w:r>
-        <w:t xml:space="preserve"> (Student ID: XXXXXXXX)</w:t>
-      </w:r>
+      <w:r>
+        <w:t>张千伊</w:t>
+      </w:r>
+      <w:r>
+        <w:t xml:space="preserve"> (Student ID: </w:t>
+      </w:r>
+      <w:r>
+        <w:t>25084698g</w:t>
+      </w:r>
+      <w:r>
+        <w:t>)</w:t>
+      </w:r>
+    </w:p>
+    <w:p>
+      <w:pPr>
+        <w:spacing w:before="80" w:after="80"/>
+      </w:pPr>
+    </w:p>
+    <w:p>
+      <w:pPr>
+        <w:spacing w:before="80" w:after="80"/>
+      </w:pPr>
     </w:p>
     <w:p>
       <w:pPr>
@@ -179,27 +205,8 @@
         <w:jc w:val="center"/>
       </w:pPr>
       <w:r>
-        <w:t>张千伊</w:t>
-      </w:r>
-      <w:r>
-        <w:t xml:space="preserve"> (Student ID: </w:t>
-      </w:r>
-      <w:r>
-        <w:t>25084698g</w:t>
-      </w:r>
-      <w:r>
-        <w:t>)</w:t>
-      </w:r>
-    </w:p>
-    <w:p>
-      <w:pPr>
-        <w:spacing w:before="80" w:after="80"/>
-      </w:pPr>
-    </w:p>
-    <w:p>
-      <w:pPr>
-        <w:spacing w:before="80" w:after="80"/>
-      </w:pPr>
+        <w:t>Semester 2, 2025/2026</w:t>
+      </w:r>
     </w:p>
     <w:p>
       <w:pPr>
@@ -207,15 +214,6 @@
         <w:jc w:val="center"/>
       </w:pPr>
       <w:r>
-        <w:t>Semester 2, 2025/2026</w:t>
-      </w:r>
-    </w:p>
-    <w:p>
-      <w:pPr>
-        <w:spacing w:before="80" w:after="80"/>
-        <w:jc w:val="center"/>
-      </w:pPr>
-      <w:r>
         <w:t>Submission Date: 26 April 2026</w:t>
       </w:r>
     </w:p>
@@ -226,7 +224,7 @@
     </w:p>
     <w:p>
       <w:pPr>
-        <w:pStyle w:val="Heading1"/>
+        <w:pStyle w:val="1"/>
       </w:pPr>
       <w:r>
         <w:lastRenderedPageBreak/>
@@ -386,7 +384,7 @@
     </w:p>
     <w:p>
       <w:pPr>
-        <w:pStyle w:val="Heading1"/>
+        <w:pStyle w:val="1"/>
       </w:pPr>
       <w:r>
         <w:lastRenderedPageBreak/>
@@ -448,7 +446,13 @@
         <w:jc w:val="both"/>
       </w:pPr>
       <w:r>
-        <w:t>Code-switching, the alternation between two or more languages within a single utterance, is a pervasive feature of everyday communication in Hong Kong. Cantonese speakers routinely embed English words into otherwise Cantonese discourse — a phenomenon commonly referred to as Cantonese-English (粵英) mixed speech. While this bilingual practice is natural and unremarkable in spoken and written interaction, it presents significant challenges for Natural Language Processing (NLP) systems that must accurately identify the grammatical role of each word in a sentence.</w:t>
+        <w:t>Code-switching, the alternation between two or more languages within a single utterance, is a pervasive feature of everyday communication in Hong Kong. Cantonese speakers routinely embed English words into otherwise Cantonese discourse — a phenomenon commonly referred to as Cantonese-English (</w:t>
+      </w:r>
+      <w:r>
+        <w:t>粵英</w:t>
+      </w:r>
+      <w:r>
+        <w:t>) mixed speech. While this bilingual practice is natural and unremarkable in spoken and written interaction, it presents significant challenges for Natural Language Processing (NLP) systems that must accurately identify the grammatical role of each word in a sentence.</w:t>
       </w:r>
     </w:p>
     <w:p>
@@ -462,15 +466,7 @@
         <w:jc w:val="both"/>
       </w:pPr>
       <w:r>
-        <w:t xml:space="preserve">The central linguistic ambiguity addressed in this project concerns the part-of-speech (POS) tagging of English words embedded in Cantonese text. In standard English, many words are inherently ambiguous with respect to their grammatical category — the word book, for instance, functions as either a noun (a book on the table) or a verb (to book a table). This ambiguity is compounded in </w:t>
-      </w:r>
-      <w:proofErr w:type="gramStart"/>
-      <w:r>
-        <w:t>Cantonese-English</w:t>
-      </w:r>
-      <w:proofErr w:type="gramEnd"/>
-      <w:r>
-        <w:t xml:space="preserve"> mixed text because the surrounding context is primarily in Cantonese, and existing NLP tools are generally not designed to handle cross-linguistic syntactic environments. The following examples illustrate the ambiguity:</w:t>
+        <w:t>The central linguistic ambiguity addressed in this project concerns the part-of-speech (POS) tagging of English words embedded in Cantonese text. In standard English, many words are inherently ambiguous with respect to their grammatical category — the word book, for instance, functions as either a noun (a book on the table) or a verb (to book a table). This ambiguity is compounded in Cantonese-English mixed text because the surrounding context is primarily in Cantonese, and existing NLP tools are generally not designed to handle cross-linguistic syntactic environments. The following examples illustrate the ambiguity:</w:t>
       </w:r>
     </w:p>
     <w:p>
@@ -631,7 +627,21 @@
                 <w:sz w:val="22"/>
                 <w:szCs w:val="22"/>
               </w:rPr>
-              <w:t>我想 book 個位</w:t>
+              <w:t>我想</w:t>
+            </w:r>
+            <w:r>
+              <w:rPr>
+                <w:sz w:val="22"/>
+                <w:szCs w:val="22"/>
+              </w:rPr>
+              <w:t xml:space="preserve"> book </w:t>
+            </w:r>
+            <w:r>
+              <w:rPr>
+                <w:sz w:val="22"/>
+                <w:szCs w:val="22"/>
+              </w:rPr>
+              <w:t>個位</w:t>
             </w:r>
           </w:p>
         </w:tc>
@@ -714,7 +724,14 @@
                 <w:sz w:val="22"/>
                 <w:szCs w:val="22"/>
               </w:rPr>
-              <w:t>佢睇緊本 book</w:t>
+              <w:t>佢睇緊本</w:t>
+            </w:r>
+            <w:r>
+              <w:rPr>
+                <w:sz w:val="22"/>
+                <w:szCs w:val="22"/>
+              </w:rPr>
+              <w:t xml:space="preserve"> book</w:t>
             </w:r>
           </w:p>
         </w:tc>
@@ -797,7 +814,21 @@
                 <w:sz w:val="22"/>
                 <w:szCs w:val="22"/>
               </w:rPr>
-              <w:t>我去 gym 完先食飯</w:t>
+              <w:t>我去</w:t>
+            </w:r>
+            <w:r>
+              <w:rPr>
+                <w:sz w:val="22"/>
+                <w:szCs w:val="22"/>
+              </w:rPr>
+              <w:t xml:space="preserve"> gym </w:t>
+            </w:r>
+            <w:r>
+              <w:rPr>
+                <w:sz w:val="22"/>
+                <w:szCs w:val="22"/>
+              </w:rPr>
+              <w:t>完先食飯</w:t>
             </w:r>
           </w:p>
         </w:tc>
@@ -880,7 +911,21 @@
                 <w:sz w:val="22"/>
                 <w:szCs w:val="22"/>
               </w:rPr>
-              <w:t>佢好 pro 㗎</w:t>
+              <w:t>佢好</w:t>
+            </w:r>
+            <w:r>
+              <w:rPr>
+                <w:sz w:val="22"/>
+                <w:szCs w:val="22"/>
+              </w:rPr>
+              <w:t xml:space="preserve"> pro </w:t>
+            </w:r>
+            <w:r>
+              <w:rPr>
+                <w:sz w:val="22"/>
+                <w:szCs w:val="22"/>
+              </w:rPr>
+              <w:t>㗎</w:t>
             </w:r>
           </w:p>
         </w:tc>
@@ -963,7 +1008,21 @@
                 <w:sz w:val="22"/>
                 <w:szCs w:val="22"/>
               </w:rPr>
-              <w:t>我 food 你啦</w:t>
+              <w:t>我</w:t>
+            </w:r>
+            <w:r>
+              <w:rPr>
+                <w:sz w:val="22"/>
+                <w:szCs w:val="22"/>
+              </w:rPr>
+              <w:t xml:space="preserve"> food </w:t>
+            </w:r>
+            <w:r>
+              <w:rPr>
+                <w:sz w:val="22"/>
+                <w:szCs w:val="22"/>
+              </w:rPr>
+              <w:t>你啦</w:t>
             </w:r>
           </w:p>
         </w:tc>
@@ -1035,27 +1094,7 @@
           <w:sz w:val="20"/>
           <w:szCs w:val="20"/>
         </w:rPr>
-        <w:t xml:space="preserve">Table 1: Examples of POS ambiguity in </w:t>
-      </w:r>
-      <w:proofErr w:type="gramStart"/>
-      <w:r>
-        <w:rPr>
-          <w:i/>
-          <w:iCs/>
-          <w:sz w:val="20"/>
-          <w:szCs w:val="20"/>
-        </w:rPr>
-        <w:t>Cantonese-English</w:t>
-      </w:r>
-      <w:proofErr w:type="gramEnd"/>
-      <w:r>
-        <w:rPr>
-          <w:i/>
-          <w:iCs/>
-          <w:sz w:val="20"/>
-          <w:szCs w:val="20"/>
-        </w:rPr>
-        <w:t xml:space="preserve"> mixed text.</w:t>
+        <w:t>Table 1: Examples of POS ambiguity in Cantonese-English mixed text.</w:t>
       </w:r>
     </w:p>
     <w:p>
@@ -1069,15 +1108,7 @@
         <w:jc w:val="both"/>
       </w:pPr>
       <w:r>
-        <w:t xml:space="preserve">Resolving this ambiguity is important for a range of downstream NLP applications. In machine translation, misidentifying food as a noun rather than a verb would produce an incorrect translation. In sentiment analysis, the adjective pro carries a positive evaluative meaning that depends on correct POS identification. In information retrieval, accurate tagging is essential for query processing and named entity recognition. Despite its practical importance, POS tagging of English words in </w:t>
-      </w:r>
-      <w:proofErr w:type="gramStart"/>
-      <w:r>
-        <w:t>Cantonese-English</w:t>
-      </w:r>
-      <w:proofErr w:type="gramEnd"/>
-      <w:r>
-        <w:t xml:space="preserve"> code-switching text remains an under-addressed challenge in existing computational linguistics tools.</w:t>
+        <w:t>Resolving this ambiguity is important for a range of downstream NLP applications. In machine translation, misidentifying food as a noun rather than a verb would produce an incorrect translation. In sentiment analysis, the adjective pro carries a positive evaluative meaning that depends on correct POS identification. In information retrieval, accurate tagging is essential for query processing and named entity recognition. Despite its practical importance, POS tagging of English words in Cantonese-English code-switching text remains an under-addressed challenge in existing computational linguistics tools.</w:t>
       </w:r>
     </w:p>
     <w:p>
@@ -1087,7 +1118,7 @@
     </w:p>
     <w:p>
       <w:pPr>
-        <w:pStyle w:val="Heading1"/>
+        <w:pStyle w:val="1"/>
       </w:pPr>
       <w:r>
         <w:lastRenderedPageBreak/>
@@ -1123,7 +1154,7 @@
     </w:p>
     <w:p>
       <w:pPr>
-        <w:pStyle w:val="Heading2"/>
+        <w:pStyle w:val="2"/>
       </w:pPr>
       <w:r>
         <w:t>2.1 Code-Switching and Code-Mixing</w:t>
@@ -1135,23 +1166,7 @@
         <w:jc w:val="both"/>
       </w:pPr>
       <w:r>
-        <w:t xml:space="preserve">Code-switching refers to the practice of alternating between two or more languages within a single conversational </w:t>
-      </w:r>
-      <w:proofErr w:type="gramStart"/>
-      <w:r>
-        <w:t>exchange, and</w:t>
-      </w:r>
-      <w:proofErr w:type="gramEnd"/>
-      <w:r>
-        <w:t xml:space="preserve"> has been extensively studied in sociolinguistics and formal linguistics. In the Hong Kong context, </w:t>
-      </w:r>
-      <w:proofErr w:type="gramStart"/>
-      <w:r>
-        <w:t>Cantonese-English</w:t>
-      </w:r>
-      <w:proofErr w:type="gramEnd"/>
-      <w:r>
-        <w:t xml:space="preserve"> code-switching is particularly prevalent in written discourse, including social media, online forums, and informal messaging. Myers-Scotton's (1993) Matrix Language Frame (MLF) model provides a foundational theoretical framework: one language (in this case, Cantonese) functions as the matrix language that supplies the grammatical structure and morphosyntactic frame of the utterance, while the other language (English) supplies embedded content words that are inserted into that frame.</w:t>
+        <w:t>Code-switching refers to the practice of alternating between two or more languages within a single conversational exchange, and has been extensively studied in sociolinguistics and formal linguistics. In the Hong Kong context, Cantonese-English code-switching is particularly prevalent in written discourse, including social media, online forums, and informal messaging. Myers-Scotton's (1993) Matrix Language Frame (MLF) model provides a foundational theoretical framework: one language (in this case, Cantonese) functions as the matrix language that supplies the grammatical structure and morphosyntactic frame of the utterance, while the other language (English) supplies embedded content words that are inserted into that frame.</w:t>
       </w:r>
     </w:p>
     <w:p>
@@ -1165,17 +1180,29 @@
         <w:jc w:val="both"/>
       </w:pPr>
       <w:r>
-        <w:t>This distinction is linguistically significant because it implies that the grammatical role of an embedded English word is determined not by English syntax alone, but by the syntactic position it occupies within the Cantonese matrix frame. The English word gym in 我去 gym 完先食飯 occupies an object noun position defined by Cantonese syntax, making its POS assignment a function of Cantonese grammar rather than English convention.</w:t>
-      </w:r>
-    </w:p>
-    <w:p>
-      <w:pPr>
-        <w:spacing w:before="80" w:after="80"/>
-      </w:pPr>
-    </w:p>
-    <w:p>
-      <w:pPr>
-        <w:pStyle w:val="Heading2"/>
+        <w:t xml:space="preserve">This distinction is linguistically significant because it implies that the grammatical role of an embedded English word is determined not by English syntax alone, but by the syntactic position it occupies within the Cantonese matrix frame. The English word gym in </w:t>
+      </w:r>
+      <w:r>
+        <w:t>我去</w:t>
+      </w:r>
+      <w:r>
+        <w:t xml:space="preserve"> gym </w:t>
+      </w:r>
+      <w:r>
+        <w:t>完先食飯</w:t>
+      </w:r>
+      <w:r>
+        <w:t xml:space="preserve"> occupies an object noun position defined by Cantonese syntax, making its POS assignment a function of Cantonese grammar rather than English convention.</w:t>
+      </w:r>
+    </w:p>
+    <w:p>
+      <w:pPr>
+        <w:spacing w:before="80" w:after="80"/>
+      </w:pPr>
+    </w:p>
+    <w:p>
+      <w:pPr>
+        <w:pStyle w:val="2"/>
       </w:pPr>
       <w:r>
         <w:t>2.2 Part-of-Speech Ambiguity</w:t>
@@ -1187,28 +1214,44 @@
         <w:jc w:val="both"/>
       </w:pPr>
       <w:r>
-        <w:t>Part-of-speech ambiguity arises when a single word form can belong to more than one lexical category depending on its syntactic context. This is a well-documented phenomenon in English, where conversion (also known as zero-derivation) allows words to shift grammatical category without morphological change. The word book, for instance, belongs to the categories noun and verb with no surface-level distinction. In Cantonese-English mixed text, such ambiguity is exacerbated because the disambiguation cues provided by the surrounding Cantonese words — aspect markers such as 咗 (perfective) or 緊 (progressive), modal verbs such as 想 (want to) or 要 (need to), and classifier constructions — are written in Chinese characters and are largely invisible to English-only NLP taggers.</w:t>
-      </w:r>
-    </w:p>
-    <w:p>
-      <w:pPr>
-        <w:spacing w:before="80" w:after="80"/>
-      </w:pPr>
-    </w:p>
-    <w:p>
-      <w:pPr>
-        <w:pStyle w:val="Heading2"/>
-      </w:pPr>
-      <w:r>
-        <w:t xml:space="preserve">2.3 Challenges Specific to </w:t>
-      </w:r>
-      <w:proofErr w:type="gramStart"/>
-      <w:r>
-        <w:t>Cantonese-English</w:t>
-      </w:r>
-      <w:proofErr w:type="gramEnd"/>
-      <w:r>
-        <w:t xml:space="preserve"> Mixed Text</w:t>
+        <w:t xml:space="preserve">Part-of-speech ambiguity arises when a single word form can belong to more than one lexical category depending on its syntactic context. This is a well-documented phenomenon in English, where conversion (also known as zero-derivation) allows words to shift grammatical category without morphological change. The word book, for instance, belongs to the categories noun and verb with no surface-level distinction. In Cantonese-English mixed text, such ambiguity is exacerbated because the disambiguation cues provided by the surrounding Cantonese words — aspect markers such as </w:t>
+      </w:r>
+      <w:r>
+        <w:t>咗</w:t>
+      </w:r>
+      <w:r>
+        <w:t xml:space="preserve"> (perfective) or </w:t>
+      </w:r>
+      <w:r>
+        <w:t>緊</w:t>
+      </w:r>
+      <w:r>
+        <w:t xml:space="preserve"> (progressive), modal verbs such as </w:t>
+      </w:r>
+      <w:r>
+        <w:t>想</w:t>
+      </w:r>
+      <w:r>
+        <w:t xml:space="preserve"> (want to) or </w:t>
+      </w:r>
+      <w:r>
+        <w:t>要</w:t>
+      </w:r>
+      <w:r>
+        <w:t xml:space="preserve"> (need to), and classifier constructions — are written in Chinese characters and are largely invisible to English-only NLP taggers.</w:t>
+      </w:r>
+    </w:p>
+    <w:p>
+      <w:pPr>
+        <w:spacing w:before="80" w:after="80"/>
+      </w:pPr>
+    </w:p>
+    <w:p>
+      <w:pPr>
+        <w:pStyle w:val="2"/>
+      </w:pPr>
+      <w:r>
+        <w:t>2.3 Challenges Specific to Cantonese-English Mixed Text</w:t>
       </w:r>
     </w:p>
     <w:p>
@@ -1217,11 +1260,53 @@
         <w:jc w:val="both"/>
       </w:pPr>
       <w:r>
-        <w:t xml:space="preserve">Cantonese presents several language-specific characteristics that complicate POS tagging in a mixed-language environment. First, Cantonese is an aspect-prominent language: verb form does not change morphologically, and aspect is marked by post-verbal particles (e.g., 咗, 過, 緊). An English verb embedded before such a particle can be disambiguated as a verb by its position, but this requires cross-linguistic syntactic awareness. Second, Cantonese exhibits productive noun-to-verb conversion of English loanwords — food (食物) becomes food (請食飯) through semantic extension — which has no parallel in standard English usage and is therefore not captured by English lexicons. Third, Cantonese-specific intensifiers and evaluative </w:t>
+        <w:t xml:space="preserve">Cantonese presents several language-specific characteristics that complicate POS tagging in a mixed-language environment. First, Cantonese is an aspect-prominent language: verb form does not change morphologically, and aspect is marked by post-verbal particles (e.g., </w:t>
+      </w:r>
+      <w:r>
+        <w:t>咗</w:t>
+      </w:r>
+      <w:r>
+        <w:t xml:space="preserve">, </w:t>
+      </w:r>
+      <w:r>
+        <w:t>過</w:t>
+      </w:r>
+      <w:r>
+        <w:t xml:space="preserve">, </w:t>
+      </w:r>
+      <w:r>
+        <w:t>緊</w:t>
+      </w:r>
+      <w:r>
+        <w:t>). An English verb embedded before such a particle can be disambiguated as a verb by its position, but this requires cross-linguistic syntactic awareness. Second, Cantonese exhibits productive noun-to-verb conversion of English loanwords — food (</w:t>
+      </w:r>
+      <w:r>
+        <w:t>食物</w:t>
+      </w:r>
+      <w:r>
+        <w:t>) becomes food (</w:t>
+      </w:r>
+      <w:r>
+        <w:t>請食飯</w:t>
+      </w:r>
+      <w:r>
+        <w:t xml:space="preserve">) through semantic extension — which has no parallel in standard English usage and is therefore not captured by English lexicons. Third, Cantonese-specific intensifiers and evaluative </w:t>
       </w:r>
       <w:r>
         <w:lastRenderedPageBreak/>
-        <w:t>particles (e.g., 好 preceding an adjective, 㗎 sentence-final) provide strong disambiguation cues that require understanding of Cantonese grammar to exploit.</w:t>
+        <w:t xml:space="preserve">particles (e.g., </w:t>
+      </w:r>
+      <w:r>
+        <w:t>好</w:t>
+      </w:r>
+      <w:r>
+        <w:t xml:space="preserve"> preceding an adjective, </w:t>
+      </w:r>
+      <w:r>
+        <w:t>㗎</w:t>
+      </w:r>
+      <w:r>
+        <w:t xml:space="preserve"> sentence-final) provide strong disambiguation cues that require understanding of Cantonese grammar to exploit.</w:t>
       </w:r>
     </w:p>
     <w:p>
@@ -1245,7 +1330,7 @@
     </w:p>
     <w:p>
       <w:pPr>
-        <w:pStyle w:val="Heading1"/>
+        <w:pStyle w:val="1"/>
       </w:pPr>
       <w:r>
         <w:lastRenderedPageBreak/>
@@ -1303,7 +1388,7 @@
     </w:p>
     <w:p>
       <w:pPr>
-        <w:pStyle w:val="Heading2"/>
+        <w:pStyle w:val="2"/>
       </w:pPr>
       <w:r>
         <w:t>3.1 Data Collection</w:t>
@@ -1315,7 +1400,13 @@
         <w:jc w:val="both"/>
       </w:pPr>
       <w:r>
-        <w:t xml:space="preserve">A dataset of 300 Cantonese-English mixed sentences was compiled from publicly available online sources, including LIHKG (連登討論區), YouTube comment sections of Cantonese-language content creators, and Hong Kong-specific posts on </w:t>
+        <w:t>A dataset of 300 Cantonese-English mixed sentences was compiled from publicly available online sources, including LIHKG (</w:t>
+      </w:r>
+      <w:r>
+        <w:t>連登討論區</w:t>
+      </w:r>
+      <w:r>
+        <w:t xml:space="preserve">), YouTube comment sections of Cantonese-language content creators, and Hong Kong-specific posts on </w:t>
       </w:r>
       <w:proofErr w:type="spellStart"/>
       <w:r>
@@ -1323,7 +1414,13 @@
       </w:r>
       <w:proofErr w:type="spellEnd"/>
       <w:r>
-        <w:t xml:space="preserve"> (小紅書). Sentences were selected according to the following criteria: (1) the sentence must contain at least one English word embedded within an otherwise Cantonese utterance; (2) purely English or purely Cantonese sentences were excluded; (3) sentences must be grammatically interpretable and not consist solely of hashtags or emoji. Data collection was led by </w:t>
+        <w:t xml:space="preserve"> (</w:t>
+      </w:r>
+      <w:r>
+        <w:t>小紅書</w:t>
+      </w:r>
+      <w:r>
+        <w:t xml:space="preserve">). Sentences were selected according to the following criteria: (1) the sentence must contain at least one English word embedded within an otherwise Cantonese utterance; (2) purely English or purely Cantonese sentences were excluded; (3) sentences must be grammatically interpretable and not consist solely of hashtags or emoji. Data collection was led by </w:t>
       </w:r>
       <w:proofErr w:type="spellStart"/>
       <w:r>
@@ -1341,7 +1438,7 @@
     </w:p>
     <w:p>
       <w:pPr>
-        <w:pStyle w:val="Heading2"/>
+        <w:pStyle w:val="2"/>
       </w:pPr>
       <w:r>
         <w:t>3.2 Annotation Procedure</w:t>
@@ -1446,7 +1543,7 @@
     </w:p>
     <w:p>
       <w:pPr>
-        <w:pStyle w:val="Heading2"/>
+        <w:pStyle w:val="2"/>
       </w:pPr>
       <w:r>
         <w:t>3.3 Dataset Statistics</w:t>
@@ -1905,7 +2002,7 @@
     </w:p>
     <w:p>
       <w:pPr>
-        <w:pStyle w:val="Heading1"/>
+        <w:pStyle w:val="1"/>
       </w:pPr>
       <w:r>
         <w:lastRenderedPageBreak/>
@@ -1914,7 +2011,7 @@
     </w:p>
     <w:p>
       <w:pPr>
-        <w:pStyle w:val="Heading2"/>
+        <w:pStyle w:val="2"/>
       </w:pPr>
       <w:r>
         <w:t xml:space="preserve">4.1 </w:t>
@@ -2007,15 +2104,7 @@
         <w:jc w:val="both"/>
       </w:pPr>
       <w:r>
-        <w:t xml:space="preserve">The primary limitation of this approach in the context of </w:t>
-      </w:r>
-      <w:proofErr w:type="gramStart"/>
-      <w:r>
-        <w:t>Cantonese-English</w:t>
-      </w:r>
-      <w:proofErr w:type="gramEnd"/>
-      <w:r>
-        <w:t xml:space="preserve"> code-switching is that </w:t>
+        <w:t xml:space="preserve">The primary limitation of this approach in the context of Cantonese-English code-switching is that </w:t>
       </w:r>
       <w:proofErr w:type="spellStart"/>
       <w:r>
@@ -2041,7 +2130,7 @@
     </w:p>
     <w:p>
       <w:pPr>
-        <w:pStyle w:val="Heading2"/>
+        <w:pStyle w:val="2"/>
       </w:pPr>
       <w:r>
         <w:t>4.2 Rule-based Disambiguation</w:t>
@@ -2290,7 +2379,77 @@
                 <w:sz w:val="22"/>
                 <w:szCs w:val="22"/>
               </w:rPr>
-              <w:t>Preceding token is a Cantonese modal verb (想, 要, 去, 試, 幫)</w:t>
+              <w:t>Preceding token is a Cantonese modal verb (</w:t>
+            </w:r>
+            <w:r>
+              <w:rPr>
+                <w:sz w:val="22"/>
+                <w:szCs w:val="22"/>
+              </w:rPr>
+              <w:t>想</w:t>
+            </w:r>
+            <w:r>
+              <w:rPr>
+                <w:sz w:val="22"/>
+                <w:szCs w:val="22"/>
+              </w:rPr>
+              <w:t xml:space="preserve">, </w:t>
+            </w:r>
+            <w:r>
+              <w:rPr>
+                <w:sz w:val="22"/>
+                <w:szCs w:val="22"/>
+              </w:rPr>
+              <w:t>要</w:t>
+            </w:r>
+            <w:r>
+              <w:rPr>
+                <w:sz w:val="22"/>
+                <w:szCs w:val="22"/>
+              </w:rPr>
+              <w:t xml:space="preserve">, </w:t>
+            </w:r>
+            <w:r>
+              <w:rPr>
+                <w:sz w:val="22"/>
+                <w:szCs w:val="22"/>
+              </w:rPr>
+              <w:t>去</w:t>
+            </w:r>
+            <w:r>
+              <w:rPr>
+                <w:sz w:val="22"/>
+                <w:szCs w:val="22"/>
+              </w:rPr>
+              <w:t xml:space="preserve">, </w:t>
+            </w:r>
+            <w:r>
+              <w:rPr>
+                <w:sz w:val="22"/>
+                <w:szCs w:val="22"/>
+              </w:rPr>
+              <w:t>試</w:t>
+            </w:r>
+            <w:r>
+              <w:rPr>
+                <w:sz w:val="22"/>
+                <w:szCs w:val="22"/>
+              </w:rPr>
+              <w:t xml:space="preserve">, </w:t>
+            </w:r>
+            <w:r>
+              <w:rPr>
+                <w:sz w:val="22"/>
+                <w:szCs w:val="22"/>
+              </w:rPr>
+              <w:t>幫</w:t>
+            </w:r>
+            <w:r>
+              <w:rPr>
+                <w:sz w:val="22"/>
+                <w:szCs w:val="22"/>
+              </w:rPr>
+              <w:t>)</w:t>
             </w:r>
           </w:p>
         </w:tc>
@@ -2379,7 +2538,63 @@
                 <w:sz w:val="22"/>
                 <w:szCs w:val="22"/>
               </w:rPr>
-              <w:t>Following token is a Cantonese aspect marker (咗, 緊, 過, 完)</w:t>
+              <w:t>Following token is a Cantonese aspect marker (</w:t>
+            </w:r>
+            <w:r>
+              <w:rPr>
+                <w:sz w:val="22"/>
+                <w:szCs w:val="22"/>
+              </w:rPr>
+              <w:t>咗</w:t>
+            </w:r>
+            <w:r>
+              <w:rPr>
+                <w:sz w:val="22"/>
+                <w:szCs w:val="22"/>
+              </w:rPr>
+              <w:t xml:space="preserve">, </w:t>
+            </w:r>
+            <w:r>
+              <w:rPr>
+                <w:sz w:val="22"/>
+                <w:szCs w:val="22"/>
+              </w:rPr>
+              <w:t>緊</w:t>
+            </w:r>
+            <w:r>
+              <w:rPr>
+                <w:sz w:val="22"/>
+                <w:szCs w:val="22"/>
+              </w:rPr>
+              <w:t xml:space="preserve">, </w:t>
+            </w:r>
+            <w:r>
+              <w:rPr>
+                <w:sz w:val="22"/>
+                <w:szCs w:val="22"/>
+              </w:rPr>
+              <w:t>過</w:t>
+            </w:r>
+            <w:r>
+              <w:rPr>
+                <w:sz w:val="22"/>
+                <w:szCs w:val="22"/>
+              </w:rPr>
+              <w:t xml:space="preserve">, </w:t>
+            </w:r>
+            <w:r>
+              <w:rPr>
+                <w:sz w:val="22"/>
+                <w:szCs w:val="22"/>
+              </w:rPr>
+              <w:t>完</w:t>
+            </w:r>
+            <w:r>
+              <w:rPr>
+                <w:sz w:val="22"/>
+                <w:szCs w:val="22"/>
+              </w:rPr>
+              <w:t>)</w:t>
             </w:r>
           </w:p>
         </w:tc>
@@ -2468,7 +2683,14 @@
                 <w:sz w:val="22"/>
                 <w:szCs w:val="22"/>
               </w:rPr>
-              <w:t>Preceding token is Cantonese intensifier 好</w:t>
+              <w:t xml:space="preserve">Preceding token is Cantonese intensifier </w:t>
+            </w:r>
+            <w:r>
+              <w:rPr>
+                <w:sz w:val="22"/>
+                <w:szCs w:val="22"/>
+              </w:rPr>
+              <w:t>好</w:t>
             </w:r>
           </w:p>
         </w:tc>
@@ -2551,7 +2773,63 @@
                 <w:sz w:val="22"/>
                 <w:szCs w:val="22"/>
               </w:rPr>
-              <w:t>Following token is a Cantonese classifier (個, 件, 本, 條)</w:t>
+              <w:t>Following token is a Cantonese classifier (</w:t>
+            </w:r>
+            <w:r>
+              <w:rPr>
+                <w:sz w:val="22"/>
+                <w:szCs w:val="22"/>
+              </w:rPr>
+              <w:t>個</w:t>
+            </w:r>
+            <w:r>
+              <w:rPr>
+                <w:sz w:val="22"/>
+                <w:szCs w:val="22"/>
+              </w:rPr>
+              <w:t xml:space="preserve">, </w:t>
+            </w:r>
+            <w:r>
+              <w:rPr>
+                <w:sz w:val="22"/>
+                <w:szCs w:val="22"/>
+              </w:rPr>
+              <w:t>件</w:t>
+            </w:r>
+            <w:r>
+              <w:rPr>
+                <w:sz w:val="22"/>
+                <w:szCs w:val="22"/>
+              </w:rPr>
+              <w:t xml:space="preserve">, </w:t>
+            </w:r>
+            <w:r>
+              <w:rPr>
+                <w:sz w:val="22"/>
+                <w:szCs w:val="22"/>
+              </w:rPr>
+              <w:t>本</w:t>
+            </w:r>
+            <w:r>
+              <w:rPr>
+                <w:sz w:val="22"/>
+                <w:szCs w:val="22"/>
+              </w:rPr>
+              <w:t xml:space="preserve">, </w:t>
+            </w:r>
+            <w:r>
+              <w:rPr>
+                <w:sz w:val="22"/>
+                <w:szCs w:val="22"/>
+              </w:rPr>
+              <w:t>條</w:t>
+            </w:r>
+            <w:r>
+              <w:rPr>
+                <w:sz w:val="22"/>
+                <w:szCs w:val="22"/>
+              </w:rPr>
+              <w:t>)</w:t>
             </w:r>
           </w:p>
         </w:tc>
@@ -2620,7 +2898,7 @@
     </w:p>
     <w:p>
       <w:pPr>
-        <w:pStyle w:val="Heading2"/>
+        <w:pStyle w:val="2"/>
       </w:pPr>
       <w:r>
         <w:t xml:space="preserve">4.3 </w:t>
@@ -2777,7 +3055,7 @@
     </w:p>
     <w:p>
       <w:pPr>
-        <w:pStyle w:val="Heading2"/>
+        <w:pStyle w:val="2"/>
       </w:pPr>
       <w:r>
         <w:t xml:space="preserve">4.4 </w:t>
@@ -2840,15 +3118,7 @@
       </w:r>
       <w:proofErr w:type="spellEnd"/>
       <w:r>
-        <w:t xml:space="preserve">) is particularly well-suited for </w:t>
-      </w:r>
-      <w:proofErr w:type="gramStart"/>
-      <w:r>
-        <w:t>Cantonese-English</w:t>
-      </w:r>
-      <w:proofErr w:type="gramEnd"/>
-      <w:r>
-        <w:t xml:space="preserve"> code-switching because its pre-training corpus includes both languages, enabling the model to draw on contextual representations that span language boundaries.</w:t>
+        <w:t>) is particularly well-suited for Cantonese-English code-switching because its pre-training corpus includes both languages, enabling the model to draw on contextual representations that span language boundaries.</w:t>
       </w:r>
     </w:p>
     <w:p>
@@ -2970,7 +3240,7 @@
     </w:p>
     <w:p>
       <w:pPr>
-        <w:pStyle w:val="Heading1"/>
+        <w:pStyle w:val="1"/>
       </w:pPr>
       <w:r>
         <w:lastRenderedPageBreak/>
@@ -3082,7 +3352,7 @@
     </w:p>
     <w:p>
       <w:pPr>
-        <w:pStyle w:val="Heading2"/>
+        <w:pStyle w:val="2"/>
       </w:pPr>
       <w:r>
         <w:t>5.1 Overall Performance Comparison</w:t>
@@ -3899,7 +4169,7 @@
     </w:p>
     <w:p>
       <w:pPr>
-        <w:pStyle w:val="Heading2"/>
+        <w:pStyle w:val="2"/>
       </w:pPr>
       <w:r>
         <w:t>5.2 Per-class F1 Analysis</w:t>
@@ -3921,7 +4191,7 @@
     </w:p>
     <w:p>
       <w:pPr>
-        <w:pStyle w:val="Heading2"/>
+        <w:pStyle w:val="2"/>
       </w:pPr>
       <w:r>
         <w:t>5.3 Qualitative Examples</w:t>
@@ -4203,7 +4473,21 @@
                 <w:sz w:val="22"/>
                 <w:szCs w:val="22"/>
               </w:rPr>
-              <w:t>我想 book 個位</w:t>
+              <w:t>我想</w:t>
+            </w:r>
+            <w:r>
+              <w:rPr>
+                <w:sz w:val="22"/>
+                <w:szCs w:val="22"/>
+              </w:rPr>
+              <w:t xml:space="preserve"> book </w:t>
+            </w:r>
+            <w:r>
+              <w:rPr>
+                <w:sz w:val="22"/>
+                <w:szCs w:val="22"/>
+              </w:rPr>
+              <w:t>個位</w:t>
             </w:r>
           </w:p>
         </w:tc>
@@ -4367,7 +4651,21 @@
                 <w:sz w:val="22"/>
                 <w:szCs w:val="22"/>
               </w:rPr>
-              <w:t>佢好 pro 㗎</w:t>
+              <w:t>佢好</w:t>
+            </w:r>
+            <w:r>
+              <w:rPr>
+                <w:sz w:val="22"/>
+                <w:szCs w:val="22"/>
+              </w:rPr>
+              <w:t xml:space="preserve"> pro </w:t>
+            </w:r>
+            <w:r>
+              <w:rPr>
+                <w:sz w:val="22"/>
+                <w:szCs w:val="22"/>
+              </w:rPr>
+              <w:t>㗎</w:t>
             </w:r>
           </w:p>
         </w:tc>
@@ -4531,7 +4829,21 @@
                 <w:sz w:val="22"/>
                 <w:szCs w:val="22"/>
               </w:rPr>
-              <w:t>我 food 你啦</w:t>
+              <w:t>我</w:t>
+            </w:r>
+            <w:r>
+              <w:rPr>
+                <w:sz w:val="22"/>
+                <w:szCs w:val="22"/>
+              </w:rPr>
+              <w:t xml:space="preserve"> food </w:t>
+            </w:r>
+            <w:r>
+              <w:rPr>
+                <w:sz w:val="22"/>
+                <w:szCs w:val="22"/>
+              </w:rPr>
+              <w:t>你啦</w:t>
             </w:r>
           </w:p>
         </w:tc>
@@ -4694,7 +5006,7 @@
     </w:p>
     <w:p>
       <w:pPr>
-        <w:pStyle w:val="Heading1"/>
+        <w:pStyle w:val="1"/>
       </w:pPr>
       <w:r>
         <w:lastRenderedPageBreak/>
@@ -4734,15 +5046,7 @@
         <w:jc w:val="both"/>
       </w:pPr>
       <w:r>
-        <w:t xml:space="preserve">This project addressed the problem of POS tagging ambiguity for English words embedded in </w:t>
-      </w:r>
-      <w:proofErr w:type="gramStart"/>
-      <w:r>
-        <w:t>Cantonese-English</w:t>
-      </w:r>
-      <w:proofErr w:type="gramEnd"/>
-      <w:r>
-        <w:t xml:space="preserve"> mixed text. We demonstrated that existing Cantonese NLP tools, specifically </w:t>
+        <w:t xml:space="preserve">This project addressed the problem of POS tagging ambiguity for English words embedded in Cantonese-English mixed text. We demonstrated that existing Cantonese NLP tools, specifically </w:t>
       </w:r>
       <w:proofErr w:type="spellStart"/>
       <w:r>
@@ -4842,7 +5146,7 @@
     </w:p>
     <w:p>
       <w:pPr>
-        <w:pStyle w:val="Heading1"/>
+        <w:pStyle w:val="1"/>
         <w:rPr>
           <w:lang w:val="fr-FR"/>
         </w:rPr>
@@ -5012,7 +5316,7 @@
     </w:p>
     <w:p>
       <w:pPr>
-        <w:pStyle w:val="Heading1"/>
+        <w:pStyle w:val="1"/>
       </w:pPr>
       <w:r>
         <w:lastRenderedPageBreak/>
@@ -5021,7 +5325,7 @@
     </w:p>
     <w:p>
       <w:pPr>
-        <w:pStyle w:val="Heading2"/>
+        <w:pStyle w:val="2"/>
       </w:pPr>
       <w:r>
         <w:t>Annexure A: Sample Annotated Data</w:t>
@@ -5043,7 +5347,7 @@
     </w:p>
     <w:p>
       <w:pPr>
-        <w:pStyle w:val="Heading2"/>
+        <w:pStyle w:val="2"/>
       </w:pPr>
       <w:r>
         <w:t>Annexure B: Rule-based Disambiguation Code</w:t>
@@ -5065,7 +5369,7 @@
     </w:p>
     <w:p>
       <w:pPr>
-        <w:pStyle w:val="Heading2"/>
+        <w:pStyle w:val="2"/>
       </w:pPr>
       <w:r>
         <w:t xml:space="preserve">Annexure C: </w:t>
@@ -5111,7 +5415,7 @@
     </w:p>
     <w:p>
       <w:pPr>
-        <w:pStyle w:val="Heading2"/>
+        <w:pStyle w:val="2"/>
       </w:pPr>
       <w:r>
         <w:t xml:space="preserve">Annexure D: </w:t>
@@ -5265,25 +5569,7 @@
         <w:sz w:val="18"/>
         <w:szCs w:val="18"/>
       </w:rPr>
-      <w:t xml:space="preserve">CBS5502 Group Project — POS Tagging Ambiguity in </w:t>
-    </w:r>
-    <w:proofErr w:type="gramStart"/>
-    <w:r>
-      <w:rPr>
-        <w:color w:val="888888"/>
-        <w:sz w:val="18"/>
-        <w:szCs w:val="18"/>
-      </w:rPr>
-      <w:t>Cantonese-English</w:t>
-    </w:r>
-    <w:proofErr w:type="gramEnd"/>
-    <w:r>
-      <w:rPr>
-        <w:color w:val="888888"/>
-        <w:sz w:val="18"/>
-        <w:szCs w:val="18"/>
-      </w:rPr>
-      <w:t xml:space="preserve"> Mixed Text</w:t>
+      <w:t>CBS5502 Group Project — POS Tagging Ambiguity in Cantonese-English Mixed Text</w:t>
     </w:r>
   </w:p>
 </w:hdr>
@@ -5445,7 +5731,7 @@
   <w:docDefaults>
     <w:rPrDefault>
       <w:rPr>
-        <w:rFonts w:ascii="Arial" w:eastAsia="Arial" w:hAnsi="Arial" w:cs="Arial"/>
+        <w:rFonts w:ascii="Arial" w:eastAsiaTheme="minorEastAsia" w:hAnsi="Arial" w:cs="Arial"/>
         <w:sz w:val="24"/>
         <w:szCs w:val="24"/>
         <w:lang w:val="en-US" w:eastAsia="zh-CN" w:bidi="ar-SA"/>
@@ -5831,11 +6117,11 @@
     <w:lsdException w:name="Unresolved Mention" w:semiHidden="1" w:unhideWhenUsed="1"/>
     <w:lsdException w:name="Smart Link" w:semiHidden="1" w:unhideWhenUsed="1"/>
   </w:latentStyles>
-  <w:style w:type="paragraph" w:default="1" w:styleId="Normal">
+  <w:style w:type="paragraph" w:default="1" w:styleId="a">
     <w:name w:val="Normal"/>
     <w:qFormat/>
   </w:style>
-  <w:style w:type="paragraph" w:styleId="Heading1">
+  <w:style w:type="paragraph" w:styleId="1">
     <w:name w:val="heading 1"/>
     <w:uiPriority w:val="9"/>
     <w:qFormat/>
@@ -5854,7 +6140,7 @@
       <w:szCs w:val="32"/>
     </w:rPr>
   </w:style>
-  <w:style w:type="paragraph" w:styleId="Heading2">
+  <w:style w:type="paragraph" w:styleId="2">
     <w:name w:val="heading 2"/>
     <w:uiPriority w:val="9"/>
     <w:unhideWhenUsed/>
@@ -5871,7 +6157,7 @@
       <w:szCs w:val="28"/>
     </w:rPr>
   </w:style>
-  <w:style w:type="paragraph" w:styleId="Heading3">
+  <w:style w:type="paragraph" w:styleId="3">
     <w:name w:val="heading 3"/>
     <w:uiPriority w:val="9"/>
     <w:semiHidden/>
@@ -5887,7 +6173,7 @@
       <w:color w:val="2E75B6"/>
     </w:rPr>
   </w:style>
-  <w:style w:type="paragraph" w:styleId="Heading4">
+  <w:style w:type="paragraph" w:styleId="4">
     <w:name w:val="heading 4"/>
     <w:uiPriority w:val="9"/>
     <w:semiHidden/>
@@ -5902,7 +6188,7 @@
       <w:color w:val="2E74B5"/>
     </w:rPr>
   </w:style>
-  <w:style w:type="paragraph" w:styleId="Heading5">
+  <w:style w:type="paragraph" w:styleId="5">
     <w:name w:val="heading 5"/>
     <w:uiPriority w:val="9"/>
     <w:semiHidden/>
@@ -5915,7 +6201,7 @@
       <w:color w:val="2E74B5"/>
     </w:rPr>
   </w:style>
-  <w:style w:type="paragraph" w:styleId="Heading6">
+  <w:style w:type="paragraph" w:styleId="6">
     <w:name w:val="heading 6"/>
     <w:uiPriority w:val="9"/>
     <w:semiHidden/>
@@ -5928,13 +6214,13 @@
       <w:color w:val="1F4D78"/>
     </w:rPr>
   </w:style>
-  <w:style w:type="character" w:default="1" w:styleId="DefaultParagraphFont">
+  <w:style w:type="character" w:default="1" w:styleId="a0">
     <w:name w:val="Default Paragraph Font"/>
     <w:uiPriority w:val="1"/>
     <w:semiHidden/>
     <w:unhideWhenUsed/>
   </w:style>
-  <w:style w:type="table" w:default="1" w:styleId="TableNormal">
+  <w:style w:type="table" w:default="1" w:styleId="a1">
     <w:name w:val="Normal Table"/>
     <w:uiPriority w:val="99"/>
     <w:semiHidden/>
@@ -5949,13 +6235,13 @@
       </w:tblCellMar>
     </w:tblPr>
   </w:style>
-  <w:style w:type="numbering" w:default="1" w:styleId="NoList">
+  <w:style w:type="numbering" w:default="1" w:styleId="a2">
     <w:name w:val="No List"/>
     <w:uiPriority w:val="99"/>
     <w:semiHidden/>
     <w:unhideWhenUsed/>
   </w:style>
-  <w:style w:type="paragraph" w:styleId="Title">
+  <w:style w:type="paragraph" w:styleId="a3">
     <w:name w:val="Title"/>
     <w:uiPriority w:val="10"/>
     <w:qFormat/>
@@ -5972,11 +6258,11 @@
       <w:bCs/>
     </w:rPr>
   </w:style>
-  <w:style w:type="paragraph" w:styleId="ListParagraph">
+  <w:style w:type="paragraph" w:styleId="a4">
     <w:name w:val="List Paragraph"/>
     <w:qFormat/>
   </w:style>
-  <w:style w:type="character" w:styleId="Hyperlink">
+  <w:style w:type="character" w:styleId="a5">
     <w:name w:val="Hyperlink"/>
     <w:uiPriority w:val="99"/>
     <w:unhideWhenUsed/>
@@ -5985,7 +6271,7 @@
       <w:u w:val="single"/>
     </w:rPr>
   </w:style>
-  <w:style w:type="character" w:styleId="FootnoteReference">
+  <w:style w:type="character" w:styleId="a6">
     <w:name w:val="footnote reference"/>
     <w:uiPriority w:val="99"/>
     <w:semiHidden/>
@@ -5994,9 +6280,9 @@
       <w:vertAlign w:val="superscript"/>
     </w:rPr>
   </w:style>
-  <w:style w:type="paragraph" w:styleId="FootnoteText">
+  <w:style w:type="paragraph" w:styleId="a7">
     <w:name w:val="footnote text"/>
-    <w:link w:val="FootnoteTextChar"/>
+    <w:link w:val="a8"/>
     <w:uiPriority w:val="99"/>
     <w:semiHidden/>
     <w:unhideWhenUsed/>
@@ -6005,9 +6291,9 @@
       <w:szCs w:val="20"/>
     </w:rPr>
   </w:style>
-  <w:style w:type="character" w:customStyle="1" w:styleId="FootnoteTextChar">
-    <w:name w:val="Footnote Text Char"/>
-    <w:link w:val="FootnoteText"/>
+  <w:style w:type="character" w:customStyle="1" w:styleId="a8">
+    <w:name w:val="脚注文本 字符"/>
+    <w:link w:val="a7"/>
     <w:uiPriority w:val="99"/>
     <w:semiHidden/>
     <w:unhideWhenUsed/>
@@ -6016,7 +6302,7 @@
       <w:szCs w:val="20"/>
     </w:rPr>
   </w:style>
-  <w:style w:type="character" w:styleId="EndnoteReference">
+  <w:style w:type="character" w:styleId="a9">
     <w:name w:val="endnote reference"/>
     <w:uiPriority w:val="99"/>
     <w:semiHidden/>
@@ -6025,9 +6311,9 @@
       <w:vertAlign w:val="superscript"/>
     </w:rPr>
   </w:style>
-  <w:style w:type="paragraph" w:styleId="EndnoteText">
+  <w:style w:type="paragraph" w:styleId="aa">
     <w:name w:val="endnote text"/>
-    <w:link w:val="EndnoteTextChar"/>
+    <w:link w:val="ab"/>
     <w:uiPriority w:val="99"/>
     <w:semiHidden/>
     <w:unhideWhenUsed/>
@@ -6036,9 +6322,9 @@
       <w:szCs w:val="20"/>
     </w:rPr>
   </w:style>
-  <w:style w:type="character" w:customStyle="1" w:styleId="EndnoteTextChar">
-    <w:name w:val="Endnote Text Char"/>
-    <w:link w:val="EndnoteText"/>
+  <w:style w:type="character" w:customStyle="1" w:styleId="ab">
+    <w:name w:val="尾注文本 字符"/>
+    <w:link w:val="aa"/>
     <w:uiPriority w:val="99"/>
     <w:semiHidden/>
     <w:unhideWhenUsed/>

</xml_diff>